<commit_message>
change landing page slightly
</commit_message>
<xml_diff>
--- a/assets/pdf/cv_aug26.docx
+++ b/assets/pdf/cv_aug26.docx
@@ -1,6 +1,6 @@
 
 <file path=word/document.xml><?xml version="1.0" encoding="utf-8"?>
-<w:document xmlns:wpc="http://schemas.microsoft.com/office/word/2010/wordprocessingCanvas" xmlns:cx="http://schemas.microsoft.com/office/drawing/2014/chartex" xmlns:cx1="http://schemas.microsoft.com/office/drawing/2015/9/8/chartex" xmlns:cx2="http://schemas.microsoft.com/office/drawing/2015/10/21/chartex" xmlns:cx3="http://schemas.microsoft.com/office/drawing/2016/5/9/chartex" xmlns:cx4="http://schemas.microsoft.com/office/drawing/2016/5/10/chartex" xmlns:cx5="http://schemas.microsoft.com/office/drawing/2016/5/11/chartex" xmlns:cx6="http://schemas.microsoft.com/office/drawing/2016/5/12/chartex" xmlns:cx7="http://schemas.microsoft.com/office/drawing/2016/5/13/chartex" xmlns:cx8="http://schemas.microsoft.com/office/drawing/2016/5/14/chartex" xmlns:mc="http://schemas.openxmlformats.org/markup-compatibility/2006" xmlns:m="http://schemas.openxmlformats.org/officeDocument/2006/math" xmlns:aink="http://schemas.microsoft.com/office/drawing/2016/ink" xmlns:am3d="http://schemas.microsoft.com/office/drawing/2017/model3d" xmlns:oel="http://schemas.microsoft.com/office/2019/extlst" xmlns:r="http://schemas.openxmlformats.org/officeDocument/2006/relationships" xmlns:wp14="http://schemas.microsoft.com/office/word/2010/wordprocessingDrawing" xmlns:wp="http://schemas.openxmlformats.org/drawingml/2006/wordprocessingDrawing" xmlns:wpg="http://schemas.microsoft.com/office/word/2010/wordprocessingGroup" xmlns:wpi="http://schemas.microsoft.com/office/word/2010/wordprocessingInk" xmlns:wps="http://schemas.microsoft.com/office/word/2010/wordprocessingShape" xmlns:o="urn:schemas-microsoft-com:office:office" xmlns:v="urn:schemas-microsoft-com:vml" xmlns:w10="urn:schemas-microsoft-com:office:word" xmlns:w="http://schemas.openxmlformats.org/wordprocessingml/2006/main" xmlns:w14="http://schemas.microsoft.com/office/word/2010/wordml" xmlns:w15="http://schemas.microsoft.com/office/word/2012/wordml" xmlns:w16cei="http://schemas.microsoft.com/office/word/2026/wordml/cei" xmlns:w16cex="http://schemas.microsoft.com/office/word/2018/wordml/cex" xmlns:w16cid="http://schemas.microsoft.com/office/word/2016/wordml/cid" xmlns:w16="http://schemas.microsoft.com/office/word/2018/wordml" xmlns:w16sdtdh="http://schemas.microsoft.com/office/word/2020/wordml/sdtdatahash" xmlns:w16sdtfl="http://schemas.microsoft.com/office/word/2024/wordml/sdtformatlock" xmlns:w16se="http://schemas.microsoft.com/office/word/2015/wordml/symex" xmlns:w16du="http://schemas.microsoft.com/office/word/2023/wordml/word16du" xmlns:wne="http://schemas.microsoft.com/office/word/2006/wordml" mc:Ignorable="w14 w15 w16se w16cid w16 w16cex w16sdtdh w16sdtfl w16du wp14">
+<w:document xmlns:wpc="http://schemas.microsoft.com/office/word/2010/wordprocessingCanvas" xmlns:cx="http://schemas.microsoft.com/office/drawing/2014/chartex" xmlns:cx1="http://schemas.microsoft.com/office/drawing/2015/9/8/chartex" xmlns:cx2="http://schemas.microsoft.com/office/drawing/2015/10/21/chartex" xmlns:cx3="http://schemas.microsoft.com/office/drawing/2016/5/9/chartex" xmlns:cx4="http://schemas.microsoft.com/office/drawing/2016/5/10/chartex" xmlns:cx5="http://schemas.microsoft.com/office/drawing/2016/5/11/chartex" xmlns:cx6="http://schemas.microsoft.com/office/drawing/2016/5/12/chartex" xmlns:cx7="http://schemas.microsoft.com/office/drawing/2016/5/13/chartex" xmlns:cx8="http://schemas.microsoft.com/office/drawing/2016/5/14/chartex" xmlns:mc="http://schemas.openxmlformats.org/markup-compatibility/2006" xmlns:m="http://schemas.openxmlformats.org/officeDocument/2006/math" xmlns:aink="http://schemas.microsoft.com/office/drawing/2016/ink" xmlns:am3d="http://schemas.microsoft.com/office/drawing/2017/model3d" xmlns:oel="http://schemas.microsoft.com/office/2019/extlst" xmlns:r="http://schemas.openxmlformats.org/officeDocument/2006/relationships" xmlns:wp14="http://schemas.microsoft.com/office/word/2010/wordprocessingDrawing" xmlns:wp="http://schemas.openxmlformats.org/drawingml/2006/wordprocessingDrawing" xmlns:wpg="http://schemas.microsoft.com/office/word/2010/wordprocessingGroup" xmlns:wpi="http://schemas.microsoft.com/office/word/2010/wordprocessingInk" xmlns:wps="http://schemas.microsoft.com/office/word/2010/wordprocessingShape" xmlns:o="urn:schemas-microsoft-com:office:office" xmlns:v="urn:schemas-microsoft-com:vml" xmlns:w10="urn:schemas-microsoft-com:office:word" xmlns:w="http://schemas.openxmlformats.org/wordprocessingml/2006/main" xmlns:w14="http://schemas.microsoft.com/office/word/2010/wordml" xmlns:w15="http://schemas.microsoft.com/office/word/2012/wordml" xmlns:w16cex="http://schemas.microsoft.com/office/word/2018/wordml/cex" xmlns:w16cid="http://schemas.microsoft.com/office/word/2016/wordml/cid" xmlns:w16="http://schemas.microsoft.com/office/word/2018/wordml" xmlns:w16sdtdh="http://schemas.microsoft.com/office/word/2020/wordml/sdtdatahash" xmlns:w16sdtfl="http://schemas.microsoft.com/office/word/2024/wordml/sdtformatlock" xmlns:w16se="http://schemas.microsoft.com/office/word/2015/wordml/symex" xmlns:w16du="http://schemas.microsoft.com/office/word/2023/wordml/word16du" xmlns:wne="http://schemas.microsoft.com/office/word/2006/wordml" mc:Ignorable="w14 w15 w16se w16cid w16 w16cex w16sdtdh w16sdtfl w16du wp14">
   <w:body>
     <w:p>
       <w:pPr>
@@ -49,7 +49,7 @@
           <w:sz w:val="24"/>
           <w:szCs w:val="24"/>
         </w:rPr>
-        <w:t>4</w:t>
+        <w:t>2</w:t>
       </w:r>
       <w:r>
         <w:rPr>
@@ -949,27 +949,7 @@
           <w:sz w:val="24"/>
           <w:szCs w:val="24"/>
         </w:rPr>
-        <w:t xml:space="preserve">, D. Prinster, C. </w:t>
-      </w:r>
-      <w:proofErr w:type="spellStart"/>
-      <w:r>
-        <w:rPr>
-          <w:rFonts w:ascii="Times New Roman" w:hAnsi="Times New Roman" w:cs="Times New Roman"/>
-          <w:bCs/>
-          <w:sz w:val="24"/>
-          <w:szCs w:val="24"/>
-        </w:rPr>
-        <w:t>Fannjiang</w:t>
-      </w:r>
-      <w:proofErr w:type="spellEnd"/>
-      <w:r>
-        <w:rPr>
-          <w:rFonts w:ascii="Times New Roman" w:hAnsi="Times New Roman" w:cs="Times New Roman"/>
-          <w:bCs/>
-          <w:sz w:val="24"/>
-          <w:szCs w:val="24"/>
-        </w:rPr>
-        <w:t xml:space="preserve">, G. Scalia, A. Regev, H. Wang. </w:t>
+        <w:t xml:space="preserve">, D. Prinster, C. Fannjiang, G. Scalia, A. Regev, H. Wang. </w:t>
       </w:r>
       <w:r>
         <w:rPr>
@@ -1009,30 +989,18 @@
         </w:rPr>
         <w:t>(</w:t>
       </w:r>
-      <w:proofErr w:type="spellStart"/>
-      <w:r>
-        <w:fldChar w:fldCharType="begin"/>
-      </w:r>
-      <w:r>
-        <w:instrText>HYPERLINK "https://arxiv.org/abs/2512.03109"</w:instrText>
-      </w:r>
-      <w:r>
-        <w:fldChar w:fldCharType="separate"/>
-      </w:r>
-      <w:r>
-        <w:rPr>
-          <w:rStyle w:val="Hyperlink"/>
-          <w:rFonts w:ascii="Times New Roman" w:hAnsi="Times New Roman" w:cs="Times New Roman"/>
-          <w:bCs/>
-          <w:sz w:val="24"/>
-          <w:szCs w:val="24"/>
-        </w:rPr>
-        <w:t>arxiv</w:t>
-      </w:r>
-      <w:proofErr w:type="spellEnd"/>
-      <w:r>
-        <w:fldChar w:fldCharType="end"/>
-      </w:r>
+      <w:hyperlink r:id="rId9" w:history="1">
+        <w:r>
+          <w:rPr>
+            <w:rStyle w:val="Hyperlink"/>
+            <w:rFonts w:ascii="Times New Roman" w:hAnsi="Times New Roman" w:cs="Times New Roman"/>
+            <w:bCs/>
+            <w:sz w:val="24"/>
+            <w:szCs w:val="24"/>
+          </w:rPr>
+          <w:t>arxiv</w:t>
+        </w:r>
+      </w:hyperlink>
       <w:r>
         <w:rPr>
           <w:rFonts w:ascii="Times New Roman" w:hAnsi="Times New Roman" w:cs="Times New Roman"/>
@@ -1096,47 +1064,7 @@
           <w:sz w:val="24"/>
           <w:szCs w:val="24"/>
         </w:rPr>
-        <w:t xml:space="preserve">, S. </w:t>
-      </w:r>
-      <w:proofErr w:type="spellStart"/>
-      <w:r>
-        <w:rPr>
-          <w:rFonts w:ascii="Times New Roman" w:hAnsi="Times New Roman" w:cs="Times New Roman"/>
-          <w:bCs/>
-          <w:sz w:val="24"/>
-          <w:szCs w:val="24"/>
-        </w:rPr>
-        <w:t>Dandapanthula</w:t>
-      </w:r>
-      <w:proofErr w:type="spellEnd"/>
-      <w:r>
-        <w:rPr>
-          <w:rFonts w:ascii="Times New Roman" w:hAnsi="Times New Roman" w:cs="Times New Roman"/>
-          <w:bCs/>
-          <w:sz w:val="24"/>
-          <w:szCs w:val="24"/>
-        </w:rPr>
-        <w:t xml:space="preserve">, S. Khan, M. Oberst, B. Berger, A. </w:t>
-      </w:r>
-      <w:proofErr w:type="spellStart"/>
-      <w:r>
-        <w:rPr>
-          <w:rFonts w:ascii="Times New Roman" w:hAnsi="Times New Roman" w:cs="Times New Roman"/>
-          <w:bCs/>
-          <w:sz w:val="24"/>
-          <w:szCs w:val="24"/>
-        </w:rPr>
-        <w:t>Chouldechova</w:t>
-      </w:r>
-      <w:proofErr w:type="spellEnd"/>
-      <w:r>
-        <w:rPr>
-          <w:rFonts w:ascii="Times New Roman" w:hAnsi="Times New Roman" w:cs="Times New Roman"/>
-          <w:bCs/>
-          <w:sz w:val="24"/>
-          <w:szCs w:val="24"/>
-        </w:rPr>
-        <w:t xml:space="preserve">. </w:t>
+        <w:t xml:space="preserve">, S. Dandapanthula, S. Khan, M. Oberst, B. Berger, A. Chouldechova. </w:t>
       </w:r>
       <w:r>
         <w:rPr>
@@ -1202,69 +1130,40 @@
         <w:rPr>
           <w:rFonts w:ascii="Times New Roman" w:hAnsi="Times New Roman" w:cs="Times New Roman"/>
           <w:bCs/>
-          <w:sz w:val="24"/>
-          <w:szCs w:val="24"/>
-        </w:rPr>
-      </w:pPr>
-      <w:r>
-        <w:rPr>
-          <w:rFonts w:ascii="Times New Roman" w:hAnsi="Times New Roman" w:cs="Times New Roman"/>
-          <w:bCs/>
-          <w:sz w:val="24"/>
-          <w:szCs w:val="24"/>
-        </w:rPr>
-        <w:t>[w</w:t>
-      </w:r>
-      <w:r>
-        <w:rPr>
-          <w:rFonts w:ascii="Times New Roman" w:hAnsi="Times New Roman" w:cs="Times New Roman"/>
-          <w:bCs/>
-          <w:sz w:val="24"/>
-          <w:szCs w:val="24"/>
-        </w:rPr>
-        <w:t xml:space="preserve">] O. Gujral, </w:t>
-      </w:r>
-      <w:r>
-        <w:rPr>
-          <w:rFonts w:ascii="Times New Roman" w:hAnsi="Times New Roman" w:cs="Times New Roman"/>
-          <w:bCs/>
-          <w:sz w:val="24"/>
-          <w:szCs w:val="24"/>
-          <w:u w:val="single"/>
-        </w:rPr>
-        <w:t>S. Sadhuka</w:t>
-      </w:r>
-      <w:r>
-        <w:rPr>
-          <w:rFonts w:ascii="Times New Roman" w:hAnsi="Times New Roman" w:cs="Times New Roman"/>
-          <w:bCs/>
-          <w:sz w:val="24"/>
-          <w:szCs w:val="24"/>
-        </w:rPr>
-        <w:t>, B. Berger</w:t>
-      </w:r>
-      <w:r>
-        <w:rPr>
-          <w:rFonts w:ascii="Times New Roman" w:hAnsi="Times New Roman" w:cs="Times New Roman"/>
-          <w:bCs/>
-          <w:sz w:val="24"/>
-          <w:szCs w:val="24"/>
-        </w:rPr>
-        <w:t xml:space="preserve">. </w:t>
-      </w:r>
-      <w:proofErr w:type="spellStart"/>
-      <w:r>
-        <w:rPr>
-          <w:rFonts w:ascii="Times New Roman" w:hAnsi="Times New Roman" w:cs="Times New Roman"/>
-          <w:bCs/>
           <w:i/>
           <w:iCs/>
           <w:sz w:val="24"/>
           <w:szCs w:val="24"/>
         </w:rPr>
-        <w:t>Crosscoders</w:t>
-      </w:r>
-      <w:proofErr w:type="spellEnd"/>
+      </w:pPr>
+      <w:r>
+        <w:rPr>
+          <w:rFonts w:ascii="Times New Roman" w:hAnsi="Times New Roman" w:cs="Times New Roman"/>
+          <w:bCs/>
+          <w:sz w:val="24"/>
+          <w:szCs w:val="24"/>
+        </w:rPr>
+        <w:t xml:space="preserve">[w] S. Dandapanthula, </w:t>
+      </w:r>
+      <w:r>
+        <w:rPr>
+          <w:rFonts w:ascii="Times New Roman" w:hAnsi="Times New Roman" w:cs="Times New Roman"/>
+          <w:bCs/>
+          <w:sz w:val="24"/>
+          <w:szCs w:val="24"/>
+          <w:u w:val="single"/>
+        </w:rPr>
+        <w:t>S. Sadhuka</w:t>
+      </w:r>
+      <w:r>
+        <w:rPr>
+          <w:rFonts w:ascii="Times New Roman" w:hAnsi="Times New Roman" w:cs="Times New Roman"/>
+          <w:bCs/>
+          <w:sz w:val="24"/>
+          <w:szCs w:val="24"/>
+        </w:rPr>
+        <w:t xml:space="preserve">, S. Khan, M. Oberst, A. Ramdas, A. Chouldechova. </w:t>
+      </w:r>
       <w:r>
         <w:rPr>
           <w:rFonts w:ascii="Times New Roman" w:hAnsi="Times New Roman" w:cs="Times New Roman"/>
@@ -1274,7 +1173,90 @@
           <w:sz w:val="24"/>
           <w:szCs w:val="24"/>
         </w:rPr>
-        <w:t xml:space="preserve"> enable the interpretable comparison of protein</w:t>
+        <w:t>How to post-train on a surrogate: Envelope sampling provably mitigates reward hacking</w:t>
+      </w:r>
+      <w:r>
+        <w:rPr>
+          <w:rFonts w:ascii="Times New Roman" w:hAnsi="Times New Roman" w:cs="Times New Roman"/>
+          <w:bCs/>
+          <w:sz w:val="24"/>
+          <w:szCs w:val="24"/>
+        </w:rPr>
+        <w:t xml:space="preserve">. </w:t>
+      </w:r>
+      <w:r>
+        <w:rPr>
+          <w:rFonts w:ascii="Times New Roman" w:hAnsi="Times New Roman" w:cs="Times New Roman"/>
+          <w:bCs/>
+          <w:sz w:val="24"/>
+          <w:szCs w:val="24"/>
+        </w:rPr>
+        <w:t>Preprint 2026</w:t>
+      </w:r>
+      <w:r>
+        <w:rPr>
+          <w:rFonts w:ascii="Times New Roman" w:hAnsi="Times New Roman" w:cs="Times New Roman"/>
+          <w:bCs/>
+          <w:sz w:val="24"/>
+          <w:szCs w:val="24"/>
+        </w:rPr>
+        <w:t>.</w:t>
+      </w:r>
+    </w:p>
+    <w:p>
+      <w:pPr>
+        <w:autoSpaceDE w:val="0"/>
+        <w:autoSpaceDN w:val="0"/>
+        <w:adjustRightInd w:val="0"/>
+        <w:spacing w:after="0" w:line="240" w:lineRule="auto"/>
+        <w:rPr>
+          <w:rFonts w:ascii="Times New Roman" w:hAnsi="Times New Roman" w:cs="Times New Roman"/>
+          <w:bCs/>
+          <w:sz w:val="24"/>
+          <w:szCs w:val="24"/>
+        </w:rPr>
+      </w:pPr>
+    </w:p>
+    <w:p>
+      <w:pPr>
+        <w:autoSpaceDE w:val="0"/>
+        <w:autoSpaceDN w:val="0"/>
+        <w:adjustRightInd w:val="0"/>
+        <w:spacing w:after="0" w:line="240" w:lineRule="auto"/>
+        <w:rPr>
+          <w:rFonts w:ascii="Times New Roman" w:hAnsi="Times New Roman" w:cs="Times New Roman"/>
+          <w:bCs/>
+          <w:sz w:val="24"/>
+          <w:szCs w:val="24"/>
+        </w:rPr>
+      </w:pPr>
+      <w:r>
+        <w:rPr>
+          <w:rFonts w:ascii="Times New Roman" w:hAnsi="Times New Roman" w:cs="Times New Roman"/>
+          <w:bCs/>
+          <w:sz w:val="24"/>
+          <w:szCs w:val="24"/>
+        </w:rPr>
+        <w:t xml:space="preserve">[p] S. Balachandar, </w:t>
+      </w:r>
+      <w:r>
+        <w:rPr>
+          <w:rFonts w:ascii="Times New Roman" w:hAnsi="Times New Roman" w:cs="Times New Roman"/>
+          <w:bCs/>
+          <w:sz w:val="24"/>
+          <w:szCs w:val="24"/>
+          <w:u w:val="single"/>
+        </w:rPr>
+        <w:t>S. Sadhuka</w:t>
+      </w:r>
+      <w:r>
+        <w:rPr>
+          <w:rFonts w:ascii="Times New Roman" w:hAnsi="Times New Roman" w:cs="Times New Roman"/>
+          <w:bCs/>
+          <w:sz w:val="24"/>
+          <w:szCs w:val="24"/>
+        </w:rPr>
+        <w:t xml:space="preserve">, B. Berger, E. Pierson, N. Garg. </w:t>
       </w:r>
       <w:r>
         <w:rPr>
@@ -1285,7 +1267,72 @@
           <w:sz w:val="24"/>
           <w:szCs w:val="24"/>
         </w:rPr>
-        <w:t xml:space="preserve"> </w:t>
+        <w:t>Urban Incident Prediction with Graph Neural Networks: Integrating Government Ratings and Crowdsourced Reports</w:t>
+      </w:r>
+      <w:r>
+        <w:rPr>
+          <w:rFonts w:ascii="Times New Roman" w:hAnsi="Times New Roman" w:cs="Times New Roman"/>
+          <w:bCs/>
+          <w:sz w:val="24"/>
+          <w:szCs w:val="24"/>
+        </w:rPr>
+        <w:t>. AAAI 2026</w:t>
+      </w:r>
+    </w:p>
+    <w:p>
+      <w:pPr>
+        <w:autoSpaceDE w:val="0"/>
+        <w:autoSpaceDN w:val="0"/>
+        <w:adjustRightInd w:val="0"/>
+        <w:spacing w:after="0" w:line="240" w:lineRule="auto"/>
+        <w:rPr>
+          <w:rFonts w:ascii="Times New Roman" w:hAnsi="Times New Roman" w:cs="Times New Roman"/>
+          <w:bCs/>
+          <w:sz w:val="24"/>
+          <w:szCs w:val="24"/>
+        </w:rPr>
+      </w:pPr>
+    </w:p>
+    <w:p>
+      <w:pPr>
+        <w:autoSpaceDE w:val="0"/>
+        <w:autoSpaceDN w:val="0"/>
+        <w:adjustRightInd w:val="0"/>
+        <w:spacing w:after="0" w:line="240" w:lineRule="auto"/>
+        <w:rPr>
+          <w:rFonts w:ascii="Times New Roman" w:hAnsi="Times New Roman" w:cs="Times New Roman"/>
+          <w:bCs/>
+          <w:sz w:val="24"/>
+          <w:szCs w:val="24"/>
+        </w:rPr>
+      </w:pPr>
+      <w:r>
+        <w:rPr>
+          <w:rFonts w:ascii="Times New Roman" w:hAnsi="Times New Roman" w:cs="Times New Roman"/>
+          <w:bCs/>
+          <w:sz w:val="24"/>
+          <w:szCs w:val="24"/>
+        </w:rPr>
+        <w:t xml:space="preserve">[p] D. Shanmugam*, </w:t>
+      </w:r>
+      <w:r>
+        <w:rPr>
+          <w:rFonts w:ascii="Times New Roman" w:hAnsi="Times New Roman" w:cs="Times New Roman"/>
+          <w:bCs/>
+          <w:sz w:val="24"/>
+          <w:szCs w:val="24"/>
+          <w:u w:val="single"/>
+        </w:rPr>
+        <w:t>S. Sadhuka</w:t>
+      </w:r>
+      <w:r>
+        <w:rPr>
+          <w:rFonts w:ascii="Times New Roman" w:hAnsi="Times New Roman" w:cs="Times New Roman"/>
+          <w:bCs/>
+          <w:sz w:val="24"/>
+          <w:szCs w:val="24"/>
+        </w:rPr>
+        <w:t xml:space="preserve">*, M. Raghavan, J. Guttag, B. Berger, E. Pierson. </w:t>
       </w:r>
       <w:r>
         <w:rPr>
@@ -1296,47 +1343,74 @@
           <w:sz w:val="24"/>
           <w:szCs w:val="24"/>
         </w:rPr>
-        <w:t>language model layers</w:t>
-      </w:r>
-      <w:r>
-        <w:rPr>
-          <w:rFonts w:ascii="Times New Roman" w:hAnsi="Times New Roman" w:cs="Times New Roman"/>
-          <w:bCs/>
-          <w:sz w:val="24"/>
-          <w:szCs w:val="24"/>
-        </w:rPr>
-        <w:t xml:space="preserve">. </w:t>
-      </w:r>
-      <w:r>
-        <w:rPr>
-          <w:rFonts w:ascii="Times New Roman" w:hAnsi="Times New Roman" w:cs="Times New Roman"/>
-          <w:bCs/>
-          <w:sz w:val="24"/>
-          <w:szCs w:val="24"/>
-        </w:rPr>
-        <w:t>In progress.</w:t>
-      </w:r>
-    </w:p>
-    <w:p>
-      <w:pPr>
-        <w:autoSpaceDE w:val="0"/>
-        <w:autoSpaceDN w:val="0"/>
-        <w:adjustRightInd w:val="0"/>
-        <w:spacing w:after="0" w:line="240" w:lineRule="auto"/>
-        <w:rPr>
-          <w:rFonts w:ascii="Times New Roman" w:hAnsi="Times New Roman" w:cs="Times New Roman"/>
-          <w:bCs/>
-          <w:sz w:val="24"/>
-          <w:szCs w:val="24"/>
-        </w:rPr>
-      </w:pPr>
-    </w:p>
-    <w:p>
-      <w:pPr>
-        <w:autoSpaceDE w:val="0"/>
-        <w:autoSpaceDN w:val="0"/>
-        <w:adjustRightInd w:val="0"/>
-        <w:spacing w:after="0" w:line="240" w:lineRule="auto"/>
+        <w:t>Evaluating multiple models using labeled and unlabeled data</w:t>
+      </w:r>
+      <w:r>
+        <w:rPr>
+          <w:rFonts w:ascii="Times New Roman" w:hAnsi="Times New Roman" w:cs="Times New Roman"/>
+          <w:bCs/>
+          <w:sz w:val="24"/>
+          <w:szCs w:val="24"/>
+        </w:rPr>
+        <w:t>. NeurIPS 2025</w:t>
+      </w:r>
+    </w:p>
+    <w:p>
+      <w:pPr>
+        <w:autoSpaceDE w:val="0"/>
+        <w:autoSpaceDN w:val="0"/>
+        <w:adjustRightInd w:val="0"/>
+        <w:spacing w:after="0" w:line="240" w:lineRule="auto"/>
+        <w:rPr>
+          <w:rFonts w:ascii="Times New Roman" w:hAnsi="Times New Roman" w:cs="Times New Roman"/>
+          <w:bCs/>
+          <w:sz w:val="24"/>
+          <w:szCs w:val="24"/>
+        </w:rPr>
+      </w:pPr>
+    </w:p>
+    <w:p>
+      <w:pPr>
+        <w:autoSpaceDE w:val="0"/>
+        <w:autoSpaceDN w:val="0"/>
+        <w:adjustRightInd w:val="0"/>
+        <w:spacing w:after="0" w:line="240" w:lineRule="auto"/>
+        <w:rPr>
+          <w:rFonts w:ascii="Times New Roman" w:hAnsi="Times New Roman" w:cs="Times New Roman"/>
+          <w:bCs/>
+          <w:sz w:val="24"/>
+          <w:szCs w:val="24"/>
+        </w:rPr>
+      </w:pPr>
+      <w:r>
+        <w:rPr>
+          <w:rFonts w:ascii="Times New Roman" w:hAnsi="Times New Roman" w:cs="Times New Roman"/>
+          <w:bCs/>
+          <w:sz w:val="24"/>
+          <w:szCs w:val="24"/>
+        </w:rPr>
+        <w:t xml:space="preserve">[p] </w:t>
+      </w:r>
+      <w:r>
+        <w:rPr>
+          <w:rFonts w:ascii="Times New Roman" w:hAnsi="Times New Roman" w:cs="Times New Roman"/>
+          <w:bCs/>
+          <w:sz w:val="24"/>
+          <w:szCs w:val="24"/>
+          <w:u w:val="single"/>
+        </w:rPr>
+        <w:t>S. Sadhuka</w:t>
+      </w:r>
+      <w:r>
+        <w:rPr>
+          <w:rFonts w:ascii="Times New Roman" w:hAnsi="Times New Roman" w:cs="Times New Roman"/>
+          <w:bCs/>
+          <w:sz w:val="24"/>
+          <w:szCs w:val="24"/>
+        </w:rPr>
+        <w:t xml:space="preserve">, S. Lin, B. Berger**. E. Pierson**. </w:t>
+      </w:r>
+      <w:r>
         <w:rPr>
           <w:rFonts w:ascii="Times New Roman" w:hAnsi="Times New Roman" w:cs="Times New Roman"/>
           <w:bCs/>
@@ -1345,93 +1419,8 @@
           <w:sz w:val="24"/>
           <w:szCs w:val="24"/>
         </w:rPr>
-      </w:pPr>
-      <w:r>
-        <w:rPr>
-          <w:rFonts w:ascii="Times New Roman" w:hAnsi="Times New Roman" w:cs="Times New Roman"/>
-          <w:bCs/>
-          <w:sz w:val="24"/>
-          <w:szCs w:val="24"/>
-        </w:rPr>
-        <w:t>[w]</w:t>
-      </w:r>
-      <w:r>
-        <w:rPr>
-          <w:rFonts w:ascii="Times New Roman" w:hAnsi="Times New Roman" w:cs="Times New Roman"/>
-          <w:bCs/>
-          <w:sz w:val="24"/>
-          <w:szCs w:val="24"/>
-        </w:rPr>
-        <w:t xml:space="preserve"> S. </w:t>
-      </w:r>
-      <w:proofErr w:type="spellStart"/>
-      <w:r>
-        <w:rPr>
-          <w:rFonts w:ascii="Times New Roman" w:hAnsi="Times New Roman" w:cs="Times New Roman"/>
-          <w:bCs/>
-          <w:sz w:val="24"/>
-          <w:szCs w:val="24"/>
-        </w:rPr>
-        <w:t>Dandapanthula</w:t>
-      </w:r>
-      <w:proofErr w:type="spellEnd"/>
-      <w:r>
-        <w:rPr>
-          <w:rFonts w:ascii="Times New Roman" w:hAnsi="Times New Roman" w:cs="Times New Roman"/>
-          <w:bCs/>
-          <w:sz w:val="24"/>
-          <w:szCs w:val="24"/>
-        </w:rPr>
-        <w:t xml:space="preserve">, </w:t>
-      </w:r>
-      <w:r>
-        <w:rPr>
-          <w:rFonts w:ascii="Times New Roman" w:hAnsi="Times New Roman" w:cs="Times New Roman"/>
-          <w:bCs/>
-          <w:sz w:val="24"/>
-          <w:szCs w:val="24"/>
-          <w:u w:val="single"/>
-        </w:rPr>
-        <w:t>S. Sadhuka</w:t>
-      </w:r>
-      <w:r>
-        <w:rPr>
-          <w:rFonts w:ascii="Times New Roman" w:hAnsi="Times New Roman" w:cs="Times New Roman"/>
-          <w:bCs/>
-          <w:sz w:val="24"/>
-          <w:szCs w:val="24"/>
-        </w:rPr>
-        <w:t>, S. Khan</w:t>
-      </w:r>
-      <w:r>
-        <w:rPr>
-          <w:rFonts w:ascii="Times New Roman" w:hAnsi="Times New Roman" w:cs="Times New Roman"/>
-          <w:bCs/>
-          <w:sz w:val="24"/>
-          <w:szCs w:val="24"/>
-        </w:rPr>
-        <w:t xml:space="preserve">, </w:t>
-      </w:r>
-      <w:r>
-        <w:rPr>
-          <w:rFonts w:ascii="Times New Roman" w:hAnsi="Times New Roman" w:cs="Times New Roman"/>
-          <w:bCs/>
-          <w:sz w:val="24"/>
-          <w:szCs w:val="24"/>
-        </w:rPr>
-        <w:t xml:space="preserve">M. Oberst, A. Ramdas, A. </w:t>
-      </w:r>
-      <w:proofErr w:type="spellStart"/>
-      <w:r>
-        <w:rPr>
-          <w:rFonts w:ascii="Times New Roman" w:hAnsi="Times New Roman" w:cs="Times New Roman"/>
-          <w:bCs/>
-          <w:sz w:val="24"/>
-          <w:szCs w:val="24"/>
-        </w:rPr>
-        <w:t>Chouldechova</w:t>
-      </w:r>
-      <w:proofErr w:type="spellEnd"/>
+        <w:t>A Bayesian Model for Multi-stage Censoring</w:t>
+      </w:r>
       <w:r>
         <w:rPr>
           <w:rFonts w:ascii="Times New Roman" w:hAnsi="Times New Roman" w:cs="Times New Roman"/>
@@ -1440,6 +1429,87 @@
           <w:szCs w:val="24"/>
         </w:rPr>
         <w:t xml:space="preserve">. </w:t>
+      </w:r>
+      <w:r>
+        <w:rPr>
+          <w:rFonts w:ascii="Times New Roman" w:hAnsi="Times New Roman" w:cs="Times New Roman"/>
+          <w:bCs/>
+          <w:sz w:val="24"/>
+          <w:szCs w:val="24"/>
+        </w:rPr>
+        <w:t>ML4H 2025</w:t>
+      </w:r>
+      <w:r>
+        <w:rPr>
+          <w:rFonts w:ascii="Times New Roman" w:hAnsi="Times New Roman" w:cs="Times New Roman"/>
+          <w:bCs/>
+          <w:sz w:val="24"/>
+          <w:szCs w:val="24"/>
+        </w:rPr>
+        <w:t xml:space="preserve"> (proceedings</w:t>
+      </w:r>
+      <w:r>
+        <w:rPr>
+          <w:rFonts w:ascii="Times New Roman" w:hAnsi="Times New Roman" w:cs="Times New Roman"/>
+          <w:bCs/>
+          <w:sz w:val="24"/>
+          <w:szCs w:val="24"/>
+        </w:rPr>
+        <w:t xml:space="preserve"> track</w:t>
+      </w:r>
+      <w:r>
+        <w:rPr>
+          <w:rFonts w:ascii="Times New Roman" w:hAnsi="Times New Roman" w:cs="Times New Roman"/>
+          <w:bCs/>
+          <w:sz w:val="24"/>
+          <w:szCs w:val="24"/>
+        </w:rPr>
+        <w:t>)</w:t>
+      </w:r>
+      <w:r>
+        <w:rPr>
+          <w:rFonts w:ascii="Times New Roman" w:hAnsi="Times New Roman" w:cs="Times New Roman"/>
+          <w:bCs/>
+          <w:sz w:val="24"/>
+          <w:szCs w:val="24"/>
+        </w:rPr>
+        <w:t xml:space="preserve">, also </w:t>
+      </w:r>
+      <w:r>
+        <w:rPr>
+          <w:rFonts w:ascii="Times New Roman" w:hAnsi="Times New Roman" w:cs="Times New Roman"/>
+          <w:b/>
+          <w:sz w:val="24"/>
+          <w:szCs w:val="24"/>
+        </w:rPr>
+        <w:t xml:space="preserve">spotlight presentation </w:t>
+      </w:r>
+      <w:r>
+        <w:rPr>
+          <w:rFonts w:ascii="Times New Roman" w:hAnsi="Times New Roman" w:cs="Times New Roman"/>
+          <w:b/>
+          <w:sz w:val="24"/>
+          <w:szCs w:val="24"/>
+        </w:rPr>
+        <w:t>at</w:t>
+      </w:r>
+      <w:r>
+        <w:rPr>
+          <w:rFonts w:ascii="Times New Roman" w:hAnsi="Times New Roman" w:cs="Times New Roman"/>
+          <w:b/>
+          <w:sz w:val="24"/>
+          <w:szCs w:val="24"/>
+        </w:rPr>
+        <w:t xml:space="preserve"> </w:t>
+      </w:r>
+      <w:r>
+        <w:rPr>
+          <w:rFonts w:ascii="Times New Roman" w:hAnsi="Times New Roman" w:cs="Times New Roman"/>
+          <w:bCs/>
+          <w:sz w:val="24"/>
+          <w:szCs w:val="24"/>
+        </w:rPr>
+        <w:t>ML4H</w:t>
       </w:r>
       <w:r>
         <w:rPr>
@@ -1450,7 +1520,91 @@
           <w:sz w:val="24"/>
           <w:szCs w:val="24"/>
         </w:rPr>
-        <w:t>How to post-train on a surrogate: Envelope sampling provably mitigates reward hacking</w:t>
+        <w:t xml:space="preserve"> </w:t>
+      </w:r>
+      <w:r>
+        <w:rPr>
+          <w:rFonts w:ascii="Times New Roman" w:hAnsi="Times New Roman" w:cs="Times New Roman"/>
+          <w:bCs/>
+          <w:sz w:val="24"/>
+          <w:szCs w:val="24"/>
+        </w:rPr>
+        <w:t>2024 (findings track)</w:t>
+      </w:r>
+    </w:p>
+    <w:p>
+      <w:pPr>
+        <w:autoSpaceDE w:val="0"/>
+        <w:autoSpaceDN w:val="0"/>
+        <w:adjustRightInd w:val="0"/>
+        <w:spacing w:after="0" w:line="240" w:lineRule="auto"/>
+        <w:rPr>
+          <w:rFonts w:ascii="Times New Roman" w:hAnsi="Times New Roman" w:cs="Times New Roman"/>
+          <w:bCs/>
+          <w:sz w:val="24"/>
+          <w:szCs w:val="24"/>
+        </w:rPr>
+      </w:pPr>
+    </w:p>
+    <w:p>
+      <w:pPr>
+        <w:autoSpaceDE w:val="0"/>
+        <w:autoSpaceDN w:val="0"/>
+        <w:adjustRightInd w:val="0"/>
+        <w:spacing w:after="0" w:line="240" w:lineRule="auto"/>
+        <w:rPr>
+          <w:rFonts w:ascii="Times New Roman" w:hAnsi="Times New Roman" w:cs="Times New Roman"/>
+          <w:bCs/>
+          <w:sz w:val="24"/>
+          <w:szCs w:val="24"/>
+        </w:rPr>
+      </w:pPr>
+      <w:r>
+        <w:rPr>
+          <w:rFonts w:ascii="Times New Roman" w:hAnsi="Times New Roman" w:cs="Times New Roman"/>
+          <w:bCs/>
+          <w:sz w:val="24"/>
+          <w:szCs w:val="24"/>
+        </w:rPr>
+        <w:lastRenderedPageBreak/>
+        <w:t xml:space="preserve">[p] </w:t>
+      </w:r>
+      <w:r>
+        <w:rPr>
+          <w:rFonts w:ascii="Times New Roman" w:hAnsi="Times New Roman" w:cs="Times New Roman"/>
+          <w:bCs/>
+          <w:sz w:val="24"/>
+          <w:szCs w:val="24"/>
+        </w:rPr>
+        <w:t xml:space="preserve">H. Cho, D. Froelicher*, N. Dokmai*, A. Nandi*, </w:t>
+      </w:r>
+      <w:r>
+        <w:rPr>
+          <w:rFonts w:ascii="Times New Roman" w:hAnsi="Times New Roman" w:cs="Times New Roman"/>
+          <w:bCs/>
+          <w:sz w:val="24"/>
+          <w:szCs w:val="24"/>
+          <w:u w:val="single"/>
+        </w:rPr>
+        <w:t>S. Sadhuka</w:t>
+      </w:r>
+      <w:r>
+        <w:rPr>
+          <w:rFonts w:ascii="Times New Roman" w:hAnsi="Times New Roman" w:cs="Times New Roman"/>
+          <w:bCs/>
+          <w:sz w:val="24"/>
+          <w:szCs w:val="24"/>
+        </w:rPr>
+        <w:t xml:space="preserve">*, </w:t>
+      </w:r>
+      <w:r>
+        <w:rPr>
+          <w:rFonts w:ascii="Times New Roman" w:hAnsi="Times New Roman" w:cs="Times New Roman"/>
+          <w:bCs/>
+          <w:sz w:val="24"/>
+          <w:szCs w:val="24"/>
+        </w:rPr>
+        <w:t>M. Hong*, B. Berger</w:t>
       </w:r>
       <w:r>
         <w:rPr>
@@ -1460,71 +1614,6 @@
           <w:szCs w:val="24"/>
         </w:rPr>
         <w:t xml:space="preserve">. </w:t>
-      </w:r>
-      <w:r>
-        <w:rPr>
-          <w:rFonts w:ascii="Times New Roman" w:hAnsi="Times New Roman" w:cs="Times New Roman"/>
-          <w:bCs/>
-          <w:sz w:val="24"/>
-          <w:szCs w:val="24"/>
-        </w:rPr>
-        <w:t>In progress.</w:t>
-      </w:r>
-    </w:p>
-    <w:p>
-      <w:pPr>
-        <w:autoSpaceDE w:val="0"/>
-        <w:autoSpaceDN w:val="0"/>
-        <w:adjustRightInd w:val="0"/>
-        <w:spacing w:after="0" w:line="240" w:lineRule="auto"/>
-        <w:rPr>
-          <w:rFonts w:ascii="Times New Roman" w:hAnsi="Times New Roman" w:cs="Times New Roman"/>
-          <w:bCs/>
-          <w:sz w:val="24"/>
-          <w:szCs w:val="24"/>
-        </w:rPr>
-      </w:pPr>
-    </w:p>
-    <w:p>
-      <w:pPr>
-        <w:autoSpaceDE w:val="0"/>
-        <w:autoSpaceDN w:val="0"/>
-        <w:adjustRightInd w:val="0"/>
-        <w:spacing w:after="0" w:line="240" w:lineRule="auto"/>
-        <w:rPr>
-          <w:rFonts w:ascii="Times New Roman" w:hAnsi="Times New Roman" w:cs="Times New Roman"/>
-          <w:bCs/>
-          <w:sz w:val="24"/>
-          <w:szCs w:val="24"/>
-        </w:rPr>
-      </w:pPr>
-      <w:r>
-        <w:rPr>
-          <w:rFonts w:ascii="Times New Roman" w:hAnsi="Times New Roman" w:cs="Times New Roman"/>
-          <w:bCs/>
-          <w:sz w:val="24"/>
-          <w:szCs w:val="24"/>
-        </w:rPr>
-        <w:t xml:space="preserve">[p] S. Balachandar, </w:t>
-      </w:r>
-      <w:r>
-        <w:rPr>
-          <w:rFonts w:ascii="Times New Roman" w:hAnsi="Times New Roman" w:cs="Times New Roman"/>
-          <w:bCs/>
-          <w:sz w:val="24"/>
-          <w:szCs w:val="24"/>
-          <w:u w:val="single"/>
-        </w:rPr>
-        <w:t>S. Sadhuka</w:t>
-      </w:r>
-      <w:r>
-        <w:rPr>
-          <w:rFonts w:ascii="Times New Roman" w:hAnsi="Times New Roman" w:cs="Times New Roman"/>
-          <w:bCs/>
-          <w:sz w:val="24"/>
-          <w:szCs w:val="24"/>
-        </w:rPr>
-        <w:t xml:space="preserve">, B. Berger, E. Pierson, N. Garg. </w:t>
       </w:r>
       <w:r>
         <w:rPr>
@@ -1535,72 +1624,16 @@
           <w:sz w:val="24"/>
           <w:szCs w:val="24"/>
         </w:rPr>
-        <w:t>Urban Incident Prediction with Graph Neural Networks: Integrating Government Ratings and Crowdsourced Reports</w:t>
-      </w:r>
-      <w:r>
-        <w:rPr>
-          <w:rFonts w:ascii="Times New Roman" w:hAnsi="Times New Roman" w:cs="Times New Roman"/>
-          <w:bCs/>
-          <w:sz w:val="24"/>
-          <w:szCs w:val="24"/>
-        </w:rPr>
-        <w:t>. AAAI 2026</w:t>
-      </w:r>
-    </w:p>
-    <w:p>
-      <w:pPr>
-        <w:autoSpaceDE w:val="0"/>
-        <w:autoSpaceDN w:val="0"/>
-        <w:adjustRightInd w:val="0"/>
-        <w:spacing w:after="0" w:line="240" w:lineRule="auto"/>
-        <w:rPr>
-          <w:rFonts w:ascii="Times New Roman" w:hAnsi="Times New Roman" w:cs="Times New Roman"/>
-          <w:bCs/>
-          <w:sz w:val="24"/>
-          <w:szCs w:val="24"/>
-        </w:rPr>
-      </w:pPr>
-    </w:p>
-    <w:p>
-      <w:pPr>
-        <w:autoSpaceDE w:val="0"/>
-        <w:autoSpaceDN w:val="0"/>
-        <w:adjustRightInd w:val="0"/>
-        <w:spacing w:after="0" w:line="240" w:lineRule="auto"/>
-        <w:rPr>
-          <w:rFonts w:ascii="Times New Roman" w:hAnsi="Times New Roman" w:cs="Times New Roman"/>
-          <w:bCs/>
-          <w:sz w:val="24"/>
-          <w:szCs w:val="24"/>
-        </w:rPr>
-      </w:pPr>
-      <w:r>
-        <w:rPr>
-          <w:rFonts w:ascii="Times New Roman" w:hAnsi="Times New Roman" w:cs="Times New Roman"/>
-          <w:bCs/>
-          <w:sz w:val="24"/>
-          <w:szCs w:val="24"/>
-        </w:rPr>
-        <w:t xml:space="preserve">[p] D. Shanmugam*, </w:t>
-      </w:r>
-      <w:r>
-        <w:rPr>
-          <w:rFonts w:ascii="Times New Roman" w:hAnsi="Times New Roman" w:cs="Times New Roman"/>
-          <w:bCs/>
-          <w:sz w:val="24"/>
-          <w:szCs w:val="24"/>
-          <w:u w:val="single"/>
-        </w:rPr>
-        <w:t>S. Sadhuka</w:t>
-      </w:r>
-      <w:r>
-        <w:rPr>
-          <w:rFonts w:ascii="Times New Roman" w:hAnsi="Times New Roman" w:cs="Times New Roman"/>
-          <w:bCs/>
-          <w:sz w:val="24"/>
-          <w:szCs w:val="24"/>
-        </w:rPr>
-        <w:t xml:space="preserve">*, M. Raghavan, J. Guttag, B. Berger, E. Pierson. </w:t>
+        <w:t>Privacy-Enhancing Technologies in Biomedical Data Science</w:t>
+      </w:r>
+      <w:r>
+        <w:rPr>
+          <w:rFonts w:ascii="Times New Roman" w:hAnsi="Times New Roman" w:cs="Times New Roman"/>
+          <w:bCs/>
+          <w:sz w:val="24"/>
+          <w:szCs w:val="24"/>
+        </w:rPr>
+        <w:t xml:space="preserve">. </w:t>
       </w:r>
       <w:r>
         <w:rPr>
@@ -1611,7 +1644,108 @@
           <w:sz w:val="24"/>
           <w:szCs w:val="24"/>
         </w:rPr>
-        <w:t>Evaluating multiple models using labeled and unlabeled data</w:t>
+        <w:t xml:space="preserve">Annual Reviews in Biomedical Data Science </w:t>
+      </w:r>
+      <w:r>
+        <w:rPr>
+          <w:rFonts w:ascii="Times New Roman" w:hAnsi="Times New Roman" w:cs="Times New Roman"/>
+          <w:bCs/>
+          <w:sz w:val="24"/>
+          <w:szCs w:val="24"/>
+        </w:rPr>
+        <w:t>2024</w:t>
+      </w:r>
+      <w:r>
+        <w:rPr>
+          <w:rFonts w:ascii="Times New Roman" w:hAnsi="Times New Roman" w:cs="Times New Roman"/>
+          <w:bCs/>
+          <w:sz w:val="24"/>
+          <w:szCs w:val="24"/>
+        </w:rPr>
+        <w:t xml:space="preserve"> Vol</w:t>
+      </w:r>
+      <w:r>
+        <w:rPr>
+          <w:rFonts w:ascii="Times New Roman" w:hAnsi="Times New Roman" w:cs="Times New Roman"/>
+          <w:bCs/>
+          <w:sz w:val="24"/>
+          <w:szCs w:val="24"/>
+        </w:rPr>
+        <w:t>.</w:t>
+      </w:r>
+      <w:r>
+        <w:rPr>
+          <w:rFonts w:ascii="Times New Roman" w:hAnsi="Times New Roman" w:cs="Times New Roman"/>
+          <w:bCs/>
+          <w:sz w:val="24"/>
+          <w:szCs w:val="24"/>
+        </w:rPr>
+        <w:t xml:space="preserve"> 7, Issue 1, pp. 317-343</w:t>
+      </w:r>
+    </w:p>
+    <w:p>
+      <w:pPr>
+        <w:autoSpaceDE w:val="0"/>
+        <w:autoSpaceDN w:val="0"/>
+        <w:adjustRightInd w:val="0"/>
+        <w:spacing w:after="0" w:line="240" w:lineRule="auto"/>
+        <w:rPr>
+          <w:rFonts w:ascii="Times New Roman" w:hAnsi="Times New Roman" w:cs="Times New Roman"/>
+          <w:bCs/>
+          <w:sz w:val="24"/>
+          <w:szCs w:val="24"/>
+        </w:rPr>
+      </w:pPr>
+    </w:p>
+    <w:p>
+      <w:pPr>
+        <w:autoSpaceDE w:val="0"/>
+        <w:autoSpaceDN w:val="0"/>
+        <w:adjustRightInd w:val="0"/>
+        <w:spacing w:after="0" w:line="240" w:lineRule="auto"/>
+        <w:rPr>
+          <w:rFonts w:ascii="Times New Roman" w:hAnsi="Times New Roman" w:cs="Times New Roman"/>
+          <w:bCs/>
+          <w:sz w:val="24"/>
+          <w:szCs w:val="24"/>
+        </w:rPr>
+      </w:pPr>
+      <w:r>
+        <w:rPr>
+          <w:rFonts w:ascii="Times New Roman" w:hAnsi="Times New Roman" w:cs="Times New Roman"/>
+          <w:bCs/>
+          <w:sz w:val="24"/>
+          <w:szCs w:val="24"/>
+        </w:rPr>
+        <w:t xml:space="preserve">[p] </w:t>
+      </w:r>
+      <w:r>
+        <w:rPr>
+          <w:rFonts w:ascii="Times New Roman" w:hAnsi="Times New Roman" w:cs="Times New Roman"/>
+          <w:bCs/>
+          <w:sz w:val="24"/>
+          <w:szCs w:val="24"/>
+          <w:u w:val="single"/>
+        </w:rPr>
+        <w:t>S. Sadhuka</w:t>
+      </w:r>
+      <w:r>
+        <w:rPr>
+          <w:rFonts w:ascii="Times New Roman" w:hAnsi="Times New Roman" w:cs="Times New Roman"/>
+          <w:bCs/>
+          <w:sz w:val="24"/>
+          <w:szCs w:val="24"/>
+        </w:rPr>
+        <w:t xml:space="preserve">, D. Fridman, </w:t>
+      </w:r>
+      <w:r>
+        <w:rPr>
+          <w:rFonts w:ascii="Times New Roman" w:hAnsi="Times New Roman" w:cs="Times New Roman"/>
+          <w:bCs/>
+          <w:sz w:val="24"/>
+          <w:szCs w:val="24"/>
+        </w:rPr>
+        <w:t>B. Berger, H. Cho</w:t>
       </w:r>
       <w:r>
         <w:rPr>
@@ -1621,83 +1755,6 @@
           <w:szCs w:val="24"/>
         </w:rPr>
         <w:t xml:space="preserve">. </w:t>
-      </w:r>
-      <w:proofErr w:type="spellStart"/>
-      <w:r>
-        <w:rPr>
-          <w:rFonts w:ascii="Times New Roman" w:hAnsi="Times New Roman" w:cs="Times New Roman"/>
-          <w:bCs/>
-          <w:sz w:val="24"/>
-          <w:szCs w:val="24"/>
-        </w:rPr>
-        <w:t>NeurIPS</w:t>
-      </w:r>
-      <w:proofErr w:type="spellEnd"/>
-      <w:r>
-        <w:rPr>
-          <w:rFonts w:ascii="Times New Roman" w:hAnsi="Times New Roman" w:cs="Times New Roman"/>
-          <w:bCs/>
-          <w:sz w:val="24"/>
-          <w:szCs w:val="24"/>
-        </w:rPr>
-        <w:t xml:space="preserve"> 2025</w:t>
-      </w:r>
-    </w:p>
-    <w:p>
-      <w:pPr>
-        <w:autoSpaceDE w:val="0"/>
-        <w:autoSpaceDN w:val="0"/>
-        <w:adjustRightInd w:val="0"/>
-        <w:spacing w:after="0" w:line="240" w:lineRule="auto"/>
-        <w:rPr>
-          <w:rFonts w:ascii="Times New Roman" w:hAnsi="Times New Roman" w:cs="Times New Roman"/>
-          <w:bCs/>
-          <w:sz w:val="24"/>
-          <w:szCs w:val="24"/>
-        </w:rPr>
-      </w:pPr>
-    </w:p>
-    <w:p>
-      <w:pPr>
-        <w:autoSpaceDE w:val="0"/>
-        <w:autoSpaceDN w:val="0"/>
-        <w:adjustRightInd w:val="0"/>
-        <w:spacing w:after="0" w:line="240" w:lineRule="auto"/>
-        <w:rPr>
-          <w:rFonts w:ascii="Times New Roman" w:hAnsi="Times New Roman" w:cs="Times New Roman"/>
-          <w:bCs/>
-          <w:sz w:val="24"/>
-          <w:szCs w:val="24"/>
-        </w:rPr>
-      </w:pPr>
-      <w:r>
-        <w:rPr>
-          <w:rFonts w:ascii="Times New Roman" w:hAnsi="Times New Roman" w:cs="Times New Roman"/>
-          <w:bCs/>
-          <w:sz w:val="24"/>
-          <w:szCs w:val="24"/>
-        </w:rPr>
-        <w:lastRenderedPageBreak/>
-        <w:t xml:space="preserve">[p] </w:t>
-      </w:r>
-      <w:r>
-        <w:rPr>
-          <w:rFonts w:ascii="Times New Roman" w:hAnsi="Times New Roman" w:cs="Times New Roman"/>
-          <w:bCs/>
-          <w:sz w:val="24"/>
-          <w:szCs w:val="24"/>
-          <w:u w:val="single"/>
-        </w:rPr>
-        <w:t>S. Sadhuka</w:t>
-      </w:r>
-      <w:r>
-        <w:rPr>
-          <w:rFonts w:ascii="Times New Roman" w:hAnsi="Times New Roman" w:cs="Times New Roman"/>
-          <w:bCs/>
-          <w:sz w:val="24"/>
-          <w:szCs w:val="24"/>
-        </w:rPr>
-        <w:t xml:space="preserve">, S. Lin, B. Berger**. E. Pierson**. </w:t>
       </w:r>
       <w:r>
         <w:rPr>
@@ -1708,7 +1765,7 @@
           <w:sz w:val="24"/>
           <w:szCs w:val="24"/>
         </w:rPr>
-        <w:t>A Bayesian Model for Multi-stage Censoring</w:t>
+        <w:t>Assessing transcriptomic reidentification risks using discriminative sequence models</w:t>
       </w:r>
       <w:r>
         <w:rPr>
@@ -1722,56 +1779,20 @@
       <w:r>
         <w:rPr>
           <w:rFonts w:ascii="Times New Roman" w:hAnsi="Times New Roman" w:cs="Times New Roman"/>
-          <w:bCs/>
-          <w:sz w:val="24"/>
-          <w:szCs w:val="24"/>
-        </w:rPr>
-        <w:t>ML4H 2025</w:t>
-      </w:r>
-      <w:r>
-        <w:rPr>
-          <w:rFonts w:ascii="Times New Roman" w:hAnsi="Times New Roman" w:cs="Times New Roman"/>
-          <w:bCs/>
-          <w:sz w:val="24"/>
-          <w:szCs w:val="24"/>
-        </w:rPr>
-        <w:t xml:space="preserve"> (proceedings</w:t>
-      </w:r>
-      <w:r>
-        <w:rPr>
-          <w:rFonts w:ascii="Times New Roman" w:hAnsi="Times New Roman" w:cs="Times New Roman"/>
-          <w:bCs/>
-          <w:sz w:val="24"/>
-          <w:szCs w:val="24"/>
-        </w:rPr>
-        <w:t xml:space="preserve"> track</w:t>
-      </w:r>
-      <w:r>
-        <w:rPr>
-          <w:rFonts w:ascii="Times New Roman" w:hAnsi="Times New Roman" w:cs="Times New Roman"/>
-          <w:bCs/>
-          <w:sz w:val="24"/>
-          <w:szCs w:val="24"/>
-        </w:rPr>
-        <w:t>)</w:t>
-      </w:r>
-      <w:r>
-        <w:rPr>
-          <w:rFonts w:ascii="Times New Roman" w:hAnsi="Times New Roman" w:cs="Times New Roman"/>
-          <w:bCs/>
-          <w:sz w:val="24"/>
-          <w:szCs w:val="24"/>
-        </w:rPr>
-        <w:t xml:space="preserve">, also </w:t>
-      </w:r>
-      <w:r>
-        <w:rPr>
-          <w:rFonts w:ascii="Times New Roman" w:hAnsi="Times New Roman" w:cs="Times New Roman"/>
-          <w:b/>
-          <w:sz w:val="24"/>
-          <w:szCs w:val="24"/>
-        </w:rPr>
-        <w:t xml:space="preserve">spotlight presentation </w:t>
+          <w:b/>
+          <w:sz w:val="24"/>
+          <w:szCs w:val="24"/>
+        </w:rPr>
+        <w:t>oral presentation</w:t>
+      </w:r>
+      <w:r>
+        <w:rPr>
+          <w:rFonts w:ascii="Times New Roman" w:hAnsi="Times New Roman" w:cs="Times New Roman"/>
+          <w:bCs/>
+          <w:sz w:val="24"/>
+          <w:szCs w:val="24"/>
+        </w:rPr>
+        <w:t xml:space="preserve"> </w:t>
       </w:r>
       <w:r>
         <w:rPr>
@@ -1798,7 +1819,7 @@
           <w:sz w:val="24"/>
           <w:szCs w:val="24"/>
         </w:rPr>
-        <w:t>ML4H</w:t>
+        <w:t>RECOMB</w:t>
       </w:r>
       <w:r>
         <w:rPr>
@@ -1818,110 +1839,16 @@
           <w:sz w:val="24"/>
           <w:szCs w:val="24"/>
         </w:rPr>
-        <w:t>2024 (findings track)</w:t>
-      </w:r>
-    </w:p>
-    <w:p>
-      <w:pPr>
-        <w:autoSpaceDE w:val="0"/>
-        <w:autoSpaceDN w:val="0"/>
-        <w:adjustRightInd w:val="0"/>
-        <w:spacing w:after="0" w:line="240" w:lineRule="auto"/>
-        <w:rPr>
-          <w:rFonts w:ascii="Times New Roman" w:hAnsi="Times New Roman" w:cs="Times New Roman"/>
-          <w:bCs/>
-          <w:sz w:val="24"/>
-          <w:szCs w:val="24"/>
-        </w:rPr>
-      </w:pPr>
-    </w:p>
-    <w:p>
-      <w:pPr>
-        <w:autoSpaceDE w:val="0"/>
-        <w:autoSpaceDN w:val="0"/>
-        <w:adjustRightInd w:val="0"/>
-        <w:spacing w:after="0" w:line="240" w:lineRule="auto"/>
-        <w:rPr>
-          <w:rFonts w:ascii="Times New Roman" w:hAnsi="Times New Roman" w:cs="Times New Roman"/>
-          <w:bCs/>
-          <w:sz w:val="24"/>
-          <w:szCs w:val="24"/>
-        </w:rPr>
-      </w:pPr>
-      <w:r>
-        <w:rPr>
-          <w:rFonts w:ascii="Times New Roman" w:hAnsi="Times New Roman" w:cs="Times New Roman"/>
-          <w:bCs/>
-          <w:sz w:val="24"/>
-          <w:szCs w:val="24"/>
-        </w:rPr>
-        <w:t xml:space="preserve">[p] </w:t>
-      </w:r>
-      <w:r>
-        <w:rPr>
-          <w:rFonts w:ascii="Times New Roman" w:hAnsi="Times New Roman" w:cs="Times New Roman"/>
-          <w:bCs/>
-          <w:sz w:val="24"/>
-          <w:szCs w:val="24"/>
-        </w:rPr>
-        <w:t xml:space="preserve">H. Cho, D. Froelicher*, N. </w:t>
-      </w:r>
-      <w:proofErr w:type="spellStart"/>
-      <w:r>
-        <w:rPr>
-          <w:rFonts w:ascii="Times New Roman" w:hAnsi="Times New Roman" w:cs="Times New Roman"/>
-          <w:bCs/>
-          <w:sz w:val="24"/>
-          <w:szCs w:val="24"/>
-        </w:rPr>
-        <w:t>Dokmai</w:t>
-      </w:r>
-      <w:proofErr w:type="spellEnd"/>
-      <w:r>
-        <w:rPr>
-          <w:rFonts w:ascii="Times New Roman" w:hAnsi="Times New Roman" w:cs="Times New Roman"/>
-          <w:bCs/>
-          <w:sz w:val="24"/>
-          <w:szCs w:val="24"/>
-        </w:rPr>
-        <w:t xml:space="preserve">*, A. Nandi*, </w:t>
-      </w:r>
-      <w:r>
-        <w:rPr>
-          <w:rFonts w:ascii="Times New Roman" w:hAnsi="Times New Roman" w:cs="Times New Roman"/>
-          <w:bCs/>
-          <w:sz w:val="24"/>
-          <w:szCs w:val="24"/>
-          <w:u w:val="single"/>
-        </w:rPr>
-        <w:t>S. Sadhuka</w:t>
-      </w:r>
-      <w:r>
-        <w:rPr>
-          <w:rFonts w:ascii="Times New Roman" w:hAnsi="Times New Roman" w:cs="Times New Roman"/>
-          <w:bCs/>
-          <w:sz w:val="24"/>
-          <w:szCs w:val="24"/>
-        </w:rPr>
-        <w:t xml:space="preserve">*, </w:t>
-      </w:r>
-      <w:r>
-        <w:rPr>
-          <w:rFonts w:ascii="Times New Roman" w:hAnsi="Times New Roman" w:cs="Times New Roman"/>
-          <w:bCs/>
-          <w:sz w:val="24"/>
-          <w:szCs w:val="24"/>
-        </w:rPr>
-        <w:t>M. Hong*, B. Berger</w:t>
-      </w:r>
-      <w:r>
-        <w:rPr>
-          <w:rFonts w:ascii="Times New Roman" w:hAnsi="Times New Roman" w:cs="Times New Roman"/>
-          <w:bCs/>
-          <w:sz w:val="24"/>
-          <w:szCs w:val="24"/>
-        </w:rPr>
-        <w:t xml:space="preserve">. </w:t>
+        <w:t>2023</w:t>
+      </w:r>
+      <w:r>
+        <w:rPr>
+          <w:rFonts w:ascii="Times New Roman" w:hAnsi="Times New Roman" w:cs="Times New Roman"/>
+          <w:bCs/>
+          <w:sz w:val="24"/>
+          <w:szCs w:val="24"/>
+        </w:rPr>
+        <w:t xml:space="preserve"> and </w:t>
       </w:r>
       <w:r>
         <w:rPr>
@@ -1932,16 +1859,90 @@
           <w:sz w:val="24"/>
           <w:szCs w:val="24"/>
         </w:rPr>
-        <w:t>Privacy-Enhancing Technologies in Biomedical Data Science</w:t>
-      </w:r>
-      <w:r>
-        <w:rPr>
-          <w:rFonts w:ascii="Times New Roman" w:hAnsi="Times New Roman" w:cs="Times New Roman"/>
-          <w:bCs/>
-          <w:sz w:val="24"/>
-          <w:szCs w:val="24"/>
-        </w:rPr>
-        <w:t xml:space="preserve">. </w:t>
+        <w:t>Genome Research</w:t>
+      </w:r>
+      <w:r>
+        <w:rPr>
+          <w:rFonts w:ascii="Times New Roman" w:hAnsi="Times New Roman" w:cs="Times New Roman"/>
+          <w:bCs/>
+          <w:sz w:val="24"/>
+          <w:szCs w:val="24"/>
+        </w:rPr>
+        <w:t xml:space="preserve"> 2023</w:t>
+      </w:r>
+      <w:r>
+        <w:rPr>
+          <w:rFonts w:ascii="Times New Roman" w:hAnsi="Times New Roman" w:cs="Times New Roman"/>
+          <w:bCs/>
+          <w:sz w:val="24"/>
+          <w:szCs w:val="24"/>
+        </w:rPr>
+        <w:t xml:space="preserve"> Vol. 33, Issue 7, pp. 1101-1112</w:t>
+      </w:r>
+    </w:p>
+    <w:p>
+      <w:pPr>
+        <w:autoSpaceDE w:val="0"/>
+        <w:autoSpaceDN w:val="0"/>
+        <w:adjustRightInd w:val="0"/>
+        <w:spacing w:after="0" w:line="240" w:lineRule="auto"/>
+        <w:rPr>
+          <w:rFonts w:ascii="Times New Roman" w:hAnsi="Times New Roman" w:cs="Times New Roman"/>
+          <w:bCs/>
+          <w:sz w:val="24"/>
+          <w:szCs w:val="24"/>
+        </w:rPr>
+      </w:pPr>
+    </w:p>
+    <w:p>
+      <w:pPr>
+        <w:autoSpaceDE w:val="0"/>
+        <w:autoSpaceDN w:val="0"/>
+        <w:adjustRightInd w:val="0"/>
+        <w:spacing w:after="0" w:line="240" w:lineRule="auto"/>
+        <w:rPr>
+          <w:rFonts w:ascii="Times New Roman" w:hAnsi="Times New Roman" w:cs="Times New Roman"/>
+          <w:bCs/>
+          <w:sz w:val="24"/>
+          <w:szCs w:val="24"/>
+        </w:rPr>
+      </w:pPr>
+      <w:r>
+        <w:rPr>
+          <w:rFonts w:ascii="Times New Roman" w:hAnsi="Times New Roman" w:cs="Times New Roman"/>
+          <w:bCs/>
+          <w:sz w:val="24"/>
+          <w:szCs w:val="24"/>
+        </w:rPr>
+        <w:t xml:space="preserve">[p] </w:t>
+      </w:r>
+      <w:r>
+        <w:rPr>
+          <w:rFonts w:ascii="Times New Roman" w:hAnsi="Times New Roman" w:cs="Times New Roman"/>
+          <w:bCs/>
+          <w:sz w:val="24"/>
+          <w:szCs w:val="24"/>
+        </w:rPr>
+        <w:t xml:space="preserve">H. Pirie, </w:t>
+      </w:r>
+      <w:r>
+        <w:rPr>
+          <w:rFonts w:ascii="Times New Roman" w:hAnsi="Times New Roman" w:cs="Times New Roman"/>
+          <w:bCs/>
+          <w:sz w:val="24"/>
+          <w:szCs w:val="24"/>
+          <w:u w:val="single"/>
+        </w:rPr>
+        <w:t>S. Sadhuka</w:t>
+      </w:r>
+      <w:r>
+        <w:rPr>
+          <w:rFonts w:ascii="Times New Roman" w:hAnsi="Times New Roman" w:cs="Times New Roman"/>
+          <w:bCs/>
+          <w:sz w:val="24"/>
+          <w:szCs w:val="24"/>
+        </w:rPr>
+        <w:t xml:space="preserve">, J. Wang, R. Andrei, J. Hoffman. </w:t>
       </w:r>
       <w:r>
         <w:rPr>
@@ -1952,90 +1953,7 @@
           <w:sz w:val="24"/>
           <w:szCs w:val="24"/>
         </w:rPr>
-        <w:t xml:space="preserve">Annual Reviews in Biomedical Data Science </w:t>
-      </w:r>
-      <w:r>
-        <w:rPr>
-          <w:rFonts w:ascii="Times New Roman" w:hAnsi="Times New Roman" w:cs="Times New Roman"/>
-          <w:bCs/>
-          <w:sz w:val="24"/>
-          <w:szCs w:val="24"/>
-        </w:rPr>
-        <w:t>2024</w:t>
-      </w:r>
-    </w:p>
-    <w:p>
-      <w:pPr>
-        <w:autoSpaceDE w:val="0"/>
-        <w:autoSpaceDN w:val="0"/>
-        <w:adjustRightInd w:val="0"/>
-        <w:spacing w:after="0" w:line="240" w:lineRule="auto"/>
-        <w:rPr>
-          <w:rFonts w:ascii="Times New Roman" w:hAnsi="Times New Roman" w:cs="Times New Roman"/>
-          <w:bCs/>
-          <w:sz w:val="24"/>
-          <w:szCs w:val="24"/>
-        </w:rPr>
-      </w:pPr>
-    </w:p>
-    <w:p>
-      <w:pPr>
-        <w:autoSpaceDE w:val="0"/>
-        <w:autoSpaceDN w:val="0"/>
-        <w:adjustRightInd w:val="0"/>
-        <w:spacing w:after="0" w:line="240" w:lineRule="auto"/>
-        <w:rPr>
-          <w:rFonts w:ascii="Times New Roman" w:hAnsi="Times New Roman" w:cs="Times New Roman"/>
-          <w:bCs/>
-          <w:sz w:val="24"/>
-          <w:szCs w:val="24"/>
-        </w:rPr>
-      </w:pPr>
-      <w:r>
-        <w:rPr>
-          <w:rFonts w:ascii="Times New Roman" w:hAnsi="Times New Roman" w:cs="Times New Roman"/>
-          <w:bCs/>
-          <w:sz w:val="24"/>
-          <w:szCs w:val="24"/>
-        </w:rPr>
-        <w:t xml:space="preserve">[p] </w:t>
-      </w:r>
-      <w:r>
-        <w:rPr>
-          <w:rFonts w:ascii="Times New Roman" w:hAnsi="Times New Roman" w:cs="Times New Roman"/>
-          <w:bCs/>
-          <w:sz w:val="24"/>
-          <w:szCs w:val="24"/>
-          <w:u w:val="single"/>
-        </w:rPr>
-        <w:t>S. Sadhuka</w:t>
-      </w:r>
-      <w:r>
-        <w:rPr>
-          <w:rFonts w:ascii="Times New Roman" w:hAnsi="Times New Roman" w:cs="Times New Roman"/>
-          <w:bCs/>
-          <w:sz w:val="24"/>
-          <w:szCs w:val="24"/>
-        </w:rPr>
-        <w:t xml:space="preserve">, D. Fridman, </w:t>
-      </w:r>
-      <w:r>
-        <w:rPr>
-          <w:rFonts w:ascii="Times New Roman" w:hAnsi="Times New Roman" w:cs="Times New Roman"/>
-          <w:bCs/>
-          <w:sz w:val="24"/>
-          <w:szCs w:val="24"/>
-        </w:rPr>
-        <w:t>B. Berger, H. Cho</w:t>
-      </w:r>
-      <w:r>
-        <w:rPr>
-          <w:rFonts w:ascii="Times New Roman" w:hAnsi="Times New Roman" w:cs="Times New Roman"/>
-          <w:bCs/>
-          <w:sz w:val="24"/>
-          <w:szCs w:val="24"/>
-        </w:rPr>
-        <w:t xml:space="preserve">. </w:t>
+        <w:t xml:space="preserve">Topological </w:t>
       </w:r>
       <w:r>
         <w:rPr>
@@ -2046,16 +1964,7 @@
           <w:sz w:val="24"/>
           <w:szCs w:val="24"/>
         </w:rPr>
-        <w:t>Assessing transcriptomic reidentification risks using discriminative sequence models</w:t>
-      </w:r>
-      <w:r>
-        <w:rPr>
-          <w:rFonts w:ascii="Times New Roman" w:hAnsi="Times New Roman" w:cs="Times New Roman"/>
-          <w:bCs/>
-          <w:sz w:val="24"/>
-          <w:szCs w:val="24"/>
-        </w:rPr>
-        <w:t xml:space="preserve">. </w:t>
+        <w:t>p</w:t>
       </w:r>
       <w:r>
         <w:rPr>
@@ -2066,70 +1975,7 @@
           <w:sz w:val="24"/>
           <w:szCs w:val="24"/>
         </w:rPr>
-        <w:t>Genome Research</w:t>
-      </w:r>
-      <w:r>
-        <w:rPr>
-          <w:rFonts w:ascii="Times New Roman" w:hAnsi="Times New Roman" w:cs="Times New Roman"/>
-          <w:bCs/>
-          <w:sz w:val="24"/>
-          <w:szCs w:val="24"/>
-        </w:rPr>
-        <w:t xml:space="preserve"> 2023</w:t>
-      </w:r>
-      <w:r>
-        <w:rPr>
-          <w:rFonts w:ascii="Times New Roman" w:hAnsi="Times New Roman" w:cs="Times New Roman"/>
-          <w:bCs/>
-          <w:sz w:val="24"/>
-          <w:szCs w:val="24"/>
-        </w:rPr>
-        <w:t xml:space="preserve">; </w:t>
-      </w:r>
-      <w:r>
-        <w:rPr>
-          <w:rFonts w:ascii="Times New Roman" w:hAnsi="Times New Roman" w:cs="Times New Roman"/>
-          <w:b/>
-          <w:sz w:val="24"/>
-          <w:szCs w:val="24"/>
-        </w:rPr>
-        <w:t>oral presentation</w:t>
-      </w:r>
-      <w:r>
-        <w:rPr>
-          <w:rFonts w:ascii="Times New Roman" w:hAnsi="Times New Roman" w:cs="Times New Roman"/>
-          <w:bCs/>
-          <w:sz w:val="24"/>
-          <w:szCs w:val="24"/>
-        </w:rPr>
-        <w:t xml:space="preserve"> </w:t>
-      </w:r>
-      <w:r>
-        <w:rPr>
-          <w:rFonts w:ascii="Times New Roman" w:hAnsi="Times New Roman" w:cs="Times New Roman"/>
-          <w:b/>
-          <w:sz w:val="24"/>
-          <w:szCs w:val="24"/>
-        </w:rPr>
-        <w:t>at</w:t>
-      </w:r>
-      <w:r>
-        <w:rPr>
-          <w:rFonts w:ascii="Times New Roman" w:hAnsi="Times New Roman" w:cs="Times New Roman"/>
-          <w:b/>
-          <w:sz w:val="24"/>
-          <w:szCs w:val="24"/>
-        </w:rPr>
-        <w:t xml:space="preserve"> </w:t>
-      </w:r>
-      <w:r>
-        <w:rPr>
-          <w:rFonts w:ascii="Times New Roman" w:hAnsi="Times New Roman" w:cs="Times New Roman"/>
-          <w:bCs/>
-          <w:sz w:val="24"/>
-          <w:szCs w:val="24"/>
-        </w:rPr>
-        <w:t>RECOMB</w:t>
+        <w:t xml:space="preserve">hononic </w:t>
       </w:r>
       <w:r>
         <w:rPr>
@@ -2140,81 +1986,7 @@
           <w:sz w:val="24"/>
           <w:szCs w:val="24"/>
         </w:rPr>
-        <w:t xml:space="preserve"> </w:t>
-      </w:r>
-      <w:r>
-        <w:rPr>
-          <w:rFonts w:ascii="Times New Roman" w:hAnsi="Times New Roman" w:cs="Times New Roman"/>
-          <w:bCs/>
-          <w:sz w:val="24"/>
-          <w:szCs w:val="24"/>
-        </w:rPr>
-        <w:t>2023</w:t>
-      </w:r>
-    </w:p>
-    <w:p>
-      <w:pPr>
-        <w:autoSpaceDE w:val="0"/>
-        <w:autoSpaceDN w:val="0"/>
-        <w:adjustRightInd w:val="0"/>
-        <w:spacing w:after="0" w:line="240" w:lineRule="auto"/>
-        <w:rPr>
-          <w:rFonts w:ascii="Times New Roman" w:hAnsi="Times New Roman" w:cs="Times New Roman"/>
-          <w:bCs/>
-          <w:sz w:val="24"/>
-          <w:szCs w:val="24"/>
-        </w:rPr>
-      </w:pPr>
-    </w:p>
-    <w:p>
-      <w:pPr>
-        <w:autoSpaceDE w:val="0"/>
-        <w:autoSpaceDN w:val="0"/>
-        <w:adjustRightInd w:val="0"/>
-        <w:spacing w:after="0" w:line="240" w:lineRule="auto"/>
-        <w:rPr>
-          <w:rFonts w:ascii="Times New Roman" w:hAnsi="Times New Roman" w:cs="Times New Roman"/>
-          <w:bCs/>
-          <w:sz w:val="24"/>
-          <w:szCs w:val="24"/>
-        </w:rPr>
-      </w:pPr>
-      <w:r>
-        <w:rPr>
-          <w:rFonts w:ascii="Times New Roman" w:hAnsi="Times New Roman" w:cs="Times New Roman"/>
-          <w:bCs/>
-          <w:sz w:val="24"/>
-          <w:szCs w:val="24"/>
-        </w:rPr>
-        <w:t xml:space="preserve">[p] </w:t>
-      </w:r>
-      <w:r>
-        <w:rPr>
-          <w:rFonts w:ascii="Times New Roman" w:hAnsi="Times New Roman" w:cs="Times New Roman"/>
-          <w:bCs/>
-          <w:sz w:val="24"/>
-          <w:szCs w:val="24"/>
-        </w:rPr>
-        <w:t xml:space="preserve">H. Pirie, </w:t>
-      </w:r>
-      <w:r>
-        <w:rPr>
-          <w:rFonts w:ascii="Times New Roman" w:hAnsi="Times New Roman" w:cs="Times New Roman"/>
-          <w:bCs/>
-          <w:sz w:val="24"/>
-          <w:szCs w:val="24"/>
-          <w:u w:val="single"/>
-        </w:rPr>
-        <w:t>S. Sadhuka</w:t>
-      </w:r>
-      <w:r>
-        <w:rPr>
-          <w:rFonts w:ascii="Times New Roman" w:hAnsi="Times New Roman" w:cs="Times New Roman"/>
-          <w:bCs/>
-          <w:sz w:val="24"/>
-          <w:szCs w:val="24"/>
-        </w:rPr>
-        <w:t xml:space="preserve">, J. Wang, R. Andrei, J. Hoffman. </w:t>
+        <w:t>l</w:t>
       </w:r>
       <w:r>
         <w:rPr>
@@ -2225,9 +1997,44 @@
           <w:sz w:val="24"/>
           <w:szCs w:val="24"/>
         </w:rPr>
-        <w:t xml:space="preserve">Topological </w:t>
-      </w:r>
-      <w:proofErr w:type="spellStart"/>
+        <w:t>ogic</w:t>
+      </w:r>
+      <w:r>
+        <w:rPr>
+          <w:rFonts w:ascii="Times New Roman" w:hAnsi="Times New Roman" w:cs="Times New Roman"/>
+          <w:bCs/>
+          <w:sz w:val="24"/>
+          <w:szCs w:val="24"/>
+        </w:rPr>
+        <w:t>.</w:t>
+      </w:r>
+      <w:r>
+        <w:rPr>
+          <w:rFonts w:ascii="Times New Roman" w:hAnsi="Times New Roman" w:cs="Times New Roman"/>
+          <w:bCs/>
+          <w:sz w:val="24"/>
+          <w:szCs w:val="24"/>
+        </w:rPr>
+        <w:t xml:space="preserve"> </w:t>
+      </w:r>
+      <w:r>
+        <w:rPr>
+          <w:rFonts w:ascii="Times New Roman" w:hAnsi="Times New Roman" w:cs="Times New Roman"/>
+          <w:b/>
+          <w:sz w:val="24"/>
+          <w:szCs w:val="24"/>
+        </w:rPr>
+        <w:t>Cover article in</w:t>
+      </w:r>
+      <w:r>
+        <w:rPr>
+          <w:rFonts w:ascii="Times New Roman" w:hAnsi="Times New Roman" w:cs="Times New Roman"/>
+          <w:bCs/>
+          <w:sz w:val="24"/>
+          <w:szCs w:val="24"/>
+        </w:rPr>
+        <w:t xml:space="preserve"> </w:t>
+      </w:r>
       <w:r>
         <w:rPr>
           <w:rFonts w:ascii="Times New Roman" w:hAnsi="Times New Roman" w:cs="Times New Roman"/>
@@ -2237,98 +2044,6 @@
           <w:sz w:val="24"/>
           <w:szCs w:val="24"/>
         </w:rPr>
-        <w:t>p</w:t>
-      </w:r>
-      <w:r>
-        <w:rPr>
-          <w:rFonts w:ascii="Times New Roman" w:hAnsi="Times New Roman" w:cs="Times New Roman"/>
-          <w:bCs/>
-          <w:i/>
-          <w:iCs/>
-          <w:sz w:val="24"/>
-          <w:szCs w:val="24"/>
-        </w:rPr>
-        <w:t>hononic</w:t>
-      </w:r>
-      <w:proofErr w:type="spellEnd"/>
-      <w:r>
-        <w:rPr>
-          <w:rFonts w:ascii="Times New Roman" w:hAnsi="Times New Roman" w:cs="Times New Roman"/>
-          <w:bCs/>
-          <w:i/>
-          <w:iCs/>
-          <w:sz w:val="24"/>
-          <w:szCs w:val="24"/>
-        </w:rPr>
-        <w:t xml:space="preserve"> </w:t>
-      </w:r>
-      <w:r>
-        <w:rPr>
-          <w:rFonts w:ascii="Times New Roman" w:hAnsi="Times New Roman" w:cs="Times New Roman"/>
-          <w:bCs/>
-          <w:i/>
-          <w:iCs/>
-          <w:sz w:val="24"/>
-          <w:szCs w:val="24"/>
-        </w:rPr>
-        <w:t>l</w:t>
-      </w:r>
-      <w:r>
-        <w:rPr>
-          <w:rFonts w:ascii="Times New Roman" w:hAnsi="Times New Roman" w:cs="Times New Roman"/>
-          <w:bCs/>
-          <w:i/>
-          <w:iCs/>
-          <w:sz w:val="24"/>
-          <w:szCs w:val="24"/>
-        </w:rPr>
-        <w:t>ogic</w:t>
-      </w:r>
-      <w:r>
-        <w:rPr>
-          <w:rFonts w:ascii="Times New Roman" w:hAnsi="Times New Roman" w:cs="Times New Roman"/>
-          <w:bCs/>
-          <w:sz w:val="24"/>
-          <w:szCs w:val="24"/>
-        </w:rPr>
-        <w:t>.</w:t>
-      </w:r>
-      <w:r>
-        <w:rPr>
-          <w:rFonts w:ascii="Times New Roman" w:hAnsi="Times New Roman" w:cs="Times New Roman"/>
-          <w:bCs/>
-          <w:sz w:val="24"/>
-          <w:szCs w:val="24"/>
-        </w:rPr>
-        <w:t xml:space="preserve"> </w:t>
-      </w:r>
-      <w:r>
-        <w:rPr>
-          <w:rFonts w:ascii="Times New Roman" w:hAnsi="Times New Roman" w:cs="Times New Roman"/>
-          <w:b/>
-          <w:sz w:val="24"/>
-          <w:szCs w:val="24"/>
-        </w:rPr>
-        <w:t>Cover article in</w:t>
-      </w:r>
-      <w:r>
-        <w:rPr>
-          <w:rFonts w:ascii="Times New Roman" w:hAnsi="Times New Roman" w:cs="Times New Roman"/>
-          <w:bCs/>
-          <w:sz w:val="24"/>
-          <w:szCs w:val="24"/>
-        </w:rPr>
-        <w:t xml:space="preserve"> </w:t>
-      </w:r>
-      <w:r>
-        <w:rPr>
-          <w:rFonts w:ascii="Times New Roman" w:hAnsi="Times New Roman" w:cs="Times New Roman"/>
-          <w:bCs/>
-          <w:i/>
-          <w:iCs/>
-          <w:sz w:val="24"/>
-          <w:szCs w:val="24"/>
-        </w:rPr>
         <w:t xml:space="preserve">Physical Review Letters </w:t>
       </w:r>
       <w:r>
@@ -2339,6 +2054,15 @@
           <w:szCs w:val="24"/>
         </w:rPr>
         <w:t>2022</w:t>
+      </w:r>
+      <w:r>
+        <w:rPr>
+          <w:rFonts w:ascii="Times New Roman" w:hAnsi="Times New Roman" w:cs="Times New Roman"/>
+          <w:bCs/>
+          <w:sz w:val="24"/>
+          <w:szCs w:val="24"/>
+        </w:rPr>
+        <w:t xml:space="preserve"> Vol. 128, Issue 1, pp. 015501</w:t>
       </w:r>
     </w:p>
     <w:p>
@@ -2370,7 +2094,7 @@
         </w:rPr>
         <w:t xml:space="preserve">Press: </w:t>
       </w:r>
-      <w:hyperlink r:id="rId9" w:history="1">
+      <w:hyperlink r:id="rId10" w:history="1">
         <w:r>
           <w:rPr>
             <w:rStyle w:val="Hyperlink"/>
@@ -2395,7 +2119,7 @@
         </w:rPr>
         <w:t xml:space="preserve">, </w:t>
       </w:r>
-      <w:hyperlink r:id="rId10" w:history="1">
+      <w:hyperlink r:id="rId11" w:history="1">
         <w:r>
           <w:rPr>
             <w:rStyle w:val="Hyperlink"/>
@@ -2420,7 +2144,7 @@
         </w:rPr>
         <w:t xml:space="preserve">, </w:t>
       </w:r>
-      <w:hyperlink r:id="rId11" w:history="1">
+      <w:hyperlink r:id="rId12" w:history="1">
         <w:r>
           <w:rPr>
             <w:rStyle w:val="Hyperlink"/>
@@ -2445,8 +2169,7 @@
         </w:rPr>
         <w:t xml:space="preserve">, </w:t>
       </w:r>
-      <w:hyperlink r:id="rId12" w:history="1">
-        <w:proofErr w:type="spellStart"/>
+      <w:hyperlink r:id="rId13" w:history="1">
         <w:r>
           <w:rPr>
             <w:rStyle w:val="Hyperlink"/>
@@ -2459,7 +2182,6 @@
           </w:rPr>
           <w:t>Hackaday</w:t>
         </w:r>
-        <w:proofErr w:type="spellEnd"/>
       </w:hyperlink>
     </w:p>
     <w:p>
@@ -2524,27 +2246,7 @@
           <w:sz w:val="24"/>
           <w:szCs w:val="24"/>
         </w:rPr>
-        <w:t xml:space="preserve">, R. Cui, C. </w:t>
-      </w:r>
-      <w:proofErr w:type="spellStart"/>
-      <w:r>
-        <w:rPr>
-          <w:rFonts w:ascii="Times New Roman" w:hAnsi="Times New Roman" w:cs="Times New Roman"/>
-          <w:bCs/>
-          <w:sz w:val="24"/>
-          <w:szCs w:val="24"/>
-        </w:rPr>
-        <w:t>Albors</w:t>
-      </w:r>
-      <w:proofErr w:type="spellEnd"/>
-      <w:r>
-        <w:rPr>
-          <w:rFonts w:ascii="Times New Roman" w:hAnsi="Times New Roman" w:cs="Times New Roman"/>
-          <w:bCs/>
-          <w:sz w:val="24"/>
-          <w:szCs w:val="24"/>
-        </w:rPr>
-        <w:t xml:space="preserve">, N. Cheng, Y. Okada, Biobank Japan Project, F. Aguet, K. Ardlie, D. MacArthur, H. Finucane. </w:t>
+        <w:t xml:space="preserve">, R. Cui, C. Albors, N. Cheng, Y. Okada, Biobank Japan Project, F. Aguet, K. Ardlie, D. MacArthur, H. Finucane. </w:t>
       </w:r>
       <w:r>
         <w:rPr>
@@ -2555,55 +2257,7 @@
           <w:sz w:val="24"/>
           <w:szCs w:val="24"/>
         </w:rPr>
-        <w:t>Leveraging supervised learning for functionally informed fine-mapping of cis-</w:t>
-      </w:r>
-      <w:proofErr w:type="spellStart"/>
-      <w:r>
-        <w:rPr>
-          <w:rFonts w:ascii="Times New Roman" w:hAnsi="Times New Roman" w:cs="Times New Roman"/>
-          <w:bCs/>
-          <w:i/>
-          <w:iCs/>
-          <w:sz w:val="24"/>
-          <w:szCs w:val="24"/>
-        </w:rPr>
-        <w:t>eQTLs</w:t>
-      </w:r>
-      <w:proofErr w:type="spellEnd"/>
-      <w:r>
-        <w:rPr>
-          <w:rFonts w:ascii="Times New Roman" w:hAnsi="Times New Roman" w:cs="Times New Roman"/>
-          <w:bCs/>
-          <w:i/>
-          <w:iCs/>
-          <w:sz w:val="24"/>
-          <w:szCs w:val="24"/>
-        </w:rPr>
-        <w:t xml:space="preserve"> identifies an additional 20,913 putative causal </w:t>
-      </w:r>
-      <w:proofErr w:type="spellStart"/>
-      <w:r>
-        <w:rPr>
-          <w:rFonts w:ascii="Times New Roman" w:hAnsi="Times New Roman" w:cs="Times New Roman"/>
-          <w:bCs/>
-          <w:i/>
-          <w:iCs/>
-          <w:sz w:val="24"/>
-          <w:szCs w:val="24"/>
-        </w:rPr>
-        <w:t>eQTLs</w:t>
-      </w:r>
-      <w:proofErr w:type="spellEnd"/>
-      <w:r>
-        <w:rPr>
-          <w:rFonts w:ascii="Times New Roman" w:hAnsi="Times New Roman" w:cs="Times New Roman"/>
-          <w:bCs/>
-          <w:i/>
-          <w:iCs/>
-          <w:sz w:val="24"/>
-          <w:szCs w:val="24"/>
-        </w:rPr>
-        <w:t>. Nature Communications</w:t>
+        <w:t>Leveraging supervised learning for functionally informed fine-mapping of cis-eQTLs identifies an additional 20,913 putative causal eQTLs. Nature Communications</w:t>
       </w:r>
       <w:r>
         <w:rPr>
@@ -2613,6 +2267,15 @@
           <w:szCs w:val="24"/>
         </w:rPr>
         <w:t xml:space="preserve"> 2021</w:t>
+      </w:r>
+      <w:r>
+        <w:rPr>
+          <w:rFonts w:ascii="Times New Roman" w:hAnsi="Times New Roman" w:cs="Times New Roman"/>
+          <w:bCs/>
+          <w:sz w:val="24"/>
+          <w:szCs w:val="24"/>
+        </w:rPr>
+        <w:t xml:space="preserve"> Vol. 12 Issue 1, pp. 3394</w:t>
       </w:r>
     </w:p>
     <w:p>
@@ -2711,243 +2374,6 @@
           <w:szCs w:val="24"/>
         </w:rPr>
         <w:t>Rational Intelligence Seminar Series</w:t>
-      </w:r>
-      <w:r>
-        <w:rPr>
-          <w:rFonts w:ascii="Times New Roman" w:hAnsi="Times New Roman" w:cs="Times New Roman"/>
-          <w:sz w:val="24"/>
-          <w:szCs w:val="24"/>
-        </w:rPr>
-        <w:t xml:space="preserve"> [</w:t>
-      </w:r>
-      <w:hyperlink r:id="rId13" w:history="1">
-        <w:r>
-          <w:rPr>
-            <w:rStyle w:val="Hyperlink"/>
-            <w:rFonts w:ascii="Times New Roman" w:hAnsi="Times New Roman" w:cs="Times New Roman"/>
-            <w:sz w:val="24"/>
-            <w:szCs w:val="24"/>
-          </w:rPr>
-          <w:t>YouTube</w:t>
-        </w:r>
-      </w:hyperlink>
-      <w:r>
-        <w:rPr>
-          <w:rFonts w:ascii="Times New Roman" w:hAnsi="Times New Roman" w:cs="Times New Roman"/>
-          <w:sz w:val="24"/>
-          <w:szCs w:val="24"/>
-        </w:rPr>
-        <w:t>]</w:t>
-      </w:r>
-      <w:r>
-        <w:rPr>
-          <w:rFonts w:ascii="Times New Roman" w:hAnsi="Times New Roman" w:cs="Times New Roman"/>
-          <w:sz w:val="24"/>
-          <w:szCs w:val="24"/>
-        </w:rPr>
-        <w:tab/>
-      </w:r>
-      <w:r>
-        <w:rPr>
-          <w:rFonts w:ascii="Times New Roman" w:hAnsi="Times New Roman" w:cs="Times New Roman"/>
-          <w:sz w:val="24"/>
-          <w:szCs w:val="24"/>
-        </w:rPr>
-        <w:t>2026</w:t>
-      </w:r>
-    </w:p>
-    <w:p>
-      <w:pPr>
-        <w:tabs>
-          <w:tab w:val="right" w:pos="9360"/>
-        </w:tabs>
-        <w:autoSpaceDE w:val="0"/>
-        <w:autoSpaceDN w:val="0"/>
-        <w:adjustRightInd w:val="0"/>
-        <w:spacing w:after="0" w:line="240" w:lineRule="auto"/>
-        <w:rPr>
-          <w:rFonts w:ascii="Times New Roman" w:hAnsi="Times New Roman" w:cs="Times New Roman"/>
-          <w:sz w:val="24"/>
-          <w:szCs w:val="24"/>
-        </w:rPr>
-      </w:pPr>
-      <w:r>
-        <w:rPr>
-          <w:rFonts w:ascii="Times New Roman" w:hAnsi="Times New Roman" w:cs="Times New Roman"/>
-          <w:sz w:val="24"/>
-          <w:szCs w:val="24"/>
-        </w:rPr>
-        <w:t xml:space="preserve">MIT, Algorithms Coffee                                                                                                           </w:t>
-      </w:r>
-      <w:r>
-        <w:rPr>
-          <w:rFonts w:ascii="Times New Roman" w:hAnsi="Times New Roman" w:cs="Times New Roman"/>
-          <w:sz w:val="24"/>
-          <w:szCs w:val="24"/>
-        </w:rPr>
-        <w:tab/>
-        <w:t>2026</w:t>
-      </w:r>
-    </w:p>
-    <w:p>
-      <w:pPr>
-        <w:tabs>
-          <w:tab w:val="right" w:pos="9360"/>
-        </w:tabs>
-        <w:autoSpaceDE w:val="0"/>
-        <w:autoSpaceDN w:val="0"/>
-        <w:adjustRightInd w:val="0"/>
-        <w:spacing w:after="0" w:line="240" w:lineRule="auto"/>
-        <w:rPr>
-          <w:rFonts w:ascii="Times New Roman" w:hAnsi="Times New Roman" w:cs="Times New Roman"/>
-          <w:sz w:val="24"/>
-          <w:szCs w:val="24"/>
-        </w:rPr>
-      </w:pPr>
-    </w:p>
-    <w:p>
-      <w:pPr>
-        <w:tabs>
-          <w:tab w:val="right" w:pos="9360"/>
-        </w:tabs>
-        <w:autoSpaceDE w:val="0"/>
-        <w:autoSpaceDN w:val="0"/>
-        <w:adjustRightInd w:val="0"/>
-        <w:spacing w:after="0" w:line="240" w:lineRule="auto"/>
-        <w:rPr>
-          <w:rFonts w:ascii="Times New Roman" w:hAnsi="Times New Roman" w:cs="Times New Roman"/>
-          <w:b/>
-          <w:bCs/>
-          <w:sz w:val="24"/>
-          <w:szCs w:val="24"/>
-        </w:rPr>
-      </w:pPr>
-      <w:r>
-        <w:rPr>
-          <w:rFonts w:ascii="Times New Roman" w:hAnsi="Times New Roman" w:cs="Times New Roman"/>
-          <w:b/>
-          <w:bCs/>
-          <w:sz w:val="24"/>
-          <w:szCs w:val="24"/>
-        </w:rPr>
-        <w:t>Evaluating multiple models using labeled and unlabeled data</w:t>
-      </w:r>
-    </w:p>
-    <w:p>
-      <w:pPr>
-        <w:tabs>
-          <w:tab w:val="right" w:pos="9360"/>
-        </w:tabs>
-        <w:autoSpaceDE w:val="0"/>
-        <w:autoSpaceDN w:val="0"/>
-        <w:adjustRightInd w:val="0"/>
-        <w:spacing w:after="0" w:line="240" w:lineRule="auto"/>
-        <w:rPr>
-          <w:rFonts w:ascii="Times New Roman" w:hAnsi="Times New Roman" w:cs="Times New Roman"/>
-          <w:sz w:val="24"/>
-          <w:szCs w:val="24"/>
-        </w:rPr>
-      </w:pPr>
-      <w:r>
-        <w:rPr>
-          <w:rFonts w:ascii="Times New Roman" w:hAnsi="Times New Roman" w:cs="Times New Roman"/>
-          <w:sz w:val="24"/>
-          <w:szCs w:val="24"/>
-        </w:rPr>
-        <w:t>MIT, Machine Learning Tea</w:t>
-      </w:r>
-      <w:r>
-        <w:rPr>
-          <w:rFonts w:ascii="Times New Roman" w:hAnsi="Times New Roman" w:cs="Times New Roman"/>
-          <w:sz w:val="24"/>
-          <w:szCs w:val="24"/>
-        </w:rPr>
-        <w:tab/>
-        <w:t>2025</w:t>
-      </w:r>
-    </w:p>
-    <w:p>
-      <w:pPr>
-        <w:tabs>
-          <w:tab w:val="right" w:pos="9360"/>
-        </w:tabs>
-        <w:autoSpaceDE w:val="0"/>
-        <w:autoSpaceDN w:val="0"/>
-        <w:adjustRightInd w:val="0"/>
-        <w:spacing w:after="0" w:line="240" w:lineRule="auto"/>
-        <w:rPr>
-          <w:rFonts w:ascii="Times New Roman" w:hAnsi="Times New Roman" w:cs="Times New Roman"/>
-          <w:sz w:val="24"/>
-          <w:szCs w:val="24"/>
-        </w:rPr>
-      </w:pPr>
-    </w:p>
-    <w:p>
-      <w:pPr>
-        <w:tabs>
-          <w:tab w:val="right" w:pos="9360"/>
-        </w:tabs>
-        <w:autoSpaceDE w:val="0"/>
-        <w:autoSpaceDN w:val="0"/>
-        <w:adjustRightInd w:val="0"/>
-        <w:spacing w:after="0" w:line="240" w:lineRule="auto"/>
-        <w:rPr>
-          <w:rFonts w:ascii="Times New Roman" w:hAnsi="Times New Roman" w:cs="Times New Roman"/>
-          <w:sz w:val="24"/>
-          <w:szCs w:val="24"/>
-        </w:rPr>
-      </w:pPr>
-      <w:r>
-        <w:rPr>
-          <w:rFonts w:ascii="Times New Roman" w:hAnsi="Times New Roman" w:cs="Times New Roman"/>
-          <w:b/>
-          <w:bCs/>
-          <w:sz w:val="24"/>
-          <w:szCs w:val="24"/>
-        </w:rPr>
-        <w:t>Assessing transcriptomic reidentification risks</w:t>
-      </w:r>
-      <w:r>
-        <w:rPr>
-          <w:rFonts w:ascii="Times New Roman" w:hAnsi="Times New Roman" w:cs="Times New Roman"/>
-          <w:b/>
-          <w:bCs/>
-          <w:sz w:val="24"/>
-          <w:szCs w:val="24"/>
-        </w:rPr>
-        <w:tab/>
-      </w:r>
-    </w:p>
-    <w:p>
-      <w:pPr>
-        <w:tabs>
-          <w:tab w:val="right" w:pos="9360"/>
-        </w:tabs>
-        <w:autoSpaceDE w:val="0"/>
-        <w:autoSpaceDN w:val="0"/>
-        <w:adjustRightInd w:val="0"/>
-        <w:spacing w:after="0" w:line="240" w:lineRule="auto"/>
-        <w:rPr>
-          <w:rFonts w:ascii="Times New Roman" w:hAnsi="Times New Roman" w:cs="Times New Roman"/>
-          <w:sz w:val="24"/>
-          <w:szCs w:val="24"/>
-        </w:rPr>
-      </w:pPr>
-      <w:r>
-        <w:rPr>
-          <w:rFonts w:ascii="Times New Roman" w:hAnsi="Times New Roman" w:cs="Times New Roman"/>
-          <w:sz w:val="24"/>
-          <w:szCs w:val="24"/>
-        </w:rPr>
-        <w:t>RECOMB</w:t>
-      </w:r>
-      <w:r>
-        <w:rPr>
-          <w:rFonts w:ascii="Times New Roman" w:hAnsi="Times New Roman" w:cs="Times New Roman"/>
-          <w:sz w:val="24"/>
-          <w:szCs w:val="24"/>
-        </w:rPr>
-        <w:t>, Oral Presentation</w:t>
       </w:r>
       <w:r>
         <w:rPr>
@@ -2983,6 +2409,243 @@
           <w:szCs w:val="24"/>
         </w:rPr>
         <w:tab/>
+      </w:r>
+      <w:r>
+        <w:rPr>
+          <w:rFonts w:ascii="Times New Roman" w:hAnsi="Times New Roman" w:cs="Times New Roman"/>
+          <w:sz w:val="24"/>
+          <w:szCs w:val="24"/>
+        </w:rPr>
+        <w:t>2026</w:t>
+      </w:r>
+    </w:p>
+    <w:p>
+      <w:pPr>
+        <w:tabs>
+          <w:tab w:val="right" w:pos="9360"/>
+        </w:tabs>
+        <w:autoSpaceDE w:val="0"/>
+        <w:autoSpaceDN w:val="0"/>
+        <w:adjustRightInd w:val="0"/>
+        <w:spacing w:after="0" w:line="240" w:lineRule="auto"/>
+        <w:rPr>
+          <w:rFonts w:ascii="Times New Roman" w:hAnsi="Times New Roman" w:cs="Times New Roman"/>
+          <w:sz w:val="24"/>
+          <w:szCs w:val="24"/>
+        </w:rPr>
+      </w:pPr>
+      <w:r>
+        <w:rPr>
+          <w:rFonts w:ascii="Times New Roman" w:hAnsi="Times New Roman" w:cs="Times New Roman"/>
+          <w:sz w:val="24"/>
+          <w:szCs w:val="24"/>
+        </w:rPr>
+        <w:t xml:space="preserve">MIT, Algorithms Coffee                                                                                                           </w:t>
+      </w:r>
+      <w:r>
+        <w:rPr>
+          <w:rFonts w:ascii="Times New Roman" w:hAnsi="Times New Roman" w:cs="Times New Roman"/>
+          <w:sz w:val="24"/>
+          <w:szCs w:val="24"/>
+        </w:rPr>
+        <w:tab/>
+        <w:t>2026</w:t>
+      </w:r>
+    </w:p>
+    <w:p>
+      <w:pPr>
+        <w:tabs>
+          <w:tab w:val="right" w:pos="9360"/>
+        </w:tabs>
+        <w:autoSpaceDE w:val="0"/>
+        <w:autoSpaceDN w:val="0"/>
+        <w:adjustRightInd w:val="0"/>
+        <w:spacing w:after="0" w:line="240" w:lineRule="auto"/>
+        <w:rPr>
+          <w:rFonts w:ascii="Times New Roman" w:hAnsi="Times New Roman" w:cs="Times New Roman"/>
+          <w:sz w:val="24"/>
+          <w:szCs w:val="24"/>
+        </w:rPr>
+      </w:pPr>
+    </w:p>
+    <w:p>
+      <w:pPr>
+        <w:tabs>
+          <w:tab w:val="right" w:pos="9360"/>
+        </w:tabs>
+        <w:autoSpaceDE w:val="0"/>
+        <w:autoSpaceDN w:val="0"/>
+        <w:adjustRightInd w:val="0"/>
+        <w:spacing w:after="0" w:line="240" w:lineRule="auto"/>
+        <w:rPr>
+          <w:rFonts w:ascii="Times New Roman" w:hAnsi="Times New Roman" w:cs="Times New Roman"/>
+          <w:b/>
+          <w:bCs/>
+          <w:sz w:val="24"/>
+          <w:szCs w:val="24"/>
+        </w:rPr>
+      </w:pPr>
+      <w:r>
+        <w:rPr>
+          <w:rFonts w:ascii="Times New Roman" w:hAnsi="Times New Roman" w:cs="Times New Roman"/>
+          <w:b/>
+          <w:bCs/>
+          <w:sz w:val="24"/>
+          <w:szCs w:val="24"/>
+        </w:rPr>
+        <w:t>Evaluating multiple models using labeled and unlabeled data</w:t>
+      </w:r>
+    </w:p>
+    <w:p>
+      <w:pPr>
+        <w:tabs>
+          <w:tab w:val="right" w:pos="9360"/>
+        </w:tabs>
+        <w:autoSpaceDE w:val="0"/>
+        <w:autoSpaceDN w:val="0"/>
+        <w:adjustRightInd w:val="0"/>
+        <w:spacing w:after="0" w:line="240" w:lineRule="auto"/>
+        <w:rPr>
+          <w:rFonts w:ascii="Times New Roman" w:hAnsi="Times New Roman" w:cs="Times New Roman"/>
+          <w:sz w:val="24"/>
+          <w:szCs w:val="24"/>
+        </w:rPr>
+      </w:pPr>
+      <w:r>
+        <w:rPr>
+          <w:rFonts w:ascii="Times New Roman" w:hAnsi="Times New Roman" w:cs="Times New Roman"/>
+          <w:sz w:val="24"/>
+          <w:szCs w:val="24"/>
+        </w:rPr>
+        <w:t>MIT, Machine Learning Tea</w:t>
+      </w:r>
+      <w:r>
+        <w:rPr>
+          <w:rFonts w:ascii="Times New Roman" w:hAnsi="Times New Roman" w:cs="Times New Roman"/>
+          <w:sz w:val="24"/>
+          <w:szCs w:val="24"/>
+        </w:rPr>
+        <w:tab/>
+        <w:t>2025</w:t>
+      </w:r>
+    </w:p>
+    <w:p>
+      <w:pPr>
+        <w:tabs>
+          <w:tab w:val="right" w:pos="9360"/>
+        </w:tabs>
+        <w:autoSpaceDE w:val="0"/>
+        <w:autoSpaceDN w:val="0"/>
+        <w:adjustRightInd w:val="0"/>
+        <w:spacing w:after="0" w:line="240" w:lineRule="auto"/>
+        <w:rPr>
+          <w:rFonts w:ascii="Times New Roman" w:hAnsi="Times New Roman" w:cs="Times New Roman"/>
+          <w:sz w:val="24"/>
+          <w:szCs w:val="24"/>
+        </w:rPr>
+      </w:pPr>
+    </w:p>
+    <w:p>
+      <w:pPr>
+        <w:tabs>
+          <w:tab w:val="right" w:pos="9360"/>
+        </w:tabs>
+        <w:autoSpaceDE w:val="0"/>
+        <w:autoSpaceDN w:val="0"/>
+        <w:adjustRightInd w:val="0"/>
+        <w:spacing w:after="0" w:line="240" w:lineRule="auto"/>
+        <w:rPr>
+          <w:rFonts w:ascii="Times New Roman" w:hAnsi="Times New Roman" w:cs="Times New Roman"/>
+          <w:sz w:val="24"/>
+          <w:szCs w:val="24"/>
+        </w:rPr>
+      </w:pPr>
+      <w:r>
+        <w:rPr>
+          <w:rFonts w:ascii="Times New Roman" w:hAnsi="Times New Roman" w:cs="Times New Roman"/>
+          <w:b/>
+          <w:bCs/>
+          <w:sz w:val="24"/>
+          <w:szCs w:val="24"/>
+        </w:rPr>
+        <w:t>Assessing transcriptomic reidentification risks</w:t>
+      </w:r>
+      <w:r>
+        <w:rPr>
+          <w:rFonts w:ascii="Times New Roman" w:hAnsi="Times New Roman" w:cs="Times New Roman"/>
+          <w:b/>
+          <w:bCs/>
+          <w:sz w:val="24"/>
+          <w:szCs w:val="24"/>
+        </w:rPr>
+        <w:tab/>
+      </w:r>
+    </w:p>
+    <w:p>
+      <w:pPr>
+        <w:tabs>
+          <w:tab w:val="right" w:pos="9360"/>
+        </w:tabs>
+        <w:autoSpaceDE w:val="0"/>
+        <w:autoSpaceDN w:val="0"/>
+        <w:adjustRightInd w:val="0"/>
+        <w:spacing w:after="0" w:line="240" w:lineRule="auto"/>
+        <w:rPr>
+          <w:rFonts w:ascii="Times New Roman" w:hAnsi="Times New Roman" w:cs="Times New Roman"/>
+          <w:sz w:val="24"/>
+          <w:szCs w:val="24"/>
+        </w:rPr>
+      </w:pPr>
+      <w:r>
+        <w:rPr>
+          <w:rFonts w:ascii="Times New Roman" w:hAnsi="Times New Roman" w:cs="Times New Roman"/>
+          <w:sz w:val="24"/>
+          <w:szCs w:val="24"/>
+        </w:rPr>
+        <w:t>RECOMB</w:t>
+      </w:r>
+      <w:r>
+        <w:rPr>
+          <w:rFonts w:ascii="Times New Roman" w:hAnsi="Times New Roman" w:cs="Times New Roman"/>
+          <w:sz w:val="24"/>
+          <w:szCs w:val="24"/>
+        </w:rPr>
+        <w:t>, Oral Presentation</w:t>
+      </w:r>
+      <w:r>
+        <w:rPr>
+          <w:rFonts w:ascii="Times New Roman" w:hAnsi="Times New Roman" w:cs="Times New Roman"/>
+          <w:sz w:val="24"/>
+          <w:szCs w:val="24"/>
+        </w:rPr>
+        <w:t xml:space="preserve"> [</w:t>
+      </w:r>
+      <w:hyperlink r:id="rId15" w:history="1">
+        <w:r>
+          <w:rPr>
+            <w:rStyle w:val="Hyperlink"/>
+            <w:rFonts w:ascii="Times New Roman" w:hAnsi="Times New Roman" w:cs="Times New Roman"/>
+            <w:sz w:val="24"/>
+            <w:szCs w:val="24"/>
+          </w:rPr>
+          <w:t>YouTube</w:t>
+        </w:r>
+      </w:hyperlink>
+      <w:r>
+        <w:rPr>
+          <w:rFonts w:ascii="Times New Roman" w:hAnsi="Times New Roman" w:cs="Times New Roman"/>
+          <w:sz w:val="24"/>
+          <w:szCs w:val="24"/>
+        </w:rPr>
+        <w:t>]</w:t>
+      </w:r>
+      <w:r>
+        <w:rPr>
+          <w:rFonts w:ascii="Times New Roman" w:hAnsi="Times New Roman" w:cs="Times New Roman"/>
+          <w:sz w:val="24"/>
+          <w:szCs w:val="24"/>
+        </w:rPr>
+        <w:tab/>
         <w:t>202</w:t>
       </w:r>
       <w:r>
@@ -3555,6 +3218,122 @@
           <w:szCs w:val="24"/>
         </w:rPr>
       </w:pPr>
+      <w:r>
+        <w:rPr>
+          <w:rFonts w:ascii="Times New Roman" w:hAnsi="Times New Roman" w:cs="Times New Roman"/>
+          <w:b/>
+          <w:sz w:val="24"/>
+          <w:szCs w:val="24"/>
+        </w:rPr>
+        <w:t>REVIEWING AND SERVICE</w:t>
+      </w:r>
+      <w:r>
+        <w:rPr>
+          <w:rFonts w:ascii="Times New Roman" w:hAnsi="Times New Roman" w:cs="Times New Roman"/>
+          <w:b/>
+          <w:sz w:val="24"/>
+          <w:szCs w:val="24"/>
+        </w:rPr>
+        <w:tab/>
+      </w:r>
+    </w:p>
+    <w:p>
+      <w:pPr>
+        <w:tabs>
+          <w:tab w:val="right" w:pos="9360"/>
+        </w:tabs>
+        <w:autoSpaceDE w:val="0"/>
+        <w:autoSpaceDN w:val="0"/>
+        <w:adjustRightInd w:val="0"/>
+        <w:spacing w:after="0" w:line="240" w:lineRule="auto"/>
+        <w:rPr>
+          <w:rFonts w:ascii="Times New Roman" w:hAnsi="Times New Roman" w:cs="Times New Roman"/>
+          <w:sz w:val="24"/>
+          <w:szCs w:val="24"/>
+        </w:rPr>
+      </w:pPr>
+      <w:r>
+        <w:rPr>
+          <w:rFonts w:ascii="Times New Roman" w:hAnsi="Times New Roman" w:cs="Times New Roman"/>
+          <w:sz w:val="24"/>
+          <w:szCs w:val="24"/>
+        </w:rPr>
+        <w:t>Roundtable Chair, ML4H 2024</w:t>
+      </w:r>
+      <w:r>
+        <w:rPr>
+          <w:rFonts w:ascii="Times New Roman" w:hAnsi="Times New Roman" w:cs="Times New Roman"/>
+          <w:sz w:val="24"/>
+          <w:szCs w:val="24"/>
+        </w:rPr>
+        <w:t>, 2025</w:t>
+      </w:r>
+      <w:r>
+        <w:rPr>
+          <w:rFonts w:ascii="Times New Roman" w:hAnsi="Times New Roman" w:cs="Times New Roman"/>
+          <w:sz w:val="24"/>
+          <w:szCs w:val="24"/>
+        </w:rPr>
+        <w:tab/>
+        <w:t>2024</w:t>
+      </w:r>
+      <w:r>
+        <w:rPr>
+          <w:rFonts w:ascii="Times New Roman" w:hAnsi="Times New Roman" w:cs="Times New Roman"/>
+          <w:sz w:val="24"/>
+          <w:szCs w:val="24"/>
+        </w:rPr>
+        <w:t>, 2025</w:t>
+      </w:r>
+    </w:p>
+    <w:p>
+      <w:pPr>
+        <w:tabs>
+          <w:tab w:val="right" w:pos="9360"/>
+        </w:tabs>
+        <w:autoSpaceDE w:val="0"/>
+        <w:autoSpaceDN w:val="0"/>
+        <w:adjustRightInd w:val="0"/>
+        <w:spacing w:after="0" w:line="240" w:lineRule="auto"/>
+        <w:rPr>
+          <w:rFonts w:ascii="Times New Roman" w:hAnsi="Times New Roman" w:cs="Times New Roman"/>
+          <w:sz w:val="24"/>
+          <w:szCs w:val="24"/>
+        </w:rPr>
+      </w:pPr>
+      <w:r>
+        <w:rPr>
+          <w:rFonts w:ascii="Times New Roman" w:hAnsi="Times New Roman" w:cs="Times New Roman"/>
+          <w:sz w:val="24"/>
+          <w:szCs w:val="24"/>
+        </w:rPr>
+        <w:t>Member, NIST AI Safety Institute Task Force on Red Teaming                                              2024</w:t>
+      </w:r>
+    </w:p>
+    <w:p>
+      <w:pPr>
+        <w:tabs>
+          <w:tab w:val="right" w:pos="9360"/>
+        </w:tabs>
+        <w:autoSpaceDE w:val="0"/>
+        <w:autoSpaceDN w:val="0"/>
+        <w:adjustRightInd w:val="0"/>
+        <w:spacing w:after="0" w:line="240" w:lineRule="auto"/>
+        <w:jc w:val="center"/>
+        <w:rPr>
+          <w:rFonts w:ascii="Times New Roman" w:hAnsi="Times New Roman" w:cs="Times New Roman"/>
+          <w:sz w:val="24"/>
+          <w:szCs w:val="24"/>
+        </w:rPr>
+      </w:pPr>
+      <w:r>
+        <w:rPr>
+          <w:rFonts w:ascii="Times New Roman" w:hAnsi="Times New Roman" w:cs="Times New Roman"/>
+          <w:sz w:val="24"/>
+          <w:szCs w:val="24"/>
+        </w:rPr>
+        <w:t>Planning Committee, Hertz Foundation Summer Workshop                                                    2023</w:t>
+      </w:r>
     </w:p>
     <w:p>
       <w:pPr>
@@ -3564,11 +3343,44 @@
         <w:spacing w:after="60"/>
         <w:rPr>
           <w:rFonts w:ascii="Times New Roman" w:hAnsi="Times New Roman" w:cs="Times New Roman"/>
-          <w:b/>
-          <w:sz w:val="24"/>
-          <w:szCs w:val="24"/>
-        </w:rPr>
-      </w:pPr>
+          <w:sz w:val="24"/>
+          <w:szCs w:val="24"/>
+        </w:rPr>
+      </w:pPr>
+      <w:r>
+        <w:rPr>
+          <w:rFonts w:ascii="Times New Roman" w:hAnsi="Times New Roman" w:cs="Times New Roman"/>
+          <w:sz w:val="24"/>
+          <w:szCs w:val="24"/>
+        </w:rPr>
+        <w:t xml:space="preserve">Reviewing: NeurIPS, </w:t>
+      </w:r>
+      <w:r>
+        <w:rPr>
+          <w:rFonts w:ascii="Times New Roman" w:hAnsi="Times New Roman" w:cs="Times New Roman"/>
+          <w:sz w:val="24"/>
+          <w:szCs w:val="24"/>
+        </w:rPr>
+        <w:t xml:space="preserve">ICML, </w:t>
+      </w:r>
+      <w:r>
+        <w:rPr>
+          <w:rFonts w:ascii="Times New Roman" w:hAnsi="Times New Roman" w:cs="Times New Roman"/>
+          <w:sz w:val="24"/>
+          <w:szCs w:val="24"/>
+        </w:rPr>
+        <w:t xml:space="preserve">ICLR, Journal of Computational Biology, </w:t>
+      </w:r>
+      <w:r>
+        <w:rPr>
+          <w:rFonts w:ascii="Times New Roman" w:hAnsi="Times New Roman" w:cs="Times New Roman"/>
+          <w:i/>
+          <w:iCs/>
+          <w:sz w:val="24"/>
+          <w:szCs w:val="24"/>
+        </w:rPr>
+        <w:t>PNAS</w:t>
+      </w:r>
     </w:p>
     <w:p>
       <w:pPr>
@@ -3591,215 +3403,6 @@
           <w:szCs w:val="24"/>
         </w:rPr>
         <w:lastRenderedPageBreak/>
-        <w:t>REVIEWING AND SERVICE</w:t>
-      </w:r>
-      <w:r>
-        <w:rPr>
-          <w:rFonts w:ascii="Times New Roman" w:hAnsi="Times New Roman" w:cs="Times New Roman"/>
-          <w:b/>
-          <w:sz w:val="24"/>
-          <w:szCs w:val="24"/>
-        </w:rPr>
-        <w:tab/>
-      </w:r>
-    </w:p>
-    <w:p>
-      <w:pPr>
-        <w:tabs>
-          <w:tab w:val="right" w:pos="9360"/>
-        </w:tabs>
-        <w:autoSpaceDE w:val="0"/>
-        <w:autoSpaceDN w:val="0"/>
-        <w:adjustRightInd w:val="0"/>
-        <w:spacing w:after="0" w:line="240" w:lineRule="auto"/>
-        <w:rPr>
-          <w:rFonts w:ascii="Times New Roman" w:hAnsi="Times New Roman" w:cs="Times New Roman"/>
-          <w:sz w:val="24"/>
-          <w:szCs w:val="24"/>
-        </w:rPr>
-      </w:pPr>
-      <w:r>
-        <w:rPr>
-          <w:rFonts w:ascii="Times New Roman" w:hAnsi="Times New Roman" w:cs="Times New Roman"/>
-          <w:sz w:val="24"/>
-          <w:szCs w:val="24"/>
-        </w:rPr>
-        <w:t>Roundtable Chair, ML4H 2024</w:t>
-      </w:r>
-      <w:r>
-        <w:rPr>
-          <w:rFonts w:ascii="Times New Roman" w:hAnsi="Times New Roman" w:cs="Times New Roman"/>
-          <w:sz w:val="24"/>
-          <w:szCs w:val="24"/>
-        </w:rPr>
-        <w:t>, 2025</w:t>
-      </w:r>
-      <w:r>
-        <w:rPr>
-          <w:rFonts w:ascii="Times New Roman" w:hAnsi="Times New Roman" w:cs="Times New Roman"/>
-          <w:sz w:val="24"/>
-          <w:szCs w:val="24"/>
-        </w:rPr>
-        <w:tab/>
-        <w:t>2024</w:t>
-      </w:r>
-      <w:r>
-        <w:rPr>
-          <w:rFonts w:ascii="Times New Roman" w:hAnsi="Times New Roman" w:cs="Times New Roman"/>
-          <w:sz w:val="24"/>
-          <w:szCs w:val="24"/>
-        </w:rPr>
-        <w:t>, 2025</w:t>
-      </w:r>
-    </w:p>
-    <w:p>
-      <w:pPr>
-        <w:tabs>
-          <w:tab w:val="right" w:pos="9360"/>
-        </w:tabs>
-        <w:autoSpaceDE w:val="0"/>
-        <w:autoSpaceDN w:val="0"/>
-        <w:adjustRightInd w:val="0"/>
-        <w:spacing w:after="0" w:line="240" w:lineRule="auto"/>
-        <w:rPr>
-          <w:rFonts w:ascii="Times New Roman" w:hAnsi="Times New Roman" w:cs="Times New Roman"/>
-          <w:sz w:val="24"/>
-          <w:szCs w:val="24"/>
-        </w:rPr>
-      </w:pPr>
-      <w:r>
-        <w:rPr>
-          <w:rFonts w:ascii="Times New Roman" w:hAnsi="Times New Roman" w:cs="Times New Roman"/>
-          <w:sz w:val="24"/>
-          <w:szCs w:val="24"/>
-        </w:rPr>
-        <w:t>Member, NIST AI Safety Institute Task Force on Red Teaming                                              2024</w:t>
-      </w:r>
-    </w:p>
-    <w:p>
-      <w:pPr>
-        <w:tabs>
-          <w:tab w:val="right" w:pos="9360"/>
-        </w:tabs>
-        <w:autoSpaceDE w:val="0"/>
-        <w:autoSpaceDN w:val="0"/>
-        <w:adjustRightInd w:val="0"/>
-        <w:spacing w:after="0" w:line="240" w:lineRule="auto"/>
-        <w:jc w:val="center"/>
-        <w:rPr>
-          <w:rFonts w:ascii="Times New Roman" w:hAnsi="Times New Roman" w:cs="Times New Roman"/>
-          <w:sz w:val="24"/>
-          <w:szCs w:val="24"/>
-        </w:rPr>
-      </w:pPr>
-      <w:r>
-        <w:rPr>
-          <w:rFonts w:ascii="Times New Roman" w:hAnsi="Times New Roman" w:cs="Times New Roman"/>
-          <w:sz w:val="24"/>
-          <w:szCs w:val="24"/>
-        </w:rPr>
-        <w:t>Planning Committee, Hertz Foundation Summer Workshop                                                    2023</w:t>
-      </w:r>
-    </w:p>
-    <w:p>
-      <w:pPr>
-        <w:pBdr>
-          <w:bottom w:val="single" w:sz="4" w:space="1" w:color="auto"/>
-        </w:pBdr>
-        <w:spacing w:after="60"/>
-        <w:rPr>
-          <w:rFonts w:ascii="Times New Roman" w:hAnsi="Times New Roman" w:cs="Times New Roman"/>
-          <w:sz w:val="24"/>
-          <w:szCs w:val="24"/>
-        </w:rPr>
-      </w:pPr>
-      <w:r>
-        <w:rPr>
-          <w:rFonts w:ascii="Times New Roman" w:hAnsi="Times New Roman" w:cs="Times New Roman"/>
-          <w:sz w:val="24"/>
-          <w:szCs w:val="24"/>
-        </w:rPr>
-        <w:t xml:space="preserve">Reviewing: </w:t>
-      </w:r>
-      <w:proofErr w:type="spellStart"/>
-      <w:r>
-        <w:rPr>
-          <w:rFonts w:ascii="Times New Roman" w:hAnsi="Times New Roman" w:cs="Times New Roman"/>
-          <w:sz w:val="24"/>
-          <w:szCs w:val="24"/>
-        </w:rPr>
-        <w:t>NeurIPS</w:t>
-      </w:r>
-      <w:proofErr w:type="spellEnd"/>
-      <w:r>
-        <w:rPr>
-          <w:rFonts w:ascii="Times New Roman" w:hAnsi="Times New Roman" w:cs="Times New Roman"/>
-          <w:sz w:val="24"/>
-          <w:szCs w:val="24"/>
-        </w:rPr>
-        <w:t xml:space="preserve">, </w:t>
-      </w:r>
-      <w:r>
-        <w:rPr>
-          <w:rFonts w:ascii="Times New Roman" w:hAnsi="Times New Roman" w:cs="Times New Roman"/>
-          <w:sz w:val="24"/>
-          <w:szCs w:val="24"/>
-        </w:rPr>
-        <w:t xml:space="preserve">ICML, </w:t>
-      </w:r>
-      <w:r>
-        <w:rPr>
-          <w:rFonts w:ascii="Times New Roman" w:hAnsi="Times New Roman" w:cs="Times New Roman"/>
-          <w:sz w:val="24"/>
-          <w:szCs w:val="24"/>
-        </w:rPr>
-        <w:t xml:space="preserve">ICLR, Journal of Computational Biology, </w:t>
-      </w:r>
-      <w:r>
-        <w:rPr>
-          <w:rFonts w:ascii="Times New Roman" w:hAnsi="Times New Roman" w:cs="Times New Roman"/>
-          <w:i/>
-          <w:iCs/>
-          <w:sz w:val="24"/>
-          <w:szCs w:val="24"/>
-        </w:rPr>
-        <w:t>PNAS</w:t>
-      </w:r>
-    </w:p>
-    <w:p>
-      <w:pPr>
-        <w:pBdr>
-          <w:bottom w:val="single" w:sz="4" w:space="1" w:color="auto"/>
-        </w:pBdr>
-        <w:spacing w:after="60"/>
-        <w:rPr>
-          <w:rFonts w:ascii="Times New Roman" w:hAnsi="Times New Roman" w:cs="Times New Roman"/>
-          <w:b/>
-          <w:sz w:val="24"/>
-          <w:szCs w:val="24"/>
-        </w:rPr>
-      </w:pPr>
-    </w:p>
-    <w:p>
-      <w:pPr>
-        <w:pBdr>
-          <w:bottom w:val="single" w:sz="4" w:space="1" w:color="auto"/>
-        </w:pBdr>
-        <w:spacing w:after="60"/>
-        <w:rPr>
-          <w:rFonts w:ascii="Times New Roman" w:hAnsi="Times New Roman" w:cs="Times New Roman"/>
-          <w:b/>
-          <w:sz w:val="24"/>
-          <w:szCs w:val="24"/>
-        </w:rPr>
-      </w:pPr>
-      <w:r>
-        <w:rPr>
-          <w:rFonts w:ascii="Times New Roman" w:hAnsi="Times New Roman" w:cs="Times New Roman"/>
-          <w:b/>
-          <w:sz w:val="24"/>
-          <w:szCs w:val="24"/>
-        </w:rPr>
         <w:t>LEADERSHIP &amp; OUTREACH</w:t>
       </w:r>
       <w:r>
@@ -4472,27 +4075,7 @@
           <w:sz w:val="24"/>
           <w:szCs w:val="24"/>
         </w:rPr>
-        <w:t xml:space="preserve">Mentors: </w:t>
-      </w:r>
-      <w:proofErr w:type="spellStart"/>
-      <w:r>
-        <w:rPr>
-          <w:rFonts w:ascii="Times New Roman" w:hAnsi="Times New Roman" w:cs="Times New Roman"/>
-          <w:bCs/>
-          <w:sz w:val="24"/>
-          <w:szCs w:val="24"/>
-        </w:rPr>
-        <w:t>Hanchen</w:t>
-      </w:r>
-      <w:proofErr w:type="spellEnd"/>
-      <w:r>
-        <w:rPr>
-          <w:rFonts w:ascii="Times New Roman" w:hAnsi="Times New Roman" w:cs="Times New Roman"/>
-          <w:bCs/>
-          <w:sz w:val="24"/>
-          <w:szCs w:val="24"/>
-        </w:rPr>
-        <w:t xml:space="preserve"> Wang, Aviv Regev</w:t>
+        <w:t>Mentors: Hanchen Wang, Aviv Regev</w:t>
       </w:r>
     </w:p>
     <w:p>
@@ -4737,7 +4320,7 @@
           <w:szCs w:val="24"/>
         </w:rPr>
       </w:pPr>
-      <w:hyperlink r:id="rId15" w:history="1">
+      <w:hyperlink r:id="rId16" w:history="1">
         <w:r>
           <w:rPr>
             <w:rStyle w:val="Hyperlink"/>
@@ -4774,23 +4357,13 @@
           <w:szCs w:val="24"/>
         </w:rPr>
       </w:pPr>
-      <w:proofErr w:type="spellStart"/>
-      <w:r>
-        <w:rPr>
-          <w:rFonts w:ascii="Times New Roman" w:hAnsi="Times New Roman" w:cs="Times New Roman"/>
-          <w:sz w:val="24"/>
-          <w:szCs w:val="24"/>
-        </w:rPr>
-        <w:t>Hanchen</w:t>
-      </w:r>
-      <w:proofErr w:type="spellEnd"/>
-      <w:r>
-        <w:rPr>
-          <w:rFonts w:ascii="Times New Roman" w:hAnsi="Times New Roman" w:cs="Times New Roman"/>
-          <w:sz w:val="24"/>
-          <w:szCs w:val="24"/>
-        </w:rPr>
-        <w:t xml:space="preserve"> Wang</w:t>
+      <w:r>
+        <w:rPr>
+          <w:rFonts w:ascii="Times New Roman" w:hAnsi="Times New Roman" w:cs="Times New Roman"/>
+          <w:sz w:val="24"/>
+          <w:szCs w:val="24"/>
+        </w:rPr>
+        <w:t>Hanchen Wang</w:t>
       </w:r>
     </w:p>
     <w:p>
@@ -4847,7 +4420,7 @@
           <w:szCs w:val="24"/>
         </w:rPr>
       </w:pPr>
-      <w:hyperlink r:id="rId16" w:history="1">
+      <w:hyperlink r:id="rId17" w:history="1">
         <w:r>
           <w:rPr>
             <w:rStyle w:val="Hyperlink"/>
@@ -4919,7 +4492,6 @@
           <w:sz w:val="24"/>
           <w:szCs w:val="24"/>
         </w:rPr>
-        <w:lastRenderedPageBreak/>
         <w:t>University of California, Berkeley</w:t>
       </w:r>
     </w:p>
@@ -4956,7 +4528,7 @@
           <w:szCs w:val="24"/>
         </w:rPr>
       </w:pPr>
-      <w:hyperlink r:id="rId17" w:history="1">
+      <w:hyperlink r:id="rId18" w:history="1">
         <w:r>
           <w:rPr>
             <w:rStyle w:val="Hyperlink"/>
@@ -5029,12 +4601,12 @@
       </w:pPr>
     </w:p>
     <w:sectPr>
-      <w:headerReference w:type="even" r:id="rId18"/>
-      <w:headerReference w:type="default" r:id="rId19"/>
-      <w:footerReference w:type="even" r:id="rId20"/>
-      <w:footerReference w:type="default" r:id="rId21"/>
-      <w:headerReference w:type="first" r:id="rId22"/>
-      <w:footerReference w:type="first" r:id="rId23"/>
+      <w:headerReference w:type="even" r:id="rId19"/>
+      <w:headerReference w:type="default" r:id="rId20"/>
+      <w:footerReference w:type="even" r:id="rId21"/>
+      <w:footerReference w:type="default" r:id="rId22"/>
+      <w:headerReference w:type="first" r:id="rId23"/>
+      <w:footerReference w:type="first" r:id="rId24"/>
       <w:pgSz w:w="12240" w:h="15840"/>
       <w:pgMar w:top="1440" w:right="1440" w:bottom="1440" w:left="1440" w:header="720" w:footer="720" w:gutter="0"/>
       <w:cols w:space="720"/>
@@ -5045,7 +4617,7 @@
 </file>
 
 <file path=word/endnotes.xml><?xml version="1.0" encoding="utf-8"?>
-<w:endnotes xmlns:wpc="http://schemas.microsoft.com/office/word/2010/wordprocessingCanvas" xmlns:cx="http://schemas.microsoft.com/office/drawing/2014/chartex" xmlns:cx1="http://schemas.microsoft.com/office/drawing/2015/9/8/chartex" xmlns:cx2="http://schemas.microsoft.com/office/drawing/2015/10/21/chartex" xmlns:cx3="http://schemas.microsoft.com/office/drawing/2016/5/9/chartex" xmlns:cx4="http://schemas.microsoft.com/office/drawing/2016/5/10/chartex" xmlns:cx5="http://schemas.microsoft.com/office/drawing/2016/5/11/chartex" xmlns:cx6="http://schemas.microsoft.com/office/drawing/2016/5/12/chartex" xmlns:cx7="http://schemas.microsoft.com/office/drawing/2016/5/13/chartex" xmlns:cx8="http://schemas.microsoft.com/office/drawing/2016/5/14/chartex" xmlns:mc="http://schemas.openxmlformats.org/markup-compatibility/2006" xmlns:m="http://schemas.openxmlformats.org/officeDocument/2006/math" xmlns:aink="http://schemas.microsoft.com/office/drawing/2016/ink" xmlns:am3d="http://schemas.microsoft.com/office/drawing/2017/model3d" xmlns:oel="http://schemas.microsoft.com/office/2019/extlst" xmlns:r="http://schemas.openxmlformats.org/officeDocument/2006/relationships" xmlns:wp14="http://schemas.microsoft.com/office/word/2010/wordprocessingDrawing" xmlns:wp="http://schemas.openxmlformats.org/drawingml/2006/wordprocessingDrawing" xmlns:wpg="http://schemas.microsoft.com/office/word/2010/wordprocessingGroup" xmlns:wpi="http://schemas.microsoft.com/office/word/2010/wordprocessingInk" xmlns:wps="http://schemas.microsoft.com/office/word/2010/wordprocessingShape" xmlns:o="urn:schemas-microsoft-com:office:office" xmlns:v="urn:schemas-microsoft-com:vml" xmlns:w10="urn:schemas-microsoft-com:office:word" xmlns:w="http://schemas.openxmlformats.org/wordprocessingml/2006/main" xmlns:w14="http://schemas.microsoft.com/office/word/2010/wordml" xmlns:w15="http://schemas.microsoft.com/office/word/2012/wordml" xmlns:w16cei="http://schemas.microsoft.com/office/word/2026/wordml/cei" xmlns:w16cex="http://schemas.microsoft.com/office/word/2018/wordml/cex" xmlns:w16cid="http://schemas.microsoft.com/office/word/2016/wordml/cid" xmlns:w16="http://schemas.microsoft.com/office/word/2018/wordml" xmlns:w16sdtdh="http://schemas.microsoft.com/office/word/2020/wordml/sdtdatahash" xmlns:w16sdtfl="http://schemas.microsoft.com/office/word/2024/wordml/sdtformatlock" xmlns:w16se="http://schemas.microsoft.com/office/word/2015/wordml/symex" xmlns:w16du="http://schemas.microsoft.com/office/word/2023/wordml/word16du" xmlns:wne="http://schemas.microsoft.com/office/word/2006/wordml" mc:Ignorable="w14 w15 w16se w16cid w16 w16cex w16sdtdh w16sdtfl w16du wp14">
+<w:endnotes xmlns:wpc="http://schemas.microsoft.com/office/word/2010/wordprocessingCanvas" xmlns:cx="http://schemas.microsoft.com/office/drawing/2014/chartex" xmlns:cx1="http://schemas.microsoft.com/office/drawing/2015/9/8/chartex" xmlns:cx2="http://schemas.microsoft.com/office/drawing/2015/10/21/chartex" xmlns:cx3="http://schemas.microsoft.com/office/drawing/2016/5/9/chartex" xmlns:cx4="http://schemas.microsoft.com/office/drawing/2016/5/10/chartex" xmlns:cx5="http://schemas.microsoft.com/office/drawing/2016/5/11/chartex" xmlns:cx6="http://schemas.microsoft.com/office/drawing/2016/5/12/chartex" xmlns:cx7="http://schemas.microsoft.com/office/drawing/2016/5/13/chartex" xmlns:cx8="http://schemas.microsoft.com/office/drawing/2016/5/14/chartex" xmlns:mc="http://schemas.openxmlformats.org/markup-compatibility/2006" xmlns:m="http://schemas.openxmlformats.org/officeDocument/2006/math" xmlns:aink="http://schemas.microsoft.com/office/drawing/2016/ink" xmlns:am3d="http://schemas.microsoft.com/office/drawing/2017/model3d" xmlns:oel="http://schemas.microsoft.com/office/2019/extlst" xmlns:r="http://schemas.openxmlformats.org/officeDocument/2006/relationships" xmlns:wp14="http://schemas.microsoft.com/office/word/2010/wordprocessingDrawing" xmlns:wp="http://schemas.openxmlformats.org/drawingml/2006/wordprocessingDrawing" xmlns:wpg="http://schemas.microsoft.com/office/word/2010/wordprocessingGroup" xmlns:wpi="http://schemas.microsoft.com/office/word/2010/wordprocessingInk" xmlns:wps="http://schemas.microsoft.com/office/word/2010/wordprocessingShape" xmlns:o="urn:schemas-microsoft-com:office:office" xmlns:v="urn:schemas-microsoft-com:vml" xmlns:w10="urn:schemas-microsoft-com:office:word" xmlns:w="http://schemas.openxmlformats.org/wordprocessingml/2006/main" xmlns:w14="http://schemas.microsoft.com/office/word/2010/wordml" xmlns:w15="http://schemas.microsoft.com/office/word/2012/wordml" xmlns:w16cex="http://schemas.microsoft.com/office/word/2018/wordml/cex" xmlns:w16cid="http://schemas.microsoft.com/office/word/2016/wordml/cid" xmlns:w16="http://schemas.microsoft.com/office/word/2018/wordml" xmlns:w16sdtdh="http://schemas.microsoft.com/office/word/2020/wordml/sdtdatahash" xmlns:w16sdtfl="http://schemas.microsoft.com/office/word/2024/wordml/sdtformatlock" xmlns:w16se="http://schemas.microsoft.com/office/word/2015/wordml/symex" xmlns:w16du="http://schemas.microsoft.com/office/word/2023/wordml/word16du" xmlns:wne="http://schemas.microsoft.com/office/word/2006/wordml" mc:Ignorable="w14 w15 w16se w16cid w16 w16cex w16sdtdh w16sdtfl w16du wp14">
   <w:endnote w:type="separator" w:id="-1">
     <w:p>
       <w:pPr>
@@ -5070,7 +4642,7 @@
 </file>
 
 <file path=word/footer1.xml><?xml version="1.0" encoding="utf-8"?>
-<w:ftr xmlns:wpc="http://schemas.microsoft.com/office/word/2010/wordprocessingCanvas" xmlns:cx="http://schemas.microsoft.com/office/drawing/2014/chartex" xmlns:cx1="http://schemas.microsoft.com/office/drawing/2015/9/8/chartex" xmlns:cx2="http://schemas.microsoft.com/office/drawing/2015/10/21/chartex" xmlns:cx3="http://schemas.microsoft.com/office/drawing/2016/5/9/chartex" xmlns:cx4="http://schemas.microsoft.com/office/drawing/2016/5/10/chartex" xmlns:cx5="http://schemas.microsoft.com/office/drawing/2016/5/11/chartex" xmlns:cx6="http://schemas.microsoft.com/office/drawing/2016/5/12/chartex" xmlns:cx7="http://schemas.microsoft.com/office/drawing/2016/5/13/chartex" xmlns:cx8="http://schemas.microsoft.com/office/drawing/2016/5/14/chartex" xmlns:mc="http://schemas.openxmlformats.org/markup-compatibility/2006" xmlns:m="http://schemas.openxmlformats.org/officeDocument/2006/math" xmlns:aink="http://schemas.microsoft.com/office/drawing/2016/ink" xmlns:am3d="http://schemas.microsoft.com/office/drawing/2017/model3d" xmlns:oel="http://schemas.microsoft.com/office/2019/extlst" xmlns:r="http://schemas.openxmlformats.org/officeDocument/2006/relationships" xmlns:wp14="http://schemas.microsoft.com/office/word/2010/wordprocessingDrawing" xmlns:wp="http://schemas.openxmlformats.org/drawingml/2006/wordprocessingDrawing" xmlns:wpg="http://schemas.microsoft.com/office/word/2010/wordprocessingGroup" xmlns:wpi="http://schemas.microsoft.com/office/word/2010/wordprocessingInk" xmlns:wps="http://schemas.microsoft.com/office/word/2010/wordprocessingShape" xmlns:o="urn:schemas-microsoft-com:office:office" xmlns:v="urn:schemas-microsoft-com:vml" xmlns:w10="urn:schemas-microsoft-com:office:word" xmlns:w="http://schemas.openxmlformats.org/wordprocessingml/2006/main" xmlns:w14="http://schemas.microsoft.com/office/word/2010/wordml" xmlns:w15="http://schemas.microsoft.com/office/word/2012/wordml" xmlns:w16cei="http://schemas.microsoft.com/office/word/2026/wordml/cei" xmlns:w16cex="http://schemas.microsoft.com/office/word/2018/wordml/cex" xmlns:w16cid="http://schemas.microsoft.com/office/word/2016/wordml/cid" xmlns:w16="http://schemas.microsoft.com/office/word/2018/wordml" xmlns:w16sdtdh="http://schemas.microsoft.com/office/word/2020/wordml/sdtdatahash" xmlns:w16sdtfl="http://schemas.microsoft.com/office/word/2024/wordml/sdtformatlock" xmlns:w16se="http://schemas.microsoft.com/office/word/2015/wordml/symex" xmlns:w16du="http://schemas.microsoft.com/office/word/2023/wordml/word16du" xmlns:wne="http://schemas.microsoft.com/office/word/2006/wordml" mc:Ignorable="w14 w15 w16se w16cid w16 w16cex w16sdtdh w16sdtfl w16du wp14">
+<w:ftr xmlns:wpc="http://schemas.microsoft.com/office/word/2010/wordprocessingCanvas" xmlns:cx="http://schemas.microsoft.com/office/drawing/2014/chartex" xmlns:cx1="http://schemas.microsoft.com/office/drawing/2015/9/8/chartex" xmlns:cx2="http://schemas.microsoft.com/office/drawing/2015/10/21/chartex" xmlns:cx3="http://schemas.microsoft.com/office/drawing/2016/5/9/chartex" xmlns:cx4="http://schemas.microsoft.com/office/drawing/2016/5/10/chartex" xmlns:cx5="http://schemas.microsoft.com/office/drawing/2016/5/11/chartex" xmlns:cx6="http://schemas.microsoft.com/office/drawing/2016/5/12/chartex" xmlns:cx7="http://schemas.microsoft.com/office/drawing/2016/5/13/chartex" xmlns:cx8="http://schemas.microsoft.com/office/drawing/2016/5/14/chartex" xmlns:mc="http://schemas.openxmlformats.org/markup-compatibility/2006" xmlns:m="http://schemas.openxmlformats.org/officeDocument/2006/math" xmlns:aink="http://schemas.microsoft.com/office/drawing/2016/ink" xmlns:am3d="http://schemas.microsoft.com/office/drawing/2017/model3d" xmlns:oel="http://schemas.microsoft.com/office/2019/extlst" xmlns:r="http://schemas.openxmlformats.org/officeDocument/2006/relationships" xmlns:wp14="http://schemas.microsoft.com/office/word/2010/wordprocessingDrawing" xmlns:wp="http://schemas.openxmlformats.org/drawingml/2006/wordprocessingDrawing" xmlns:wpg="http://schemas.microsoft.com/office/word/2010/wordprocessingGroup" xmlns:wpi="http://schemas.microsoft.com/office/word/2010/wordprocessingInk" xmlns:wps="http://schemas.microsoft.com/office/word/2010/wordprocessingShape" xmlns:o="urn:schemas-microsoft-com:office:office" xmlns:v="urn:schemas-microsoft-com:vml" xmlns:w10="urn:schemas-microsoft-com:office:word" xmlns:w="http://schemas.openxmlformats.org/wordprocessingml/2006/main" xmlns:w14="http://schemas.microsoft.com/office/word/2010/wordml" xmlns:w15="http://schemas.microsoft.com/office/word/2012/wordml" xmlns:w16cex="http://schemas.microsoft.com/office/word/2018/wordml/cex" xmlns:w16cid="http://schemas.microsoft.com/office/word/2016/wordml/cid" xmlns:w16="http://schemas.microsoft.com/office/word/2018/wordml" xmlns:w16sdtdh="http://schemas.microsoft.com/office/word/2020/wordml/sdtdatahash" xmlns:w16sdtfl="http://schemas.microsoft.com/office/word/2024/wordml/sdtformatlock" xmlns:w16se="http://schemas.microsoft.com/office/word/2015/wordml/symex" xmlns:w16du="http://schemas.microsoft.com/office/word/2023/wordml/word16du" xmlns:wne="http://schemas.microsoft.com/office/word/2006/wordml" mc:Ignorable="w14 w15 w16se w16cid w16 w16cex w16sdtdh w16sdtfl w16du wp14">
   <w:p>
     <w:pPr>
       <w:pStyle w:val="Footer"/>
@@ -5080,7 +4652,7 @@
 </file>
 
 <file path=word/footer2.xml><?xml version="1.0" encoding="utf-8"?>
-<w:ftr xmlns:wpc="http://schemas.microsoft.com/office/word/2010/wordprocessingCanvas" xmlns:cx="http://schemas.microsoft.com/office/drawing/2014/chartex" xmlns:cx1="http://schemas.microsoft.com/office/drawing/2015/9/8/chartex" xmlns:cx2="http://schemas.microsoft.com/office/drawing/2015/10/21/chartex" xmlns:cx3="http://schemas.microsoft.com/office/drawing/2016/5/9/chartex" xmlns:cx4="http://schemas.microsoft.com/office/drawing/2016/5/10/chartex" xmlns:cx5="http://schemas.microsoft.com/office/drawing/2016/5/11/chartex" xmlns:cx6="http://schemas.microsoft.com/office/drawing/2016/5/12/chartex" xmlns:cx7="http://schemas.microsoft.com/office/drawing/2016/5/13/chartex" xmlns:cx8="http://schemas.microsoft.com/office/drawing/2016/5/14/chartex" xmlns:mc="http://schemas.openxmlformats.org/markup-compatibility/2006" xmlns:m="http://schemas.openxmlformats.org/officeDocument/2006/math" xmlns:aink="http://schemas.microsoft.com/office/drawing/2016/ink" xmlns:am3d="http://schemas.microsoft.com/office/drawing/2017/model3d" xmlns:oel="http://schemas.microsoft.com/office/2019/extlst" xmlns:r="http://schemas.openxmlformats.org/officeDocument/2006/relationships" xmlns:wp14="http://schemas.microsoft.com/office/word/2010/wordprocessingDrawing" xmlns:wp="http://schemas.openxmlformats.org/drawingml/2006/wordprocessingDrawing" xmlns:wpg="http://schemas.microsoft.com/office/word/2010/wordprocessingGroup" xmlns:wpi="http://schemas.microsoft.com/office/word/2010/wordprocessingInk" xmlns:wps="http://schemas.microsoft.com/office/word/2010/wordprocessingShape" xmlns:o="urn:schemas-microsoft-com:office:office" xmlns:v="urn:schemas-microsoft-com:vml" xmlns:w10="urn:schemas-microsoft-com:office:word" xmlns:w="http://schemas.openxmlformats.org/wordprocessingml/2006/main" xmlns:w14="http://schemas.microsoft.com/office/word/2010/wordml" xmlns:w15="http://schemas.microsoft.com/office/word/2012/wordml" xmlns:w16cei="http://schemas.microsoft.com/office/word/2026/wordml/cei" xmlns:w16cex="http://schemas.microsoft.com/office/word/2018/wordml/cex" xmlns:w16cid="http://schemas.microsoft.com/office/word/2016/wordml/cid" xmlns:w16="http://schemas.microsoft.com/office/word/2018/wordml" xmlns:w16sdtdh="http://schemas.microsoft.com/office/word/2020/wordml/sdtdatahash" xmlns:w16sdtfl="http://schemas.microsoft.com/office/word/2024/wordml/sdtformatlock" xmlns:w16se="http://schemas.microsoft.com/office/word/2015/wordml/symex" xmlns:w16du="http://schemas.microsoft.com/office/word/2023/wordml/word16du" xmlns:wne="http://schemas.microsoft.com/office/word/2006/wordml" mc:Ignorable="w14 w15 w16se w16cid w16 w16cex w16sdtdh w16sdtfl w16du wp14">
+<w:ftr xmlns:wpc="http://schemas.microsoft.com/office/word/2010/wordprocessingCanvas" xmlns:cx="http://schemas.microsoft.com/office/drawing/2014/chartex" xmlns:cx1="http://schemas.microsoft.com/office/drawing/2015/9/8/chartex" xmlns:cx2="http://schemas.microsoft.com/office/drawing/2015/10/21/chartex" xmlns:cx3="http://schemas.microsoft.com/office/drawing/2016/5/9/chartex" xmlns:cx4="http://schemas.microsoft.com/office/drawing/2016/5/10/chartex" xmlns:cx5="http://schemas.microsoft.com/office/drawing/2016/5/11/chartex" xmlns:cx6="http://schemas.microsoft.com/office/drawing/2016/5/12/chartex" xmlns:cx7="http://schemas.microsoft.com/office/drawing/2016/5/13/chartex" xmlns:cx8="http://schemas.microsoft.com/office/drawing/2016/5/14/chartex" xmlns:mc="http://schemas.openxmlformats.org/markup-compatibility/2006" xmlns:m="http://schemas.openxmlformats.org/officeDocument/2006/math" xmlns:aink="http://schemas.microsoft.com/office/drawing/2016/ink" xmlns:am3d="http://schemas.microsoft.com/office/drawing/2017/model3d" xmlns:oel="http://schemas.microsoft.com/office/2019/extlst" xmlns:r="http://schemas.openxmlformats.org/officeDocument/2006/relationships" xmlns:wp14="http://schemas.microsoft.com/office/word/2010/wordprocessingDrawing" xmlns:wp="http://schemas.openxmlformats.org/drawingml/2006/wordprocessingDrawing" xmlns:wpg="http://schemas.microsoft.com/office/word/2010/wordprocessingGroup" xmlns:wpi="http://schemas.microsoft.com/office/word/2010/wordprocessingInk" xmlns:wps="http://schemas.microsoft.com/office/word/2010/wordprocessingShape" xmlns:o="urn:schemas-microsoft-com:office:office" xmlns:v="urn:schemas-microsoft-com:vml" xmlns:w10="urn:schemas-microsoft-com:office:word" xmlns:w="http://schemas.openxmlformats.org/wordprocessingml/2006/main" xmlns:w14="http://schemas.microsoft.com/office/word/2010/wordml" xmlns:w15="http://schemas.microsoft.com/office/word/2012/wordml" xmlns:w16cex="http://schemas.microsoft.com/office/word/2018/wordml/cex" xmlns:w16cid="http://schemas.microsoft.com/office/word/2016/wordml/cid" xmlns:w16="http://schemas.microsoft.com/office/word/2018/wordml" xmlns:w16sdtdh="http://schemas.microsoft.com/office/word/2020/wordml/sdtdatahash" xmlns:w16sdtfl="http://schemas.microsoft.com/office/word/2024/wordml/sdtformatlock" xmlns:w16se="http://schemas.microsoft.com/office/word/2015/wordml/symex" xmlns:w16du="http://schemas.microsoft.com/office/word/2023/wordml/word16du" xmlns:wne="http://schemas.microsoft.com/office/word/2006/wordml" mc:Ignorable="w14 w15 w16se w16cid w16 w16cex w16sdtdh w16sdtfl w16du wp14">
   <w:p>
     <w:pPr>
       <w:pStyle w:val="Footer"/>
@@ -5136,7 +4708,7 @@
 </file>
 
 <file path=word/footer3.xml><?xml version="1.0" encoding="utf-8"?>
-<w:ftr xmlns:wpc="http://schemas.microsoft.com/office/word/2010/wordprocessingCanvas" xmlns:cx="http://schemas.microsoft.com/office/drawing/2014/chartex" xmlns:cx1="http://schemas.microsoft.com/office/drawing/2015/9/8/chartex" xmlns:cx2="http://schemas.microsoft.com/office/drawing/2015/10/21/chartex" xmlns:cx3="http://schemas.microsoft.com/office/drawing/2016/5/9/chartex" xmlns:cx4="http://schemas.microsoft.com/office/drawing/2016/5/10/chartex" xmlns:cx5="http://schemas.microsoft.com/office/drawing/2016/5/11/chartex" xmlns:cx6="http://schemas.microsoft.com/office/drawing/2016/5/12/chartex" xmlns:cx7="http://schemas.microsoft.com/office/drawing/2016/5/13/chartex" xmlns:cx8="http://schemas.microsoft.com/office/drawing/2016/5/14/chartex" xmlns:mc="http://schemas.openxmlformats.org/markup-compatibility/2006" xmlns:m="http://schemas.openxmlformats.org/officeDocument/2006/math" xmlns:aink="http://schemas.microsoft.com/office/drawing/2016/ink" xmlns:am3d="http://schemas.microsoft.com/office/drawing/2017/model3d" xmlns:oel="http://schemas.microsoft.com/office/2019/extlst" xmlns:r="http://schemas.openxmlformats.org/officeDocument/2006/relationships" xmlns:wp14="http://schemas.microsoft.com/office/word/2010/wordprocessingDrawing" xmlns:wp="http://schemas.openxmlformats.org/drawingml/2006/wordprocessingDrawing" xmlns:wpg="http://schemas.microsoft.com/office/word/2010/wordprocessingGroup" xmlns:wpi="http://schemas.microsoft.com/office/word/2010/wordprocessingInk" xmlns:wps="http://schemas.microsoft.com/office/word/2010/wordprocessingShape" xmlns:o="urn:schemas-microsoft-com:office:office" xmlns:v="urn:schemas-microsoft-com:vml" xmlns:w10="urn:schemas-microsoft-com:office:word" xmlns:w="http://schemas.openxmlformats.org/wordprocessingml/2006/main" xmlns:w14="http://schemas.microsoft.com/office/word/2010/wordml" xmlns:w15="http://schemas.microsoft.com/office/word/2012/wordml" xmlns:w16cei="http://schemas.microsoft.com/office/word/2026/wordml/cei" xmlns:w16cex="http://schemas.microsoft.com/office/word/2018/wordml/cex" xmlns:w16cid="http://schemas.microsoft.com/office/word/2016/wordml/cid" xmlns:w16="http://schemas.microsoft.com/office/word/2018/wordml" xmlns:w16sdtdh="http://schemas.microsoft.com/office/word/2020/wordml/sdtdatahash" xmlns:w16sdtfl="http://schemas.microsoft.com/office/word/2024/wordml/sdtformatlock" xmlns:w16se="http://schemas.microsoft.com/office/word/2015/wordml/symex" xmlns:w16du="http://schemas.microsoft.com/office/word/2023/wordml/word16du" xmlns:wne="http://schemas.microsoft.com/office/word/2006/wordml" mc:Ignorable="w14 w15 w16se w16cid w16 w16cex w16sdtdh w16sdtfl w16du wp14">
+<w:ftr xmlns:wpc="http://schemas.microsoft.com/office/word/2010/wordprocessingCanvas" xmlns:cx="http://schemas.microsoft.com/office/drawing/2014/chartex" xmlns:cx1="http://schemas.microsoft.com/office/drawing/2015/9/8/chartex" xmlns:cx2="http://schemas.microsoft.com/office/drawing/2015/10/21/chartex" xmlns:cx3="http://schemas.microsoft.com/office/drawing/2016/5/9/chartex" xmlns:cx4="http://schemas.microsoft.com/office/drawing/2016/5/10/chartex" xmlns:cx5="http://schemas.microsoft.com/office/drawing/2016/5/11/chartex" xmlns:cx6="http://schemas.microsoft.com/office/drawing/2016/5/12/chartex" xmlns:cx7="http://schemas.microsoft.com/office/drawing/2016/5/13/chartex" xmlns:cx8="http://schemas.microsoft.com/office/drawing/2016/5/14/chartex" xmlns:mc="http://schemas.openxmlformats.org/markup-compatibility/2006" xmlns:m="http://schemas.openxmlformats.org/officeDocument/2006/math" xmlns:aink="http://schemas.microsoft.com/office/drawing/2016/ink" xmlns:am3d="http://schemas.microsoft.com/office/drawing/2017/model3d" xmlns:oel="http://schemas.microsoft.com/office/2019/extlst" xmlns:r="http://schemas.openxmlformats.org/officeDocument/2006/relationships" xmlns:wp14="http://schemas.microsoft.com/office/word/2010/wordprocessingDrawing" xmlns:wp="http://schemas.openxmlformats.org/drawingml/2006/wordprocessingDrawing" xmlns:wpg="http://schemas.microsoft.com/office/word/2010/wordprocessingGroup" xmlns:wpi="http://schemas.microsoft.com/office/word/2010/wordprocessingInk" xmlns:wps="http://schemas.microsoft.com/office/word/2010/wordprocessingShape" xmlns:o="urn:schemas-microsoft-com:office:office" xmlns:v="urn:schemas-microsoft-com:vml" xmlns:w10="urn:schemas-microsoft-com:office:word" xmlns:w="http://schemas.openxmlformats.org/wordprocessingml/2006/main" xmlns:w14="http://schemas.microsoft.com/office/word/2010/wordml" xmlns:w15="http://schemas.microsoft.com/office/word/2012/wordml" xmlns:w16cex="http://schemas.microsoft.com/office/word/2018/wordml/cex" xmlns:w16cid="http://schemas.microsoft.com/office/word/2016/wordml/cid" xmlns:w16="http://schemas.microsoft.com/office/word/2018/wordml" xmlns:w16sdtdh="http://schemas.microsoft.com/office/word/2020/wordml/sdtdatahash" xmlns:w16sdtfl="http://schemas.microsoft.com/office/word/2024/wordml/sdtformatlock" xmlns:w16se="http://schemas.microsoft.com/office/word/2015/wordml/symex" xmlns:w16du="http://schemas.microsoft.com/office/word/2023/wordml/word16du" xmlns:wne="http://schemas.microsoft.com/office/word/2006/wordml" mc:Ignorable="w14 w15 w16se w16cid w16 w16cex w16sdtdh w16sdtfl w16du wp14">
   <w:p>
     <w:pPr>
       <w:pStyle w:val="Footer"/>
@@ -5146,7 +4718,7 @@
 </file>
 
 <file path=word/footnotes.xml><?xml version="1.0" encoding="utf-8"?>
-<w:footnotes xmlns:wpc="http://schemas.microsoft.com/office/word/2010/wordprocessingCanvas" xmlns:cx="http://schemas.microsoft.com/office/drawing/2014/chartex" xmlns:cx1="http://schemas.microsoft.com/office/drawing/2015/9/8/chartex" xmlns:cx2="http://schemas.microsoft.com/office/drawing/2015/10/21/chartex" xmlns:cx3="http://schemas.microsoft.com/office/drawing/2016/5/9/chartex" xmlns:cx4="http://schemas.microsoft.com/office/drawing/2016/5/10/chartex" xmlns:cx5="http://schemas.microsoft.com/office/drawing/2016/5/11/chartex" xmlns:cx6="http://schemas.microsoft.com/office/drawing/2016/5/12/chartex" xmlns:cx7="http://schemas.microsoft.com/office/drawing/2016/5/13/chartex" xmlns:cx8="http://schemas.microsoft.com/office/drawing/2016/5/14/chartex" xmlns:mc="http://schemas.openxmlformats.org/markup-compatibility/2006" xmlns:m="http://schemas.openxmlformats.org/officeDocument/2006/math" xmlns:aink="http://schemas.microsoft.com/office/drawing/2016/ink" xmlns:am3d="http://schemas.microsoft.com/office/drawing/2017/model3d" xmlns:oel="http://schemas.microsoft.com/office/2019/extlst" xmlns:r="http://schemas.openxmlformats.org/officeDocument/2006/relationships" xmlns:wp14="http://schemas.microsoft.com/office/word/2010/wordprocessingDrawing" xmlns:wp="http://schemas.openxmlformats.org/drawingml/2006/wordprocessingDrawing" xmlns:wpg="http://schemas.microsoft.com/office/word/2010/wordprocessingGroup" xmlns:wpi="http://schemas.microsoft.com/office/word/2010/wordprocessingInk" xmlns:wps="http://schemas.microsoft.com/office/word/2010/wordprocessingShape" xmlns:o="urn:schemas-microsoft-com:office:office" xmlns:v="urn:schemas-microsoft-com:vml" xmlns:w10="urn:schemas-microsoft-com:office:word" xmlns:w="http://schemas.openxmlformats.org/wordprocessingml/2006/main" xmlns:w14="http://schemas.microsoft.com/office/word/2010/wordml" xmlns:w15="http://schemas.microsoft.com/office/word/2012/wordml" xmlns:w16cei="http://schemas.microsoft.com/office/word/2026/wordml/cei" xmlns:w16cex="http://schemas.microsoft.com/office/word/2018/wordml/cex" xmlns:w16cid="http://schemas.microsoft.com/office/word/2016/wordml/cid" xmlns:w16="http://schemas.microsoft.com/office/word/2018/wordml" xmlns:w16sdtdh="http://schemas.microsoft.com/office/word/2020/wordml/sdtdatahash" xmlns:w16sdtfl="http://schemas.microsoft.com/office/word/2024/wordml/sdtformatlock" xmlns:w16se="http://schemas.microsoft.com/office/word/2015/wordml/symex" xmlns:w16du="http://schemas.microsoft.com/office/word/2023/wordml/word16du" xmlns:wne="http://schemas.microsoft.com/office/word/2006/wordml" mc:Ignorable="w14 w15 w16se w16cid w16 w16cex w16sdtdh w16sdtfl w16du wp14">
+<w:footnotes xmlns:wpc="http://schemas.microsoft.com/office/word/2010/wordprocessingCanvas" xmlns:cx="http://schemas.microsoft.com/office/drawing/2014/chartex" xmlns:cx1="http://schemas.microsoft.com/office/drawing/2015/9/8/chartex" xmlns:cx2="http://schemas.microsoft.com/office/drawing/2015/10/21/chartex" xmlns:cx3="http://schemas.microsoft.com/office/drawing/2016/5/9/chartex" xmlns:cx4="http://schemas.microsoft.com/office/drawing/2016/5/10/chartex" xmlns:cx5="http://schemas.microsoft.com/office/drawing/2016/5/11/chartex" xmlns:cx6="http://schemas.microsoft.com/office/drawing/2016/5/12/chartex" xmlns:cx7="http://schemas.microsoft.com/office/drawing/2016/5/13/chartex" xmlns:cx8="http://schemas.microsoft.com/office/drawing/2016/5/14/chartex" xmlns:mc="http://schemas.openxmlformats.org/markup-compatibility/2006" xmlns:m="http://schemas.openxmlformats.org/officeDocument/2006/math" xmlns:aink="http://schemas.microsoft.com/office/drawing/2016/ink" xmlns:am3d="http://schemas.microsoft.com/office/drawing/2017/model3d" xmlns:oel="http://schemas.microsoft.com/office/2019/extlst" xmlns:r="http://schemas.openxmlformats.org/officeDocument/2006/relationships" xmlns:wp14="http://schemas.microsoft.com/office/word/2010/wordprocessingDrawing" xmlns:wp="http://schemas.openxmlformats.org/drawingml/2006/wordprocessingDrawing" xmlns:wpg="http://schemas.microsoft.com/office/word/2010/wordprocessingGroup" xmlns:wpi="http://schemas.microsoft.com/office/word/2010/wordprocessingInk" xmlns:wps="http://schemas.microsoft.com/office/word/2010/wordprocessingShape" xmlns:o="urn:schemas-microsoft-com:office:office" xmlns:v="urn:schemas-microsoft-com:vml" xmlns:w10="urn:schemas-microsoft-com:office:word" xmlns:w="http://schemas.openxmlformats.org/wordprocessingml/2006/main" xmlns:w14="http://schemas.microsoft.com/office/word/2010/wordml" xmlns:w15="http://schemas.microsoft.com/office/word/2012/wordml" xmlns:w16cex="http://schemas.microsoft.com/office/word/2018/wordml/cex" xmlns:w16cid="http://schemas.microsoft.com/office/word/2016/wordml/cid" xmlns:w16="http://schemas.microsoft.com/office/word/2018/wordml" xmlns:w16sdtdh="http://schemas.microsoft.com/office/word/2020/wordml/sdtdatahash" xmlns:w16sdtfl="http://schemas.microsoft.com/office/word/2024/wordml/sdtformatlock" xmlns:w16se="http://schemas.microsoft.com/office/word/2015/wordml/symex" xmlns:w16du="http://schemas.microsoft.com/office/word/2023/wordml/word16du" xmlns:wne="http://schemas.microsoft.com/office/word/2006/wordml" mc:Ignorable="w14 w15 w16se w16cid w16 w16cex w16sdtdh w16sdtfl w16du wp14">
   <w:footnote w:type="separator" w:id="-1">
     <w:p>
       <w:pPr>
@@ -5171,7 +4743,7 @@
 </file>
 
 <file path=word/header1.xml><?xml version="1.0" encoding="utf-8"?>
-<w:hdr xmlns:wpc="http://schemas.microsoft.com/office/word/2010/wordprocessingCanvas" xmlns:cx="http://schemas.microsoft.com/office/drawing/2014/chartex" xmlns:cx1="http://schemas.microsoft.com/office/drawing/2015/9/8/chartex" xmlns:cx2="http://schemas.microsoft.com/office/drawing/2015/10/21/chartex" xmlns:cx3="http://schemas.microsoft.com/office/drawing/2016/5/9/chartex" xmlns:cx4="http://schemas.microsoft.com/office/drawing/2016/5/10/chartex" xmlns:cx5="http://schemas.microsoft.com/office/drawing/2016/5/11/chartex" xmlns:cx6="http://schemas.microsoft.com/office/drawing/2016/5/12/chartex" xmlns:cx7="http://schemas.microsoft.com/office/drawing/2016/5/13/chartex" xmlns:cx8="http://schemas.microsoft.com/office/drawing/2016/5/14/chartex" xmlns:mc="http://schemas.openxmlformats.org/markup-compatibility/2006" xmlns:m="http://schemas.openxmlformats.org/officeDocument/2006/math" xmlns:aink="http://schemas.microsoft.com/office/drawing/2016/ink" xmlns:am3d="http://schemas.microsoft.com/office/drawing/2017/model3d" xmlns:oel="http://schemas.microsoft.com/office/2019/extlst" xmlns:r="http://schemas.openxmlformats.org/officeDocument/2006/relationships" xmlns:wp14="http://schemas.microsoft.com/office/word/2010/wordprocessingDrawing" xmlns:wp="http://schemas.openxmlformats.org/drawingml/2006/wordprocessingDrawing" xmlns:wpg="http://schemas.microsoft.com/office/word/2010/wordprocessingGroup" xmlns:wpi="http://schemas.microsoft.com/office/word/2010/wordprocessingInk" xmlns:wps="http://schemas.microsoft.com/office/word/2010/wordprocessingShape" xmlns:o="urn:schemas-microsoft-com:office:office" xmlns:v="urn:schemas-microsoft-com:vml" xmlns:w10="urn:schemas-microsoft-com:office:word" xmlns:w="http://schemas.openxmlformats.org/wordprocessingml/2006/main" xmlns:w14="http://schemas.microsoft.com/office/word/2010/wordml" xmlns:w15="http://schemas.microsoft.com/office/word/2012/wordml" xmlns:w16cei="http://schemas.microsoft.com/office/word/2026/wordml/cei" xmlns:w16cex="http://schemas.microsoft.com/office/word/2018/wordml/cex" xmlns:w16cid="http://schemas.microsoft.com/office/word/2016/wordml/cid" xmlns:w16="http://schemas.microsoft.com/office/word/2018/wordml" xmlns:w16sdtdh="http://schemas.microsoft.com/office/word/2020/wordml/sdtdatahash" xmlns:w16sdtfl="http://schemas.microsoft.com/office/word/2024/wordml/sdtformatlock" xmlns:w16se="http://schemas.microsoft.com/office/word/2015/wordml/symex" xmlns:w16du="http://schemas.microsoft.com/office/word/2023/wordml/word16du" xmlns:wne="http://schemas.microsoft.com/office/word/2006/wordml" mc:Ignorable="w14 w15 w16se w16cid w16 w16cex w16sdtdh w16sdtfl w16du wp14">
+<w:hdr xmlns:wpc="http://schemas.microsoft.com/office/word/2010/wordprocessingCanvas" xmlns:cx="http://schemas.microsoft.com/office/drawing/2014/chartex" xmlns:cx1="http://schemas.microsoft.com/office/drawing/2015/9/8/chartex" xmlns:cx2="http://schemas.microsoft.com/office/drawing/2015/10/21/chartex" xmlns:cx3="http://schemas.microsoft.com/office/drawing/2016/5/9/chartex" xmlns:cx4="http://schemas.microsoft.com/office/drawing/2016/5/10/chartex" xmlns:cx5="http://schemas.microsoft.com/office/drawing/2016/5/11/chartex" xmlns:cx6="http://schemas.microsoft.com/office/drawing/2016/5/12/chartex" xmlns:cx7="http://schemas.microsoft.com/office/drawing/2016/5/13/chartex" xmlns:cx8="http://schemas.microsoft.com/office/drawing/2016/5/14/chartex" xmlns:mc="http://schemas.openxmlformats.org/markup-compatibility/2006" xmlns:m="http://schemas.openxmlformats.org/officeDocument/2006/math" xmlns:aink="http://schemas.microsoft.com/office/drawing/2016/ink" xmlns:am3d="http://schemas.microsoft.com/office/drawing/2017/model3d" xmlns:oel="http://schemas.microsoft.com/office/2019/extlst" xmlns:r="http://schemas.openxmlformats.org/officeDocument/2006/relationships" xmlns:wp14="http://schemas.microsoft.com/office/word/2010/wordprocessingDrawing" xmlns:wp="http://schemas.openxmlformats.org/drawingml/2006/wordprocessingDrawing" xmlns:wpg="http://schemas.microsoft.com/office/word/2010/wordprocessingGroup" xmlns:wpi="http://schemas.microsoft.com/office/word/2010/wordprocessingInk" xmlns:wps="http://schemas.microsoft.com/office/word/2010/wordprocessingShape" xmlns:o="urn:schemas-microsoft-com:office:office" xmlns:v="urn:schemas-microsoft-com:vml" xmlns:w10="urn:schemas-microsoft-com:office:word" xmlns:w="http://schemas.openxmlformats.org/wordprocessingml/2006/main" xmlns:w14="http://schemas.microsoft.com/office/word/2010/wordml" xmlns:w15="http://schemas.microsoft.com/office/word/2012/wordml" xmlns:w16cex="http://schemas.microsoft.com/office/word/2018/wordml/cex" xmlns:w16cid="http://schemas.microsoft.com/office/word/2016/wordml/cid" xmlns:w16="http://schemas.microsoft.com/office/word/2018/wordml" xmlns:w16sdtdh="http://schemas.microsoft.com/office/word/2020/wordml/sdtdatahash" xmlns:w16sdtfl="http://schemas.microsoft.com/office/word/2024/wordml/sdtformatlock" xmlns:w16se="http://schemas.microsoft.com/office/word/2015/wordml/symex" xmlns:w16du="http://schemas.microsoft.com/office/word/2023/wordml/word16du" xmlns:wne="http://schemas.microsoft.com/office/word/2006/wordml" mc:Ignorable="w14 w15 w16se w16cid w16 w16cex w16sdtdh w16sdtfl w16du wp14">
   <w:p>
     <w:pPr>
       <w:pStyle w:val="Header"/>
@@ -5181,7 +4753,7 @@
 </file>
 
 <file path=word/header2.xml><?xml version="1.0" encoding="utf-8"?>
-<w:hdr xmlns:wpc="http://schemas.microsoft.com/office/word/2010/wordprocessingCanvas" xmlns:cx="http://schemas.microsoft.com/office/drawing/2014/chartex" xmlns:cx1="http://schemas.microsoft.com/office/drawing/2015/9/8/chartex" xmlns:cx2="http://schemas.microsoft.com/office/drawing/2015/10/21/chartex" xmlns:cx3="http://schemas.microsoft.com/office/drawing/2016/5/9/chartex" xmlns:cx4="http://schemas.microsoft.com/office/drawing/2016/5/10/chartex" xmlns:cx5="http://schemas.microsoft.com/office/drawing/2016/5/11/chartex" xmlns:cx6="http://schemas.microsoft.com/office/drawing/2016/5/12/chartex" xmlns:cx7="http://schemas.microsoft.com/office/drawing/2016/5/13/chartex" xmlns:cx8="http://schemas.microsoft.com/office/drawing/2016/5/14/chartex" xmlns:mc="http://schemas.openxmlformats.org/markup-compatibility/2006" xmlns:m="http://schemas.openxmlformats.org/officeDocument/2006/math" xmlns:aink="http://schemas.microsoft.com/office/drawing/2016/ink" xmlns:am3d="http://schemas.microsoft.com/office/drawing/2017/model3d" xmlns:oel="http://schemas.microsoft.com/office/2019/extlst" xmlns:r="http://schemas.openxmlformats.org/officeDocument/2006/relationships" xmlns:wp14="http://schemas.microsoft.com/office/word/2010/wordprocessingDrawing" xmlns:wp="http://schemas.openxmlformats.org/drawingml/2006/wordprocessingDrawing" xmlns:wpg="http://schemas.microsoft.com/office/word/2010/wordprocessingGroup" xmlns:wpi="http://schemas.microsoft.com/office/word/2010/wordprocessingInk" xmlns:wps="http://schemas.microsoft.com/office/word/2010/wordprocessingShape" xmlns:o="urn:schemas-microsoft-com:office:office" xmlns:v="urn:schemas-microsoft-com:vml" xmlns:w10="urn:schemas-microsoft-com:office:word" xmlns:w="http://schemas.openxmlformats.org/wordprocessingml/2006/main" xmlns:w14="http://schemas.microsoft.com/office/word/2010/wordml" xmlns:w15="http://schemas.microsoft.com/office/word/2012/wordml" xmlns:w16cei="http://schemas.microsoft.com/office/word/2026/wordml/cei" xmlns:w16cex="http://schemas.microsoft.com/office/word/2018/wordml/cex" xmlns:w16cid="http://schemas.microsoft.com/office/word/2016/wordml/cid" xmlns:w16="http://schemas.microsoft.com/office/word/2018/wordml" xmlns:w16sdtdh="http://schemas.microsoft.com/office/word/2020/wordml/sdtdatahash" xmlns:w16sdtfl="http://schemas.microsoft.com/office/word/2024/wordml/sdtformatlock" xmlns:w16se="http://schemas.microsoft.com/office/word/2015/wordml/symex" xmlns:w16du="http://schemas.microsoft.com/office/word/2023/wordml/word16du" xmlns:wne="http://schemas.microsoft.com/office/word/2006/wordml" mc:Ignorable="w14 w15 w16se w16cid w16 w16cex w16sdtdh w16sdtfl w16du wp14">
+<w:hdr xmlns:wpc="http://schemas.microsoft.com/office/word/2010/wordprocessingCanvas" xmlns:cx="http://schemas.microsoft.com/office/drawing/2014/chartex" xmlns:cx1="http://schemas.microsoft.com/office/drawing/2015/9/8/chartex" xmlns:cx2="http://schemas.microsoft.com/office/drawing/2015/10/21/chartex" xmlns:cx3="http://schemas.microsoft.com/office/drawing/2016/5/9/chartex" xmlns:cx4="http://schemas.microsoft.com/office/drawing/2016/5/10/chartex" xmlns:cx5="http://schemas.microsoft.com/office/drawing/2016/5/11/chartex" xmlns:cx6="http://schemas.microsoft.com/office/drawing/2016/5/12/chartex" xmlns:cx7="http://schemas.microsoft.com/office/drawing/2016/5/13/chartex" xmlns:cx8="http://schemas.microsoft.com/office/drawing/2016/5/14/chartex" xmlns:mc="http://schemas.openxmlformats.org/markup-compatibility/2006" xmlns:m="http://schemas.openxmlformats.org/officeDocument/2006/math" xmlns:aink="http://schemas.microsoft.com/office/drawing/2016/ink" xmlns:am3d="http://schemas.microsoft.com/office/drawing/2017/model3d" xmlns:oel="http://schemas.microsoft.com/office/2019/extlst" xmlns:r="http://schemas.openxmlformats.org/officeDocument/2006/relationships" xmlns:wp14="http://schemas.microsoft.com/office/word/2010/wordprocessingDrawing" xmlns:wp="http://schemas.openxmlformats.org/drawingml/2006/wordprocessingDrawing" xmlns:wpg="http://schemas.microsoft.com/office/word/2010/wordprocessingGroup" xmlns:wpi="http://schemas.microsoft.com/office/word/2010/wordprocessingInk" xmlns:wps="http://schemas.microsoft.com/office/word/2010/wordprocessingShape" xmlns:o="urn:schemas-microsoft-com:office:office" xmlns:v="urn:schemas-microsoft-com:vml" xmlns:w10="urn:schemas-microsoft-com:office:word" xmlns:w="http://schemas.openxmlformats.org/wordprocessingml/2006/main" xmlns:w14="http://schemas.microsoft.com/office/word/2010/wordml" xmlns:w15="http://schemas.microsoft.com/office/word/2012/wordml" xmlns:w16cex="http://schemas.microsoft.com/office/word/2018/wordml/cex" xmlns:w16cid="http://schemas.microsoft.com/office/word/2016/wordml/cid" xmlns:w16="http://schemas.microsoft.com/office/word/2018/wordml" xmlns:w16sdtdh="http://schemas.microsoft.com/office/word/2020/wordml/sdtdatahash" xmlns:w16sdtfl="http://schemas.microsoft.com/office/word/2024/wordml/sdtformatlock" xmlns:w16se="http://schemas.microsoft.com/office/word/2015/wordml/symex" xmlns:w16du="http://schemas.microsoft.com/office/word/2023/wordml/word16du" xmlns:wne="http://schemas.microsoft.com/office/word/2006/wordml" mc:Ignorable="w14 w15 w16se w16cid w16 w16cex w16sdtdh w16sdtfl w16du wp14">
   <w:p>
     <w:pPr>
       <w:pStyle w:val="Header"/>
@@ -5191,7 +4763,7 @@
 </file>
 
 <file path=word/header3.xml><?xml version="1.0" encoding="utf-8"?>
-<w:hdr xmlns:wpc="http://schemas.microsoft.com/office/word/2010/wordprocessingCanvas" xmlns:cx="http://schemas.microsoft.com/office/drawing/2014/chartex" xmlns:cx1="http://schemas.microsoft.com/office/drawing/2015/9/8/chartex" xmlns:cx2="http://schemas.microsoft.com/office/drawing/2015/10/21/chartex" xmlns:cx3="http://schemas.microsoft.com/office/drawing/2016/5/9/chartex" xmlns:cx4="http://schemas.microsoft.com/office/drawing/2016/5/10/chartex" xmlns:cx5="http://schemas.microsoft.com/office/drawing/2016/5/11/chartex" xmlns:cx6="http://schemas.microsoft.com/office/drawing/2016/5/12/chartex" xmlns:cx7="http://schemas.microsoft.com/office/drawing/2016/5/13/chartex" xmlns:cx8="http://schemas.microsoft.com/office/drawing/2016/5/14/chartex" xmlns:mc="http://schemas.openxmlformats.org/markup-compatibility/2006" xmlns:m="http://schemas.openxmlformats.org/officeDocument/2006/math" xmlns:aink="http://schemas.microsoft.com/office/drawing/2016/ink" xmlns:am3d="http://schemas.microsoft.com/office/drawing/2017/model3d" xmlns:oel="http://schemas.microsoft.com/office/2019/extlst" xmlns:r="http://schemas.openxmlformats.org/officeDocument/2006/relationships" xmlns:wp14="http://schemas.microsoft.com/office/word/2010/wordprocessingDrawing" xmlns:wp="http://schemas.openxmlformats.org/drawingml/2006/wordprocessingDrawing" xmlns:wpg="http://schemas.microsoft.com/office/word/2010/wordprocessingGroup" xmlns:wpi="http://schemas.microsoft.com/office/word/2010/wordprocessingInk" xmlns:wps="http://schemas.microsoft.com/office/word/2010/wordprocessingShape" xmlns:o="urn:schemas-microsoft-com:office:office" xmlns:v="urn:schemas-microsoft-com:vml" xmlns:w10="urn:schemas-microsoft-com:office:word" xmlns:w="http://schemas.openxmlformats.org/wordprocessingml/2006/main" xmlns:w14="http://schemas.microsoft.com/office/word/2010/wordml" xmlns:w15="http://schemas.microsoft.com/office/word/2012/wordml" xmlns:w16cei="http://schemas.microsoft.com/office/word/2026/wordml/cei" xmlns:w16cex="http://schemas.microsoft.com/office/word/2018/wordml/cex" xmlns:w16cid="http://schemas.microsoft.com/office/word/2016/wordml/cid" xmlns:w16="http://schemas.microsoft.com/office/word/2018/wordml" xmlns:w16sdtdh="http://schemas.microsoft.com/office/word/2020/wordml/sdtdatahash" xmlns:w16sdtfl="http://schemas.microsoft.com/office/word/2024/wordml/sdtformatlock" xmlns:w16se="http://schemas.microsoft.com/office/word/2015/wordml/symex" xmlns:w16du="http://schemas.microsoft.com/office/word/2023/wordml/word16du" xmlns:wne="http://schemas.microsoft.com/office/word/2006/wordml" mc:Ignorable="w14 w15 w16se w16cid w16 w16cex w16sdtdh w16sdtfl w16du wp14">
+<w:hdr xmlns:wpc="http://schemas.microsoft.com/office/word/2010/wordprocessingCanvas" xmlns:cx="http://schemas.microsoft.com/office/drawing/2014/chartex" xmlns:cx1="http://schemas.microsoft.com/office/drawing/2015/9/8/chartex" xmlns:cx2="http://schemas.microsoft.com/office/drawing/2015/10/21/chartex" xmlns:cx3="http://schemas.microsoft.com/office/drawing/2016/5/9/chartex" xmlns:cx4="http://schemas.microsoft.com/office/drawing/2016/5/10/chartex" xmlns:cx5="http://schemas.microsoft.com/office/drawing/2016/5/11/chartex" xmlns:cx6="http://schemas.microsoft.com/office/drawing/2016/5/12/chartex" xmlns:cx7="http://schemas.microsoft.com/office/drawing/2016/5/13/chartex" xmlns:cx8="http://schemas.microsoft.com/office/drawing/2016/5/14/chartex" xmlns:mc="http://schemas.openxmlformats.org/markup-compatibility/2006" xmlns:m="http://schemas.openxmlformats.org/officeDocument/2006/math" xmlns:aink="http://schemas.microsoft.com/office/drawing/2016/ink" xmlns:am3d="http://schemas.microsoft.com/office/drawing/2017/model3d" xmlns:oel="http://schemas.microsoft.com/office/2019/extlst" xmlns:r="http://schemas.openxmlformats.org/officeDocument/2006/relationships" xmlns:wp14="http://schemas.microsoft.com/office/word/2010/wordprocessingDrawing" xmlns:wp="http://schemas.openxmlformats.org/drawingml/2006/wordprocessingDrawing" xmlns:wpg="http://schemas.microsoft.com/office/word/2010/wordprocessingGroup" xmlns:wpi="http://schemas.microsoft.com/office/word/2010/wordprocessingInk" xmlns:wps="http://schemas.microsoft.com/office/word/2010/wordprocessingShape" xmlns:o="urn:schemas-microsoft-com:office:office" xmlns:v="urn:schemas-microsoft-com:vml" xmlns:w10="urn:schemas-microsoft-com:office:word" xmlns:w="http://schemas.openxmlformats.org/wordprocessingml/2006/main" xmlns:w14="http://schemas.microsoft.com/office/word/2010/wordml" xmlns:w15="http://schemas.microsoft.com/office/word/2012/wordml" xmlns:w16cex="http://schemas.microsoft.com/office/word/2018/wordml/cex" xmlns:w16cid="http://schemas.microsoft.com/office/word/2016/wordml/cid" xmlns:w16="http://schemas.microsoft.com/office/word/2018/wordml" xmlns:w16sdtdh="http://schemas.microsoft.com/office/word/2020/wordml/sdtdatahash" xmlns:w16sdtfl="http://schemas.microsoft.com/office/word/2024/wordml/sdtformatlock" xmlns:w16se="http://schemas.microsoft.com/office/word/2015/wordml/symex" xmlns:w16du="http://schemas.microsoft.com/office/word/2023/wordml/word16du" xmlns:wne="http://schemas.microsoft.com/office/word/2006/wordml" mc:Ignorable="w14 w15 w16se w16cid w16 w16cex w16sdtdh w16sdtfl w16du wp14">
   <w:p>
     <w:pPr>
       <w:pStyle w:val="Header"/>
@@ -5201,7 +4773,7 @@
 </file>
 
 <file path=word/numbering.xml><?xml version="1.0" encoding="utf-8"?>
-<w:numbering xmlns:wpc="http://schemas.microsoft.com/office/word/2010/wordprocessingCanvas" xmlns:cx="http://schemas.microsoft.com/office/drawing/2014/chartex" xmlns:cx1="http://schemas.microsoft.com/office/drawing/2015/9/8/chartex" xmlns:cx2="http://schemas.microsoft.com/office/drawing/2015/10/21/chartex" xmlns:cx3="http://schemas.microsoft.com/office/drawing/2016/5/9/chartex" xmlns:cx4="http://schemas.microsoft.com/office/drawing/2016/5/10/chartex" xmlns:cx5="http://schemas.microsoft.com/office/drawing/2016/5/11/chartex" xmlns:cx6="http://schemas.microsoft.com/office/drawing/2016/5/12/chartex" xmlns:cx7="http://schemas.microsoft.com/office/drawing/2016/5/13/chartex" xmlns:cx8="http://schemas.microsoft.com/office/drawing/2016/5/14/chartex" xmlns:mc="http://schemas.openxmlformats.org/markup-compatibility/2006" xmlns:m="http://schemas.openxmlformats.org/officeDocument/2006/math" xmlns:aink="http://schemas.microsoft.com/office/drawing/2016/ink" xmlns:am3d="http://schemas.microsoft.com/office/drawing/2017/model3d" xmlns:oel="http://schemas.microsoft.com/office/2019/extlst" xmlns:r="http://schemas.openxmlformats.org/officeDocument/2006/relationships" xmlns:wp14="http://schemas.microsoft.com/office/word/2010/wordprocessingDrawing" xmlns:wp="http://schemas.openxmlformats.org/drawingml/2006/wordprocessingDrawing" xmlns:wpg="http://schemas.microsoft.com/office/word/2010/wordprocessingGroup" xmlns:wpi="http://schemas.microsoft.com/office/word/2010/wordprocessingInk" xmlns:wps="http://schemas.microsoft.com/office/word/2010/wordprocessingShape" xmlns:o="urn:schemas-microsoft-com:office:office" xmlns:v="urn:schemas-microsoft-com:vml" xmlns:w10="urn:schemas-microsoft-com:office:word" xmlns:w="http://schemas.openxmlformats.org/wordprocessingml/2006/main" xmlns:w14="http://schemas.microsoft.com/office/word/2010/wordml" xmlns:w15="http://schemas.microsoft.com/office/word/2012/wordml" xmlns:w16cei="http://schemas.microsoft.com/office/word/2026/wordml/cei" xmlns:w16cex="http://schemas.microsoft.com/office/word/2018/wordml/cex" xmlns:w16cid="http://schemas.microsoft.com/office/word/2016/wordml/cid" xmlns:w16="http://schemas.microsoft.com/office/word/2018/wordml" xmlns:w16sdtdh="http://schemas.microsoft.com/office/word/2020/wordml/sdtdatahash" xmlns:w16sdtfl="http://schemas.microsoft.com/office/word/2024/wordml/sdtformatlock" xmlns:w16se="http://schemas.microsoft.com/office/word/2015/wordml/symex" xmlns:w16du="http://schemas.microsoft.com/office/word/2023/wordml/word16du" xmlns:wne="http://schemas.microsoft.com/office/word/2006/wordml" mc:Ignorable="w14 w15 w16se w16cid w16 w16cex w16sdtdh w16sdtfl w16du wp14">
+<w:numbering xmlns:wpc="http://schemas.microsoft.com/office/word/2010/wordprocessingCanvas" xmlns:cx="http://schemas.microsoft.com/office/drawing/2014/chartex" xmlns:cx1="http://schemas.microsoft.com/office/drawing/2015/9/8/chartex" xmlns:cx2="http://schemas.microsoft.com/office/drawing/2015/10/21/chartex" xmlns:cx3="http://schemas.microsoft.com/office/drawing/2016/5/9/chartex" xmlns:cx4="http://schemas.microsoft.com/office/drawing/2016/5/10/chartex" xmlns:cx5="http://schemas.microsoft.com/office/drawing/2016/5/11/chartex" xmlns:cx6="http://schemas.microsoft.com/office/drawing/2016/5/12/chartex" xmlns:cx7="http://schemas.microsoft.com/office/drawing/2016/5/13/chartex" xmlns:cx8="http://schemas.microsoft.com/office/drawing/2016/5/14/chartex" xmlns:mc="http://schemas.openxmlformats.org/markup-compatibility/2006" xmlns:m="http://schemas.openxmlformats.org/officeDocument/2006/math" xmlns:aink="http://schemas.microsoft.com/office/drawing/2016/ink" xmlns:am3d="http://schemas.microsoft.com/office/drawing/2017/model3d" xmlns:oel="http://schemas.microsoft.com/office/2019/extlst" xmlns:r="http://schemas.openxmlformats.org/officeDocument/2006/relationships" xmlns:wp14="http://schemas.microsoft.com/office/word/2010/wordprocessingDrawing" xmlns:wp="http://schemas.openxmlformats.org/drawingml/2006/wordprocessingDrawing" xmlns:wpg="http://schemas.microsoft.com/office/word/2010/wordprocessingGroup" xmlns:wpi="http://schemas.microsoft.com/office/word/2010/wordprocessingInk" xmlns:wps="http://schemas.microsoft.com/office/word/2010/wordprocessingShape" xmlns:o="urn:schemas-microsoft-com:office:office" xmlns:v="urn:schemas-microsoft-com:vml" xmlns:w10="urn:schemas-microsoft-com:office:word" xmlns:w="http://schemas.openxmlformats.org/wordprocessingml/2006/main" xmlns:w14="http://schemas.microsoft.com/office/word/2010/wordml" xmlns:w15="http://schemas.microsoft.com/office/word/2012/wordml" xmlns:w16cex="http://schemas.microsoft.com/office/word/2018/wordml/cex" xmlns:w16cid="http://schemas.microsoft.com/office/word/2016/wordml/cid" xmlns:w16="http://schemas.microsoft.com/office/word/2018/wordml" xmlns:w16sdtdh="http://schemas.microsoft.com/office/word/2020/wordml/sdtdatahash" xmlns:w16sdtfl="http://schemas.microsoft.com/office/word/2024/wordml/sdtformatlock" xmlns:w16se="http://schemas.microsoft.com/office/word/2015/wordml/symex" xmlns:w16du="http://schemas.microsoft.com/office/word/2023/wordml/word16du" xmlns:wne="http://schemas.microsoft.com/office/word/2006/wordml" mc:Ignorable="w14 w15 w16se w16cid w16 w16cex w16sdtdh w16sdtfl w16du wp14">
   <w:abstractNum w:abstractNumId="0" w15:restartNumberingAfterBreak="0">
     <w:nsid w:val="108E54CC"/>
     <w:multiLevelType w:val="hybridMultilevel"/>

</xml_diff>

<commit_message>
Deploying to gh-pages from @ shuvom-s/shuvom-s.github.io@bd93146d3db23fccb2fa1e049d98de4e501de986 🚀
</commit_message>
<xml_diff>
--- a/assets/pdf/cv_aug26.docx
+++ b/assets/pdf/cv_aug26.docx
@@ -1,6 +1,6 @@
 
 <file path=word/document.xml><?xml version="1.0" encoding="utf-8"?>
-<w:document xmlns:wpc="http://schemas.microsoft.com/office/word/2010/wordprocessingCanvas" xmlns:cx="http://schemas.microsoft.com/office/drawing/2014/chartex" xmlns:cx1="http://schemas.microsoft.com/office/drawing/2015/9/8/chartex" xmlns:cx2="http://schemas.microsoft.com/office/drawing/2015/10/21/chartex" xmlns:cx3="http://schemas.microsoft.com/office/drawing/2016/5/9/chartex" xmlns:cx4="http://schemas.microsoft.com/office/drawing/2016/5/10/chartex" xmlns:cx5="http://schemas.microsoft.com/office/drawing/2016/5/11/chartex" xmlns:cx6="http://schemas.microsoft.com/office/drawing/2016/5/12/chartex" xmlns:cx7="http://schemas.microsoft.com/office/drawing/2016/5/13/chartex" xmlns:cx8="http://schemas.microsoft.com/office/drawing/2016/5/14/chartex" xmlns:mc="http://schemas.openxmlformats.org/markup-compatibility/2006" xmlns:m="http://schemas.openxmlformats.org/officeDocument/2006/math" xmlns:aink="http://schemas.microsoft.com/office/drawing/2016/ink" xmlns:am3d="http://schemas.microsoft.com/office/drawing/2017/model3d" xmlns:oel="http://schemas.microsoft.com/office/2019/extlst" xmlns:r="http://schemas.openxmlformats.org/officeDocument/2006/relationships" xmlns:wp14="http://schemas.microsoft.com/office/word/2010/wordprocessingDrawing" xmlns:wp="http://schemas.openxmlformats.org/drawingml/2006/wordprocessingDrawing" xmlns:wpg="http://schemas.microsoft.com/office/word/2010/wordprocessingGroup" xmlns:wpi="http://schemas.microsoft.com/office/word/2010/wordprocessingInk" xmlns:wps="http://schemas.microsoft.com/office/word/2010/wordprocessingShape" xmlns:o="urn:schemas-microsoft-com:office:office" xmlns:v="urn:schemas-microsoft-com:vml" xmlns:w10="urn:schemas-microsoft-com:office:word" xmlns:w="http://schemas.openxmlformats.org/wordprocessingml/2006/main" xmlns:w14="http://schemas.microsoft.com/office/word/2010/wordml" xmlns:w15="http://schemas.microsoft.com/office/word/2012/wordml" xmlns:w16cei="http://schemas.microsoft.com/office/word/2026/wordml/cei" xmlns:w16cex="http://schemas.microsoft.com/office/word/2018/wordml/cex" xmlns:w16cid="http://schemas.microsoft.com/office/word/2016/wordml/cid" xmlns:w16="http://schemas.microsoft.com/office/word/2018/wordml" xmlns:w16sdtdh="http://schemas.microsoft.com/office/word/2020/wordml/sdtdatahash" xmlns:w16sdtfl="http://schemas.microsoft.com/office/word/2024/wordml/sdtformatlock" xmlns:w16se="http://schemas.microsoft.com/office/word/2015/wordml/symex" xmlns:w16du="http://schemas.microsoft.com/office/word/2023/wordml/word16du" xmlns:wne="http://schemas.microsoft.com/office/word/2006/wordml" mc:Ignorable="w14 w15 w16se w16cid w16 w16cex w16sdtdh w16sdtfl w16du wp14">
+<w:document xmlns:wpc="http://schemas.microsoft.com/office/word/2010/wordprocessingCanvas" xmlns:cx="http://schemas.microsoft.com/office/drawing/2014/chartex" xmlns:cx1="http://schemas.microsoft.com/office/drawing/2015/9/8/chartex" xmlns:cx2="http://schemas.microsoft.com/office/drawing/2015/10/21/chartex" xmlns:cx3="http://schemas.microsoft.com/office/drawing/2016/5/9/chartex" xmlns:cx4="http://schemas.microsoft.com/office/drawing/2016/5/10/chartex" xmlns:cx5="http://schemas.microsoft.com/office/drawing/2016/5/11/chartex" xmlns:cx6="http://schemas.microsoft.com/office/drawing/2016/5/12/chartex" xmlns:cx7="http://schemas.microsoft.com/office/drawing/2016/5/13/chartex" xmlns:cx8="http://schemas.microsoft.com/office/drawing/2016/5/14/chartex" xmlns:mc="http://schemas.openxmlformats.org/markup-compatibility/2006" xmlns:m="http://schemas.openxmlformats.org/officeDocument/2006/math" xmlns:aink="http://schemas.microsoft.com/office/drawing/2016/ink" xmlns:am3d="http://schemas.microsoft.com/office/drawing/2017/model3d" xmlns:oel="http://schemas.microsoft.com/office/2019/extlst" xmlns:r="http://schemas.openxmlformats.org/officeDocument/2006/relationships" xmlns:wp14="http://schemas.microsoft.com/office/word/2010/wordprocessingDrawing" xmlns:wp="http://schemas.openxmlformats.org/drawingml/2006/wordprocessingDrawing" xmlns:wpg="http://schemas.microsoft.com/office/word/2010/wordprocessingGroup" xmlns:wpi="http://schemas.microsoft.com/office/word/2010/wordprocessingInk" xmlns:wps="http://schemas.microsoft.com/office/word/2010/wordprocessingShape" xmlns:o="urn:schemas-microsoft-com:office:office" xmlns:v="urn:schemas-microsoft-com:vml" xmlns:w10="urn:schemas-microsoft-com:office:word" xmlns:w="http://schemas.openxmlformats.org/wordprocessingml/2006/main" xmlns:w14="http://schemas.microsoft.com/office/word/2010/wordml" xmlns:w15="http://schemas.microsoft.com/office/word/2012/wordml" xmlns:w16cex="http://schemas.microsoft.com/office/word/2018/wordml/cex" xmlns:w16cid="http://schemas.microsoft.com/office/word/2016/wordml/cid" xmlns:w16="http://schemas.microsoft.com/office/word/2018/wordml" xmlns:w16sdtdh="http://schemas.microsoft.com/office/word/2020/wordml/sdtdatahash" xmlns:w16sdtfl="http://schemas.microsoft.com/office/word/2024/wordml/sdtformatlock" xmlns:w16se="http://schemas.microsoft.com/office/word/2015/wordml/symex" xmlns:w16du="http://schemas.microsoft.com/office/word/2023/wordml/word16du" xmlns:wne="http://schemas.microsoft.com/office/word/2006/wordml" mc:Ignorable="w14 w15 w16se w16cid w16 w16cex w16sdtdh w16sdtfl w16du wp14">
   <w:body>
     <w:p>
       <w:pPr>
@@ -49,7 +49,7 @@
           <w:sz w:val="24"/>
           <w:szCs w:val="24"/>
         </w:rPr>
-        <w:t>4</w:t>
+        <w:t>2</w:t>
       </w:r>
       <w:r>
         <w:rPr>
@@ -949,27 +949,7 @@
           <w:sz w:val="24"/>
           <w:szCs w:val="24"/>
         </w:rPr>
-        <w:t xml:space="preserve">, D. Prinster, C. </w:t>
-      </w:r>
-      <w:proofErr w:type="spellStart"/>
-      <w:r>
-        <w:rPr>
-          <w:rFonts w:ascii="Times New Roman" w:hAnsi="Times New Roman" w:cs="Times New Roman"/>
-          <w:bCs/>
-          <w:sz w:val="24"/>
-          <w:szCs w:val="24"/>
-        </w:rPr>
-        <w:t>Fannjiang</w:t>
-      </w:r>
-      <w:proofErr w:type="spellEnd"/>
-      <w:r>
-        <w:rPr>
-          <w:rFonts w:ascii="Times New Roman" w:hAnsi="Times New Roman" w:cs="Times New Roman"/>
-          <w:bCs/>
-          <w:sz w:val="24"/>
-          <w:szCs w:val="24"/>
-        </w:rPr>
-        <w:t xml:space="preserve">, G. Scalia, A. Regev, H. Wang. </w:t>
+        <w:t xml:space="preserve">, D. Prinster, C. Fannjiang, G. Scalia, A. Regev, H. Wang. </w:t>
       </w:r>
       <w:r>
         <w:rPr>
@@ -1009,30 +989,18 @@
         </w:rPr>
         <w:t>(</w:t>
       </w:r>
-      <w:proofErr w:type="spellStart"/>
-      <w:r>
-        <w:fldChar w:fldCharType="begin"/>
-      </w:r>
-      <w:r>
-        <w:instrText>HYPERLINK "https://arxiv.org/abs/2512.03109"</w:instrText>
-      </w:r>
-      <w:r>
-        <w:fldChar w:fldCharType="separate"/>
-      </w:r>
-      <w:r>
-        <w:rPr>
-          <w:rStyle w:val="Hyperlink"/>
-          <w:rFonts w:ascii="Times New Roman" w:hAnsi="Times New Roman" w:cs="Times New Roman"/>
-          <w:bCs/>
-          <w:sz w:val="24"/>
-          <w:szCs w:val="24"/>
-        </w:rPr>
-        <w:t>arxiv</w:t>
-      </w:r>
-      <w:proofErr w:type="spellEnd"/>
-      <w:r>
-        <w:fldChar w:fldCharType="end"/>
-      </w:r>
+      <w:hyperlink r:id="rId9" w:history="1">
+        <w:r>
+          <w:rPr>
+            <w:rStyle w:val="Hyperlink"/>
+            <w:rFonts w:ascii="Times New Roman" w:hAnsi="Times New Roman" w:cs="Times New Roman"/>
+            <w:bCs/>
+            <w:sz w:val="24"/>
+            <w:szCs w:val="24"/>
+          </w:rPr>
+          <w:t>arxiv</w:t>
+        </w:r>
+      </w:hyperlink>
       <w:r>
         <w:rPr>
           <w:rFonts w:ascii="Times New Roman" w:hAnsi="Times New Roman" w:cs="Times New Roman"/>
@@ -1096,47 +1064,7 @@
           <w:sz w:val="24"/>
           <w:szCs w:val="24"/>
         </w:rPr>
-        <w:t xml:space="preserve">, S. </w:t>
-      </w:r>
-      <w:proofErr w:type="spellStart"/>
-      <w:r>
-        <w:rPr>
-          <w:rFonts w:ascii="Times New Roman" w:hAnsi="Times New Roman" w:cs="Times New Roman"/>
-          <w:bCs/>
-          <w:sz w:val="24"/>
-          <w:szCs w:val="24"/>
-        </w:rPr>
-        <w:t>Dandapanthula</w:t>
-      </w:r>
-      <w:proofErr w:type="spellEnd"/>
-      <w:r>
-        <w:rPr>
-          <w:rFonts w:ascii="Times New Roman" w:hAnsi="Times New Roman" w:cs="Times New Roman"/>
-          <w:bCs/>
-          <w:sz w:val="24"/>
-          <w:szCs w:val="24"/>
-        </w:rPr>
-        <w:t xml:space="preserve">, S. Khan, M. Oberst, B. Berger, A. </w:t>
-      </w:r>
-      <w:proofErr w:type="spellStart"/>
-      <w:r>
-        <w:rPr>
-          <w:rFonts w:ascii="Times New Roman" w:hAnsi="Times New Roman" w:cs="Times New Roman"/>
-          <w:bCs/>
-          <w:sz w:val="24"/>
-          <w:szCs w:val="24"/>
-        </w:rPr>
-        <w:t>Chouldechova</w:t>
-      </w:r>
-      <w:proofErr w:type="spellEnd"/>
-      <w:r>
-        <w:rPr>
-          <w:rFonts w:ascii="Times New Roman" w:hAnsi="Times New Roman" w:cs="Times New Roman"/>
-          <w:bCs/>
-          <w:sz w:val="24"/>
-          <w:szCs w:val="24"/>
-        </w:rPr>
-        <w:t xml:space="preserve">. </w:t>
+        <w:t xml:space="preserve">, S. Dandapanthula, S. Khan, M. Oberst, B. Berger, A. Chouldechova. </w:t>
       </w:r>
       <w:r>
         <w:rPr>
@@ -1202,69 +1130,40 @@
         <w:rPr>
           <w:rFonts w:ascii="Times New Roman" w:hAnsi="Times New Roman" w:cs="Times New Roman"/>
           <w:bCs/>
-          <w:sz w:val="24"/>
-          <w:szCs w:val="24"/>
-        </w:rPr>
-      </w:pPr>
-      <w:r>
-        <w:rPr>
-          <w:rFonts w:ascii="Times New Roman" w:hAnsi="Times New Roman" w:cs="Times New Roman"/>
-          <w:bCs/>
-          <w:sz w:val="24"/>
-          <w:szCs w:val="24"/>
-        </w:rPr>
-        <w:t>[w</w:t>
-      </w:r>
-      <w:r>
-        <w:rPr>
-          <w:rFonts w:ascii="Times New Roman" w:hAnsi="Times New Roman" w:cs="Times New Roman"/>
-          <w:bCs/>
-          <w:sz w:val="24"/>
-          <w:szCs w:val="24"/>
-        </w:rPr>
-        <w:t xml:space="preserve">] O. Gujral, </w:t>
-      </w:r>
-      <w:r>
-        <w:rPr>
-          <w:rFonts w:ascii="Times New Roman" w:hAnsi="Times New Roman" w:cs="Times New Roman"/>
-          <w:bCs/>
-          <w:sz w:val="24"/>
-          <w:szCs w:val="24"/>
-          <w:u w:val="single"/>
-        </w:rPr>
-        <w:t>S. Sadhuka</w:t>
-      </w:r>
-      <w:r>
-        <w:rPr>
-          <w:rFonts w:ascii="Times New Roman" w:hAnsi="Times New Roman" w:cs="Times New Roman"/>
-          <w:bCs/>
-          <w:sz w:val="24"/>
-          <w:szCs w:val="24"/>
-        </w:rPr>
-        <w:t>, B. Berger</w:t>
-      </w:r>
-      <w:r>
-        <w:rPr>
-          <w:rFonts w:ascii="Times New Roman" w:hAnsi="Times New Roman" w:cs="Times New Roman"/>
-          <w:bCs/>
-          <w:sz w:val="24"/>
-          <w:szCs w:val="24"/>
-        </w:rPr>
-        <w:t xml:space="preserve">. </w:t>
-      </w:r>
-      <w:proofErr w:type="spellStart"/>
-      <w:r>
-        <w:rPr>
-          <w:rFonts w:ascii="Times New Roman" w:hAnsi="Times New Roman" w:cs="Times New Roman"/>
-          <w:bCs/>
           <w:i/>
           <w:iCs/>
           <w:sz w:val="24"/>
           <w:szCs w:val="24"/>
         </w:rPr>
-        <w:t>Crosscoders</w:t>
-      </w:r>
-      <w:proofErr w:type="spellEnd"/>
+      </w:pPr>
+      <w:r>
+        <w:rPr>
+          <w:rFonts w:ascii="Times New Roman" w:hAnsi="Times New Roman" w:cs="Times New Roman"/>
+          <w:bCs/>
+          <w:sz w:val="24"/>
+          <w:szCs w:val="24"/>
+        </w:rPr>
+        <w:t xml:space="preserve">[w] S. Dandapanthula, </w:t>
+      </w:r>
+      <w:r>
+        <w:rPr>
+          <w:rFonts w:ascii="Times New Roman" w:hAnsi="Times New Roman" w:cs="Times New Roman"/>
+          <w:bCs/>
+          <w:sz w:val="24"/>
+          <w:szCs w:val="24"/>
+          <w:u w:val="single"/>
+        </w:rPr>
+        <w:t>S. Sadhuka</w:t>
+      </w:r>
+      <w:r>
+        <w:rPr>
+          <w:rFonts w:ascii="Times New Roman" w:hAnsi="Times New Roman" w:cs="Times New Roman"/>
+          <w:bCs/>
+          <w:sz w:val="24"/>
+          <w:szCs w:val="24"/>
+        </w:rPr>
+        <w:t xml:space="preserve">, S. Khan, M. Oberst, A. Ramdas, A. Chouldechova. </w:t>
+      </w:r>
       <w:r>
         <w:rPr>
           <w:rFonts w:ascii="Times New Roman" w:hAnsi="Times New Roman" w:cs="Times New Roman"/>
@@ -1274,7 +1173,90 @@
           <w:sz w:val="24"/>
           <w:szCs w:val="24"/>
         </w:rPr>
-        <w:t xml:space="preserve"> enable the interpretable comparison of protein</w:t>
+        <w:t>How to post-train on a surrogate: Envelope sampling provably mitigates reward hacking</w:t>
+      </w:r>
+      <w:r>
+        <w:rPr>
+          <w:rFonts w:ascii="Times New Roman" w:hAnsi="Times New Roman" w:cs="Times New Roman"/>
+          <w:bCs/>
+          <w:sz w:val="24"/>
+          <w:szCs w:val="24"/>
+        </w:rPr>
+        <w:t xml:space="preserve">. </w:t>
+      </w:r>
+      <w:r>
+        <w:rPr>
+          <w:rFonts w:ascii="Times New Roman" w:hAnsi="Times New Roman" w:cs="Times New Roman"/>
+          <w:bCs/>
+          <w:sz w:val="24"/>
+          <w:szCs w:val="24"/>
+        </w:rPr>
+        <w:t>Preprint 2026</w:t>
+      </w:r>
+      <w:r>
+        <w:rPr>
+          <w:rFonts w:ascii="Times New Roman" w:hAnsi="Times New Roman" w:cs="Times New Roman"/>
+          <w:bCs/>
+          <w:sz w:val="24"/>
+          <w:szCs w:val="24"/>
+        </w:rPr>
+        <w:t>.</w:t>
+      </w:r>
+    </w:p>
+    <w:p>
+      <w:pPr>
+        <w:autoSpaceDE w:val="0"/>
+        <w:autoSpaceDN w:val="0"/>
+        <w:adjustRightInd w:val="0"/>
+        <w:spacing w:after="0" w:line="240" w:lineRule="auto"/>
+        <w:rPr>
+          <w:rFonts w:ascii="Times New Roman" w:hAnsi="Times New Roman" w:cs="Times New Roman"/>
+          <w:bCs/>
+          <w:sz w:val="24"/>
+          <w:szCs w:val="24"/>
+        </w:rPr>
+      </w:pPr>
+    </w:p>
+    <w:p>
+      <w:pPr>
+        <w:autoSpaceDE w:val="0"/>
+        <w:autoSpaceDN w:val="0"/>
+        <w:adjustRightInd w:val="0"/>
+        <w:spacing w:after="0" w:line="240" w:lineRule="auto"/>
+        <w:rPr>
+          <w:rFonts w:ascii="Times New Roman" w:hAnsi="Times New Roman" w:cs="Times New Roman"/>
+          <w:bCs/>
+          <w:sz w:val="24"/>
+          <w:szCs w:val="24"/>
+        </w:rPr>
+      </w:pPr>
+      <w:r>
+        <w:rPr>
+          <w:rFonts w:ascii="Times New Roman" w:hAnsi="Times New Roman" w:cs="Times New Roman"/>
+          <w:bCs/>
+          <w:sz w:val="24"/>
+          <w:szCs w:val="24"/>
+        </w:rPr>
+        <w:t xml:space="preserve">[p] S. Balachandar, </w:t>
+      </w:r>
+      <w:r>
+        <w:rPr>
+          <w:rFonts w:ascii="Times New Roman" w:hAnsi="Times New Roman" w:cs="Times New Roman"/>
+          <w:bCs/>
+          <w:sz w:val="24"/>
+          <w:szCs w:val="24"/>
+          <w:u w:val="single"/>
+        </w:rPr>
+        <w:t>S. Sadhuka</w:t>
+      </w:r>
+      <w:r>
+        <w:rPr>
+          <w:rFonts w:ascii="Times New Roman" w:hAnsi="Times New Roman" w:cs="Times New Roman"/>
+          <w:bCs/>
+          <w:sz w:val="24"/>
+          <w:szCs w:val="24"/>
+        </w:rPr>
+        <w:t xml:space="preserve">, B. Berger, E. Pierson, N. Garg. </w:t>
       </w:r>
       <w:r>
         <w:rPr>
@@ -1285,7 +1267,72 @@
           <w:sz w:val="24"/>
           <w:szCs w:val="24"/>
         </w:rPr>
-        <w:t xml:space="preserve"> </w:t>
+        <w:t>Urban Incident Prediction with Graph Neural Networks: Integrating Government Ratings and Crowdsourced Reports</w:t>
+      </w:r>
+      <w:r>
+        <w:rPr>
+          <w:rFonts w:ascii="Times New Roman" w:hAnsi="Times New Roman" w:cs="Times New Roman"/>
+          <w:bCs/>
+          <w:sz w:val="24"/>
+          <w:szCs w:val="24"/>
+        </w:rPr>
+        <w:t>. AAAI 2026</w:t>
+      </w:r>
+    </w:p>
+    <w:p>
+      <w:pPr>
+        <w:autoSpaceDE w:val="0"/>
+        <w:autoSpaceDN w:val="0"/>
+        <w:adjustRightInd w:val="0"/>
+        <w:spacing w:after="0" w:line="240" w:lineRule="auto"/>
+        <w:rPr>
+          <w:rFonts w:ascii="Times New Roman" w:hAnsi="Times New Roman" w:cs="Times New Roman"/>
+          <w:bCs/>
+          <w:sz w:val="24"/>
+          <w:szCs w:val="24"/>
+        </w:rPr>
+      </w:pPr>
+    </w:p>
+    <w:p>
+      <w:pPr>
+        <w:autoSpaceDE w:val="0"/>
+        <w:autoSpaceDN w:val="0"/>
+        <w:adjustRightInd w:val="0"/>
+        <w:spacing w:after="0" w:line="240" w:lineRule="auto"/>
+        <w:rPr>
+          <w:rFonts w:ascii="Times New Roman" w:hAnsi="Times New Roman" w:cs="Times New Roman"/>
+          <w:bCs/>
+          <w:sz w:val="24"/>
+          <w:szCs w:val="24"/>
+        </w:rPr>
+      </w:pPr>
+      <w:r>
+        <w:rPr>
+          <w:rFonts w:ascii="Times New Roman" w:hAnsi="Times New Roman" w:cs="Times New Roman"/>
+          <w:bCs/>
+          <w:sz w:val="24"/>
+          <w:szCs w:val="24"/>
+        </w:rPr>
+        <w:t xml:space="preserve">[p] D. Shanmugam*, </w:t>
+      </w:r>
+      <w:r>
+        <w:rPr>
+          <w:rFonts w:ascii="Times New Roman" w:hAnsi="Times New Roman" w:cs="Times New Roman"/>
+          <w:bCs/>
+          <w:sz w:val="24"/>
+          <w:szCs w:val="24"/>
+          <w:u w:val="single"/>
+        </w:rPr>
+        <w:t>S. Sadhuka</w:t>
+      </w:r>
+      <w:r>
+        <w:rPr>
+          <w:rFonts w:ascii="Times New Roman" w:hAnsi="Times New Roman" w:cs="Times New Roman"/>
+          <w:bCs/>
+          <w:sz w:val="24"/>
+          <w:szCs w:val="24"/>
+        </w:rPr>
+        <w:t xml:space="preserve">*, M. Raghavan, J. Guttag, B. Berger, E. Pierson. </w:t>
       </w:r>
       <w:r>
         <w:rPr>
@@ -1296,47 +1343,74 @@
           <w:sz w:val="24"/>
           <w:szCs w:val="24"/>
         </w:rPr>
-        <w:t>language model layers</w:t>
-      </w:r>
-      <w:r>
-        <w:rPr>
-          <w:rFonts w:ascii="Times New Roman" w:hAnsi="Times New Roman" w:cs="Times New Roman"/>
-          <w:bCs/>
-          <w:sz w:val="24"/>
-          <w:szCs w:val="24"/>
-        </w:rPr>
-        <w:t xml:space="preserve">. </w:t>
-      </w:r>
-      <w:r>
-        <w:rPr>
-          <w:rFonts w:ascii="Times New Roman" w:hAnsi="Times New Roman" w:cs="Times New Roman"/>
-          <w:bCs/>
-          <w:sz w:val="24"/>
-          <w:szCs w:val="24"/>
-        </w:rPr>
-        <w:t>In progress.</w:t>
-      </w:r>
-    </w:p>
-    <w:p>
-      <w:pPr>
-        <w:autoSpaceDE w:val="0"/>
-        <w:autoSpaceDN w:val="0"/>
-        <w:adjustRightInd w:val="0"/>
-        <w:spacing w:after="0" w:line="240" w:lineRule="auto"/>
-        <w:rPr>
-          <w:rFonts w:ascii="Times New Roman" w:hAnsi="Times New Roman" w:cs="Times New Roman"/>
-          <w:bCs/>
-          <w:sz w:val="24"/>
-          <w:szCs w:val="24"/>
-        </w:rPr>
-      </w:pPr>
-    </w:p>
-    <w:p>
-      <w:pPr>
-        <w:autoSpaceDE w:val="0"/>
-        <w:autoSpaceDN w:val="0"/>
-        <w:adjustRightInd w:val="0"/>
-        <w:spacing w:after="0" w:line="240" w:lineRule="auto"/>
+        <w:t>Evaluating multiple models using labeled and unlabeled data</w:t>
+      </w:r>
+      <w:r>
+        <w:rPr>
+          <w:rFonts w:ascii="Times New Roman" w:hAnsi="Times New Roman" w:cs="Times New Roman"/>
+          <w:bCs/>
+          <w:sz w:val="24"/>
+          <w:szCs w:val="24"/>
+        </w:rPr>
+        <w:t>. NeurIPS 2025</w:t>
+      </w:r>
+    </w:p>
+    <w:p>
+      <w:pPr>
+        <w:autoSpaceDE w:val="0"/>
+        <w:autoSpaceDN w:val="0"/>
+        <w:adjustRightInd w:val="0"/>
+        <w:spacing w:after="0" w:line="240" w:lineRule="auto"/>
+        <w:rPr>
+          <w:rFonts w:ascii="Times New Roman" w:hAnsi="Times New Roman" w:cs="Times New Roman"/>
+          <w:bCs/>
+          <w:sz w:val="24"/>
+          <w:szCs w:val="24"/>
+        </w:rPr>
+      </w:pPr>
+    </w:p>
+    <w:p>
+      <w:pPr>
+        <w:autoSpaceDE w:val="0"/>
+        <w:autoSpaceDN w:val="0"/>
+        <w:adjustRightInd w:val="0"/>
+        <w:spacing w:after="0" w:line="240" w:lineRule="auto"/>
+        <w:rPr>
+          <w:rFonts w:ascii="Times New Roman" w:hAnsi="Times New Roman" w:cs="Times New Roman"/>
+          <w:bCs/>
+          <w:sz w:val="24"/>
+          <w:szCs w:val="24"/>
+        </w:rPr>
+      </w:pPr>
+      <w:r>
+        <w:rPr>
+          <w:rFonts w:ascii="Times New Roman" w:hAnsi="Times New Roman" w:cs="Times New Roman"/>
+          <w:bCs/>
+          <w:sz w:val="24"/>
+          <w:szCs w:val="24"/>
+        </w:rPr>
+        <w:t xml:space="preserve">[p] </w:t>
+      </w:r>
+      <w:r>
+        <w:rPr>
+          <w:rFonts w:ascii="Times New Roman" w:hAnsi="Times New Roman" w:cs="Times New Roman"/>
+          <w:bCs/>
+          <w:sz w:val="24"/>
+          <w:szCs w:val="24"/>
+          <w:u w:val="single"/>
+        </w:rPr>
+        <w:t>S. Sadhuka</w:t>
+      </w:r>
+      <w:r>
+        <w:rPr>
+          <w:rFonts w:ascii="Times New Roman" w:hAnsi="Times New Roman" w:cs="Times New Roman"/>
+          <w:bCs/>
+          <w:sz w:val="24"/>
+          <w:szCs w:val="24"/>
+        </w:rPr>
+        <w:t xml:space="preserve">, S. Lin, B. Berger**. E. Pierson**. </w:t>
+      </w:r>
+      <w:r>
         <w:rPr>
           <w:rFonts w:ascii="Times New Roman" w:hAnsi="Times New Roman" w:cs="Times New Roman"/>
           <w:bCs/>
@@ -1345,93 +1419,8 @@
           <w:sz w:val="24"/>
           <w:szCs w:val="24"/>
         </w:rPr>
-      </w:pPr>
-      <w:r>
-        <w:rPr>
-          <w:rFonts w:ascii="Times New Roman" w:hAnsi="Times New Roman" w:cs="Times New Roman"/>
-          <w:bCs/>
-          <w:sz w:val="24"/>
-          <w:szCs w:val="24"/>
-        </w:rPr>
-        <w:t>[w]</w:t>
-      </w:r>
-      <w:r>
-        <w:rPr>
-          <w:rFonts w:ascii="Times New Roman" w:hAnsi="Times New Roman" w:cs="Times New Roman"/>
-          <w:bCs/>
-          <w:sz w:val="24"/>
-          <w:szCs w:val="24"/>
-        </w:rPr>
-        <w:t xml:space="preserve"> S. </w:t>
-      </w:r>
-      <w:proofErr w:type="spellStart"/>
-      <w:r>
-        <w:rPr>
-          <w:rFonts w:ascii="Times New Roman" w:hAnsi="Times New Roman" w:cs="Times New Roman"/>
-          <w:bCs/>
-          <w:sz w:val="24"/>
-          <w:szCs w:val="24"/>
-        </w:rPr>
-        <w:t>Dandapanthula</w:t>
-      </w:r>
-      <w:proofErr w:type="spellEnd"/>
-      <w:r>
-        <w:rPr>
-          <w:rFonts w:ascii="Times New Roman" w:hAnsi="Times New Roman" w:cs="Times New Roman"/>
-          <w:bCs/>
-          <w:sz w:val="24"/>
-          <w:szCs w:val="24"/>
-        </w:rPr>
-        <w:t xml:space="preserve">, </w:t>
-      </w:r>
-      <w:r>
-        <w:rPr>
-          <w:rFonts w:ascii="Times New Roman" w:hAnsi="Times New Roman" w:cs="Times New Roman"/>
-          <w:bCs/>
-          <w:sz w:val="24"/>
-          <w:szCs w:val="24"/>
-          <w:u w:val="single"/>
-        </w:rPr>
-        <w:t>S. Sadhuka</w:t>
-      </w:r>
-      <w:r>
-        <w:rPr>
-          <w:rFonts w:ascii="Times New Roman" w:hAnsi="Times New Roman" w:cs="Times New Roman"/>
-          <w:bCs/>
-          <w:sz w:val="24"/>
-          <w:szCs w:val="24"/>
-        </w:rPr>
-        <w:t>, S. Khan</w:t>
-      </w:r>
-      <w:r>
-        <w:rPr>
-          <w:rFonts w:ascii="Times New Roman" w:hAnsi="Times New Roman" w:cs="Times New Roman"/>
-          <w:bCs/>
-          <w:sz w:val="24"/>
-          <w:szCs w:val="24"/>
-        </w:rPr>
-        <w:t xml:space="preserve">, </w:t>
-      </w:r>
-      <w:r>
-        <w:rPr>
-          <w:rFonts w:ascii="Times New Roman" w:hAnsi="Times New Roman" w:cs="Times New Roman"/>
-          <w:bCs/>
-          <w:sz w:val="24"/>
-          <w:szCs w:val="24"/>
-        </w:rPr>
-        <w:t xml:space="preserve">M. Oberst, A. Ramdas, A. </w:t>
-      </w:r>
-      <w:proofErr w:type="spellStart"/>
-      <w:r>
-        <w:rPr>
-          <w:rFonts w:ascii="Times New Roman" w:hAnsi="Times New Roman" w:cs="Times New Roman"/>
-          <w:bCs/>
-          <w:sz w:val="24"/>
-          <w:szCs w:val="24"/>
-        </w:rPr>
-        <w:t>Chouldechova</w:t>
-      </w:r>
-      <w:proofErr w:type="spellEnd"/>
+        <w:t>A Bayesian Model for Multi-stage Censoring</w:t>
+      </w:r>
       <w:r>
         <w:rPr>
           <w:rFonts w:ascii="Times New Roman" w:hAnsi="Times New Roman" w:cs="Times New Roman"/>
@@ -1440,6 +1429,87 @@
           <w:szCs w:val="24"/>
         </w:rPr>
         <w:t xml:space="preserve">. </w:t>
+      </w:r>
+      <w:r>
+        <w:rPr>
+          <w:rFonts w:ascii="Times New Roman" w:hAnsi="Times New Roman" w:cs="Times New Roman"/>
+          <w:bCs/>
+          <w:sz w:val="24"/>
+          <w:szCs w:val="24"/>
+        </w:rPr>
+        <w:t>ML4H 2025</w:t>
+      </w:r>
+      <w:r>
+        <w:rPr>
+          <w:rFonts w:ascii="Times New Roman" w:hAnsi="Times New Roman" w:cs="Times New Roman"/>
+          <w:bCs/>
+          <w:sz w:val="24"/>
+          <w:szCs w:val="24"/>
+        </w:rPr>
+        <w:t xml:space="preserve"> (proceedings</w:t>
+      </w:r>
+      <w:r>
+        <w:rPr>
+          <w:rFonts w:ascii="Times New Roman" w:hAnsi="Times New Roman" w:cs="Times New Roman"/>
+          <w:bCs/>
+          <w:sz w:val="24"/>
+          <w:szCs w:val="24"/>
+        </w:rPr>
+        <w:t xml:space="preserve"> track</w:t>
+      </w:r>
+      <w:r>
+        <w:rPr>
+          <w:rFonts w:ascii="Times New Roman" w:hAnsi="Times New Roman" w:cs="Times New Roman"/>
+          <w:bCs/>
+          <w:sz w:val="24"/>
+          <w:szCs w:val="24"/>
+        </w:rPr>
+        <w:t>)</w:t>
+      </w:r>
+      <w:r>
+        <w:rPr>
+          <w:rFonts w:ascii="Times New Roman" w:hAnsi="Times New Roman" w:cs="Times New Roman"/>
+          <w:bCs/>
+          <w:sz w:val="24"/>
+          <w:szCs w:val="24"/>
+        </w:rPr>
+        <w:t xml:space="preserve">, also </w:t>
+      </w:r>
+      <w:r>
+        <w:rPr>
+          <w:rFonts w:ascii="Times New Roman" w:hAnsi="Times New Roman" w:cs="Times New Roman"/>
+          <w:b/>
+          <w:sz w:val="24"/>
+          <w:szCs w:val="24"/>
+        </w:rPr>
+        <w:t xml:space="preserve">spotlight presentation </w:t>
+      </w:r>
+      <w:r>
+        <w:rPr>
+          <w:rFonts w:ascii="Times New Roman" w:hAnsi="Times New Roman" w:cs="Times New Roman"/>
+          <w:b/>
+          <w:sz w:val="24"/>
+          <w:szCs w:val="24"/>
+        </w:rPr>
+        <w:t>at</w:t>
+      </w:r>
+      <w:r>
+        <w:rPr>
+          <w:rFonts w:ascii="Times New Roman" w:hAnsi="Times New Roman" w:cs="Times New Roman"/>
+          <w:b/>
+          <w:sz w:val="24"/>
+          <w:szCs w:val="24"/>
+        </w:rPr>
+        <w:t xml:space="preserve"> </w:t>
+      </w:r>
+      <w:r>
+        <w:rPr>
+          <w:rFonts w:ascii="Times New Roman" w:hAnsi="Times New Roman" w:cs="Times New Roman"/>
+          <w:bCs/>
+          <w:sz w:val="24"/>
+          <w:szCs w:val="24"/>
+        </w:rPr>
+        <w:t>ML4H</w:t>
       </w:r>
       <w:r>
         <w:rPr>
@@ -1450,7 +1520,91 @@
           <w:sz w:val="24"/>
           <w:szCs w:val="24"/>
         </w:rPr>
-        <w:t>How to post-train on a surrogate: Envelope sampling provably mitigates reward hacking</w:t>
+        <w:t xml:space="preserve"> </w:t>
+      </w:r>
+      <w:r>
+        <w:rPr>
+          <w:rFonts w:ascii="Times New Roman" w:hAnsi="Times New Roman" w:cs="Times New Roman"/>
+          <w:bCs/>
+          <w:sz w:val="24"/>
+          <w:szCs w:val="24"/>
+        </w:rPr>
+        <w:t>2024 (findings track)</w:t>
+      </w:r>
+    </w:p>
+    <w:p>
+      <w:pPr>
+        <w:autoSpaceDE w:val="0"/>
+        <w:autoSpaceDN w:val="0"/>
+        <w:adjustRightInd w:val="0"/>
+        <w:spacing w:after="0" w:line="240" w:lineRule="auto"/>
+        <w:rPr>
+          <w:rFonts w:ascii="Times New Roman" w:hAnsi="Times New Roman" w:cs="Times New Roman"/>
+          <w:bCs/>
+          <w:sz w:val="24"/>
+          <w:szCs w:val="24"/>
+        </w:rPr>
+      </w:pPr>
+    </w:p>
+    <w:p>
+      <w:pPr>
+        <w:autoSpaceDE w:val="0"/>
+        <w:autoSpaceDN w:val="0"/>
+        <w:adjustRightInd w:val="0"/>
+        <w:spacing w:after="0" w:line="240" w:lineRule="auto"/>
+        <w:rPr>
+          <w:rFonts w:ascii="Times New Roman" w:hAnsi="Times New Roman" w:cs="Times New Roman"/>
+          <w:bCs/>
+          <w:sz w:val="24"/>
+          <w:szCs w:val="24"/>
+        </w:rPr>
+      </w:pPr>
+      <w:r>
+        <w:rPr>
+          <w:rFonts w:ascii="Times New Roman" w:hAnsi="Times New Roman" w:cs="Times New Roman"/>
+          <w:bCs/>
+          <w:sz w:val="24"/>
+          <w:szCs w:val="24"/>
+        </w:rPr>
+        <w:lastRenderedPageBreak/>
+        <w:t xml:space="preserve">[p] </w:t>
+      </w:r>
+      <w:r>
+        <w:rPr>
+          <w:rFonts w:ascii="Times New Roman" w:hAnsi="Times New Roman" w:cs="Times New Roman"/>
+          <w:bCs/>
+          <w:sz w:val="24"/>
+          <w:szCs w:val="24"/>
+        </w:rPr>
+        <w:t xml:space="preserve">H. Cho, D. Froelicher*, N. Dokmai*, A. Nandi*, </w:t>
+      </w:r>
+      <w:r>
+        <w:rPr>
+          <w:rFonts w:ascii="Times New Roman" w:hAnsi="Times New Roman" w:cs="Times New Roman"/>
+          <w:bCs/>
+          <w:sz w:val="24"/>
+          <w:szCs w:val="24"/>
+          <w:u w:val="single"/>
+        </w:rPr>
+        <w:t>S. Sadhuka</w:t>
+      </w:r>
+      <w:r>
+        <w:rPr>
+          <w:rFonts w:ascii="Times New Roman" w:hAnsi="Times New Roman" w:cs="Times New Roman"/>
+          <w:bCs/>
+          <w:sz w:val="24"/>
+          <w:szCs w:val="24"/>
+        </w:rPr>
+        <w:t xml:space="preserve">*, </w:t>
+      </w:r>
+      <w:r>
+        <w:rPr>
+          <w:rFonts w:ascii="Times New Roman" w:hAnsi="Times New Roman" w:cs="Times New Roman"/>
+          <w:bCs/>
+          <w:sz w:val="24"/>
+          <w:szCs w:val="24"/>
+        </w:rPr>
+        <w:t>M. Hong*, B. Berger</w:t>
       </w:r>
       <w:r>
         <w:rPr>
@@ -1460,71 +1614,6 @@
           <w:szCs w:val="24"/>
         </w:rPr>
         <w:t xml:space="preserve">. </w:t>
-      </w:r>
-      <w:r>
-        <w:rPr>
-          <w:rFonts w:ascii="Times New Roman" w:hAnsi="Times New Roman" w:cs="Times New Roman"/>
-          <w:bCs/>
-          <w:sz w:val="24"/>
-          <w:szCs w:val="24"/>
-        </w:rPr>
-        <w:t>In progress.</w:t>
-      </w:r>
-    </w:p>
-    <w:p>
-      <w:pPr>
-        <w:autoSpaceDE w:val="0"/>
-        <w:autoSpaceDN w:val="0"/>
-        <w:adjustRightInd w:val="0"/>
-        <w:spacing w:after="0" w:line="240" w:lineRule="auto"/>
-        <w:rPr>
-          <w:rFonts w:ascii="Times New Roman" w:hAnsi="Times New Roman" w:cs="Times New Roman"/>
-          <w:bCs/>
-          <w:sz w:val="24"/>
-          <w:szCs w:val="24"/>
-        </w:rPr>
-      </w:pPr>
-    </w:p>
-    <w:p>
-      <w:pPr>
-        <w:autoSpaceDE w:val="0"/>
-        <w:autoSpaceDN w:val="0"/>
-        <w:adjustRightInd w:val="0"/>
-        <w:spacing w:after="0" w:line="240" w:lineRule="auto"/>
-        <w:rPr>
-          <w:rFonts w:ascii="Times New Roman" w:hAnsi="Times New Roman" w:cs="Times New Roman"/>
-          <w:bCs/>
-          <w:sz w:val="24"/>
-          <w:szCs w:val="24"/>
-        </w:rPr>
-      </w:pPr>
-      <w:r>
-        <w:rPr>
-          <w:rFonts w:ascii="Times New Roman" w:hAnsi="Times New Roman" w:cs="Times New Roman"/>
-          <w:bCs/>
-          <w:sz w:val="24"/>
-          <w:szCs w:val="24"/>
-        </w:rPr>
-        <w:t xml:space="preserve">[p] S. Balachandar, </w:t>
-      </w:r>
-      <w:r>
-        <w:rPr>
-          <w:rFonts w:ascii="Times New Roman" w:hAnsi="Times New Roman" w:cs="Times New Roman"/>
-          <w:bCs/>
-          <w:sz w:val="24"/>
-          <w:szCs w:val="24"/>
-          <w:u w:val="single"/>
-        </w:rPr>
-        <w:t>S. Sadhuka</w:t>
-      </w:r>
-      <w:r>
-        <w:rPr>
-          <w:rFonts w:ascii="Times New Roman" w:hAnsi="Times New Roman" w:cs="Times New Roman"/>
-          <w:bCs/>
-          <w:sz w:val="24"/>
-          <w:szCs w:val="24"/>
-        </w:rPr>
-        <w:t xml:space="preserve">, B. Berger, E. Pierson, N. Garg. </w:t>
       </w:r>
       <w:r>
         <w:rPr>
@@ -1535,72 +1624,16 @@
           <w:sz w:val="24"/>
           <w:szCs w:val="24"/>
         </w:rPr>
-        <w:t>Urban Incident Prediction with Graph Neural Networks: Integrating Government Ratings and Crowdsourced Reports</w:t>
-      </w:r>
-      <w:r>
-        <w:rPr>
-          <w:rFonts w:ascii="Times New Roman" w:hAnsi="Times New Roman" w:cs="Times New Roman"/>
-          <w:bCs/>
-          <w:sz w:val="24"/>
-          <w:szCs w:val="24"/>
-        </w:rPr>
-        <w:t>. AAAI 2026</w:t>
-      </w:r>
-    </w:p>
-    <w:p>
-      <w:pPr>
-        <w:autoSpaceDE w:val="0"/>
-        <w:autoSpaceDN w:val="0"/>
-        <w:adjustRightInd w:val="0"/>
-        <w:spacing w:after="0" w:line="240" w:lineRule="auto"/>
-        <w:rPr>
-          <w:rFonts w:ascii="Times New Roman" w:hAnsi="Times New Roman" w:cs="Times New Roman"/>
-          <w:bCs/>
-          <w:sz w:val="24"/>
-          <w:szCs w:val="24"/>
-        </w:rPr>
-      </w:pPr>
-    </w:p>
-    <w:p>
-      <w:pPr>
-        <w:autoSpaceDE w:val="0"/>
-        <w:autoSpaceDN w:val="0"/>
-        <w:adjustRightInd w:val="0"/>
-        <w:spacing w:after="0" w:line="240" w:lineRule="auto"/>
-        <w:rPr>
-          <w:rFonts w:ascii="Times New Roman" w:hAnsi="Times New Roman" w:cs="Times New Roman"/>
-          <w:bCs/>
-          <w:sz w:val="24"/>
-          <w:szCs w:val="24"/>
-        </w:rPr>
-      </w:pPr>
-      <w:r>
-        <w:rPr>
-          <w:rFonts w:ascii="Times New Roman" w:hAnsi="Times New Roman" w:cs="Times New Roman"/>
-          <w:bCs/>
-          <w:sz w:val="24"/>
-          <w:szCs w:val="24"/>
-        </w:rPr>
-        <w:t xml:space="preserve">[p] D. Shanmugam*, </w:t>
-      </w:r>
-      <w:r>
-        <w:rPr>
-          <w:rFonts w:ascii="Times New Roman" w:hAnsi="Times New Roman" w:cs="Times New Roman"/>
-          <w:bCs/>
-          <w:sz w:val="24"/>
-          <w:szCs w:val="24"/>
-          <w:u w:val="single"/>
-        </w:rPr>
-        <w:t>S. Sadhuka</w:t>
-      </w:r>
-      <w:r>
-        <w:rPr>
-          <w:rFonts w:ascii="Times New Roman" w:hAnsi="Times New Roman" w:cs="Times New Roman"/>
-          <w:bCs/>
-          <w:sz w:val="24"/>
-          <w:szCs w:val="24"/>
-        </w:rPr>
-        <w:t xml:space="preserve">*, M. Raghavan, J. Guttag, B. Berger, E. Pierson. </w:t>
+        <w:t>Privacy-Enhancing Technologies in Biomedical Data Science</w:t>
+      </w:r>
+      <w:r>
+        <w:rPr>
+          <w:rFonts w:ascii="Times New Roman" w:hAnsi="Times New Roman" w:cs="Times New Roman"/>
+          <w:bCs/>
+          <w:sz w:val="24"/>
+          <w:szCs w:val="24"/>
+        </w:rPr>
+        <w:t xml:space="preserve">. </w:t>
       </w:r>
       <w:r>
         <w:rPr>
@@ -1611,7 +1644,108 @@
           <w:sz w:val="24"/>
           <w:szCs w:val="24"/>
         </w:rPr>
-        <w:t>Evaluating multiple models using labeled and unlabeled data</w:t>
+        <w:t xml:space="preserve">Annual Reviews in Biomedical Data Science </w:t>
+      </w:r>
+      <w:r>
+        <w:rPr>
+          <w:rFonts w:ascii="Times New Roman" w:hAnsi="Times New Roman" w:cs="Times New Roman"/>
+          <w:bCs/>
+          <w:sz w:val="24"/>
+          <w:szCs w:val="24"/>
+        </w:rPr>
+        <w:t>2024</w:t>
+      </w:r>
+      <w:r>
+        <w:rPr>
+          <w:rFonts w:ascii="Times New Roman" w:hAnsi="Times New Roman" w:cs="Times New Roman"/>
+          <w:bCs/>
+          <w:sz w:val="24"/>
+          <w:szCs w:val="24"/>
+        </w:rPr>
+        <w:t xml:space="preserve"> Vol</w:t>
+      </w:r>
+      <w:r>
+        <w:rPr>
+          <w:rFonts w:ascii="Times New Roman" w:hAnsi="Times New Roman" w:cs="Times New Roman"/>
+          <w:bCs/>
+          <w:sz w:val="24"/>
+          <w:szCs w:val="24"/>
+        </w:rPr>
+        <w:t>.</w:t>
+      </w:r>
+      <w:r>
+        <w:rPr>
+          <w:rFonts w:ascii="Times New Roman" w:hAnsi="Times New Roman" w:cs="Times New Roman"/>
+          <w:bCs/>
+          <w:sz w:val="24"/>
+          <w:szCs w:val="24"/>
+        </w:rPr>
+        <w:t xml:space="preserve"> 7, Issue 1, pp. 317-343</w:t>
+      </w:r>
+    </w:p>
+    <w:p>
+      <w:pPr>
+        <w:autoSpaceDE w:val="0"/>
+        <w:autoSpaceDN w:val="0"/>
+        <w:adjustRightInd w:val="0"/>
+        <w:spacing w:after="0" w:line="240" w:lineRule="auto"/>
+        <w:rPr>
+          <w:rFonts w:ascii="Times New Roman" w:hAnsi="Times New Roman" w:cs="Times New Roman"/>
+          <w:bCs/>
+          <w:sz w:val="24"/>
+          <w:szCs w:val="24"/>
+        </w:rPr>
+      </w:pPr>
+    </w:p>
+    <w:p>
+      <w:pPr>
+        <w:autoSpaceDE w:val="0"/>
+        <w:autoSpaceDN w:val="0"/>
+        <w:adjustRightInd w:val="0"/>
+        <w:spacing w:after="0" w:line="240" w:lineRule="auto"/>
+        <w:rPr>
+          <w:rFonts w:ascii="Times New Roman" w:hAnsi="Times New Roman" w:cs="Times New Roman"/>
+          <w:bCs/>
+          <w:sz w:val="24"/>
+          <w:szCs w:val="24"/>
+        </w:rPr>
+      </w:pPr>
+      <w:r>
+        <w:rPr>
+          <w:rFonts w:ascii="Times New Roman" w:hAnsi="Times New Roman" w:cs="Times New Roman"/>
+          <w:bCs/>
+          <w:sz w:val="24"/>
+          <w:szCs w:val="24"/>
+        </w:rPr>
+        <w:t xml:space="preserve">[p] </w:t>
+      </w:r>
+      <w:r>
+        <w:rPr>
+          <w:rFonts w:ascii="Times New Roman" w:hAnsi="Times New Roman" w:cs="Times New Roman"/>
+          <w:bCs/>
+          <w:sz w:val="24"/>
+          <w:szCs w:val="24"/>
+          <w:u w:val="single"/>
+        </w:rPr>
+        <w:t>S. Sadhuka</w:t>
+      </w:r>
+      <w:r>
+        <w:rPr>
+          <w:rFonts w:ascii="Times New Roman" w:hAnsi="Times New Roman" w:cs="Times New Roman"/>
+          <w:bCs/>
+          <w:sz w:val="24"/>
+          <w:szCs w:val="24"/>
+        </w:rPr>
+        <w:t xml:space="preserve">, D. Fridman, </w:t>
+      </w:r>
+      <w:r>
+        <w:rPr>
+          <w:rFonts w:ascii="Times New Roman" w:hAnsi="Times New Roman" w:cs="Times New Roman"/>
+          <w:bCs/>
+          <w:sz w:val="24"/>
+          <w:szCs w:val="24"/>
+        </w:rPr>
+        <w:t>B. Berger, H. Cho</w:t>
       </w:r>
       <w:r>
         <w:rPr>
@@ -1621,83 +1755,6 @@
           <w:szCs w:val="24"/>
         </w:rPr>
         <w:t xml:space="preserve">. </w:t>
-      </w:r>
-      <w:proofErr w:type="spellStart"/>
-      <w:r>
-        <w:rPr>
-          <w:rFonts w:ascii="Times New Roman" w:hAnsi="Times New Roman" w:cs="Times New Roman"/>
-          <w:bCs/>
-          <w:sz w:val="24"/>
-          <w:szCs w:val="24"/>
-        </w:rPr>
-        <w:t>NeurIPS</w:t>
-      </w:r>
-      <w:proofErr w:type="spellEnd"/>
-      <w:r>
-        <w:rPr>
-          <w:rFonts w:ascii="Times New Roman" w:hAnsi="Times New Roman" w:cs="Times New Roman"/>
-          <w:bCs/>
-          <w:sz w:val="24"/>
-          <w:szCs w:val="24"/>
-        </w:rPr>
-        <w:t xml:space="preserve"> 2025</w:t>
-      </w:r>
-    </w:p>
-    <w:p>
-      <w:pPr>
-        <w:autoSpaceDE w:val="0"/>
-        <w:autoSpaceDN w:val="0"/>
-        <w:adjustRightInd w:val="0"/>
-        <w:spacing w:after="0" w:line="240" w:lineRule="auto"/>
-        <w:rPr>
-          <w:rFonts w:ascii="Times New Roman" w:hAnsi="Times New Roman" w:cs="Times New Roman"/>
-          <w:bCs/>
-          <w:sz w:val="24"/>
-          <w:szCs w:val="24"/>
-        </w:rPr>
-      </w:pPr>
-    </w:p>
-    <w:p>
-      <w:pPr>
-        <w:autoSpaceDE w:val="0"/>
-        <w:autoSpaceDN w:val="0"/>
-        <w:adjustRightInd w:val="0"/>
-        <w:spacing w:after="0" w:line="240" w:lineRule="auto"/>
-        <w:rPr>
-          <w:rFonts w:ascii="Times New Roman" w:hAnsi="Times New Roman" w:cs="Times New Roman"/>
-          <w:bCs/>
-          <w:sz w:val="24"/>
-          <w:szCs w:val="24"/>
-        </w:rPr>
-      </w:pPr>
-      <w:r>
-        <w:rPr>
-          <w:rFonts w:ascii="Times New Roman" w:hAnsi="Times New Roman" w:cs="Times New Roman"/>
-          <w:bCs/>
-          <w:sz w:val="24"/>
-          <w:szCs w:val="24"/>
-        </w:rPr>
-        <w:lastRenderedPageBreak/>
-        <w:t xml:space="preserve">[p] </w:t>
-      </w:r>
-      <w:r>
-        <w:rPr>
-          <w:rFonts w:ascii="Times New Roman" w:hAnsi="Times New Roman" w:cs="Times New Roman"/>
-          <w:bCs/>
-          <w:sz w:val="24"/>
-          <w:szCs w:val="24"/>
-          <w:u w:val="single"/>
-        </w:rPr>
-        <w:t>S. Sadhuka</w:t>
-      </w:r>
-      <w:r>
-        <w:rPr>
-          <w:rFonts w:ascii="Times New Roman" w:hAnsi="Times New Roman" w:cs="Times New Roman"/>
-          <w:bCs/>
-          <w:sz w:val="24"/>
-          <w:szCs w:val="24"/>
-        </w:rPr>
-        <w:t xml:space="preserve">, S. Lin, B. Berger**. E. Pierson**. </w:t>
       </w:r>
       <w:r>
         <w:rPr>
@@ -1708,7 +1765,7 @@
           <w:sz w:val="24"/>
           <w:szCs w:val="24"/>
         </w:rPr>
-        <w:t>A Bayesian Model for Multi-stage Censoring</w:t>
+        <w:t>Assessing transcriptomic reidentification risks using discriminative sequence models</w:t>
       </w:r>
       <w:r>
         <w:rPr>
@@ -1722,56 +1779,20 @@
       <w:r>
         <w:rPr>
           <w:rFonts w:ascii="Times New Roman" w:hAnsi="Times New Roman" w:cs="Times New Roman"/>
-          <w:bCs/>
-          <w:sz w:val="24"/>
-          <w:szCs w:val="24"/>
-        </w:rPr>
-        <w:t>ML4H 2025</w:t>
-      </w:r>
-      <w:r>
-        <w:rPr>
-          <w:rFonts w:ascii="Times New Roman" w:hAnsi="Times New Roman" w:cs="Times New Roman"/>
-          <w:bCs/>
-          <w:sz w:val="24"/>
-          <w:szCs w:val="24"/>
-        </w:rPr>
-        <w:t xml:space="preserve"> (proceedings</w:t>
-      </w:r>
-      <w:r>
-        <w:rPr>
-          <w:rFonts w:ascii="Times New Roman" w:hAnsi="Times New Roman" w:cs="Times New Roman"/>
-          <w:bCs/>
-          <w:sz w:val="24"/>
-          <w:szCs w:val="24"/>
-        </w:rPr>
-        <w:t xml:space="preserve"> track</w:t>
-      </w:r>
-      <w:r>
-        <w:rPr>
-          <w:rFonts w:ascii="Times New Roman" w:hAnsi="Times New Roman" w:cs="Times New Roman"/>
-          <w:bCs/>
-          <w:sz w:val="24"/>
-          <w:szCs w:val="24"/>
-        </w:rPr>
-        <w:t>)</w:t>
-      </w:r>
-      <w:r>
-        <w:rPr>
-          <w:rFonts w:ascii="Times New Roman" w:hAnsi="Times New Roman" w:cs="Times New Roman"/>
-          <w:bCs/>
-          <w:sz w:val="24"/>
-          <w:szCs w:val="24"/>
-        </w:rPr>
-        <w:t xml:space="preserve">, also </w:t>
-      </w:r>
-      <w:r>
-        <w:rPr>
-          <w:rFonts w:ascii="Times New Roman" w:hAnsi="Times New Roman" w:cs="Times New Roman"/>
-          <w:b/>
-          <w:sz w:val="24"/>
-          <w:szCs w:val="24"/>
-        </w:rPr>
-        <w:t xml:space="preserve">spotlight presentation </w:t>
+          <w:b/>
+          <w:sz w:val="24"/>
+          <w:szCs w:val="24"/>
+        </w:rPr>
+        <w:t>oral presentation</w:t>
+      </w:r>
+      <w:r>
+        <w:rPr>
+          <w:rFonts w:ascii="Times New Roman" w:hAnsi="Times New Roman" w:cs="Times New Roman"/>
+          <w:bCs/>
+          <w:sz w:val="24"/>
+          <w:szCs w:val="24"/>
+        </w:rPr>
+        <w:t xml:space="preserve"> </w:t>
       </w:r>
       <w:r>
         <w:rPr>
@@ -1798,7 +1819,7 @@
           <w:sz w:val="24"/>
           <w:szCs w:val="24"/>
         </w:rPr>
-        <w:t>ML4H</w:t>
+        <w:t>RECOMB</w:t>
       </w:r>
       <w:r>
         <w:rPr>
@@ -1818,110 +1839,16 @@
           <w:sz w:val="24"/>
           <w:szCs w:val="24"/>
         </w:rPr>
-        <w:t>2024 (findings track)</w:t>
-      </w:r>
-    </w:p>
-    <w:p>
-      <w:pPr>
-        <w:autoSpaceDE w:val="0"/>
-        <w:autoSpaceDN w:val="0"/>
-        <w:adjustRightInd w:val="0"/>
-        <w:spacing w:after="0" w:line="240" w:lineRule="auto"/>
-        <w:rPr>
-          <w:rFonts w:ascii="Times New Roman" w:hAnsi="Times New Roman" w:cs="Times New Roman"/>
-          <w:bCs/>
-          <w:sz w:val="24"/>
-          <w:szCs w:val="24"/>
-        </w:rPr>
-      </w:pPr>
-    </w:p>
-    <w:p>
-      <w:pPr>
-        <w:autoSpaceDE w:val="0"/>
-        <w:autoSpaceDN w:val="0"/>
-        <w:adjustRightInd w:val="0"/>
-        <w:spacing w:after="0" w:line="240" w:lineRule="auto"/>
-        <w:rPr>
-          <w:rFonts w:ascii="Times New Roman" w:hAnsi="Times New Roman" w:cs="Times New Roman"/>
-          <w:bCs/>
-          <w:sz w:val="24"/>
-          <w:szCs w:val="24"/>
-        </w:rPr>
-      </w:pPr>
-      <w:r>
-        <w:rPr>
-          <w:rFonts w:ascii="Times New Roman" w:hAnsi="Times New Roman" w:cs="Times New Roman"/>
-          <w:bCs/>
-          <w:sz w:val="24"/>
-          <w:szCs w:val="24"/>
-        </w:rPr>
-        <w:t xml:space="preserve">[p] </w:t>
-      </w:r>
-      <w:r>
-        <w:rPr>
-          <w:rFonts w:ascii="Times New Roman" w:hAnsi="Times New Roman" w:cs="Times New Roman"/>
-          <w:bCs/>
-          <w:sz w:val="24"/>
-          <w:szCs w:val="24"/>
-        </w:rPr>
-        <w:t xml:space="preserve">H. Cho, D. Froelicher*, N. </w:t>
-      </w:r>
-      <w:proofErr w:type="spellStart"/>
-      <w:r>
-        <w:rPr>
-          <w:rFonts w:ascii="Times New Roman" w:hAnsi="Times New Roman" w:cs="Times New Roman"/>
-          <w:bCs/>
-          <w:sz w:val="24"/>
-          <w:szCs w:val="24"/>
-        </w:rPr>
-        <w:t>Dokmai</w:t>
-      </w:r>
-      <w:proofErr w:type="spellEnd"/>
-      <w:r>
-        <w:rPr>
-          <w:rFonts w:ascii="Times New Roman" w:hAnsi="Times New Roman" w:cs="Times New Roman"/>
-          <w:bCs/>
-          <w:sz w:val="24"/>
-          <w:szCs w:val="24"/>
-        </w:rPr>
-        <w:t xml:space="preserve">*, A. Nandi*, </w:t>
-      </w:r>
-      <w:r>
-        <w:rPr>
-          <w:rFonts w:ascii="Times New Roman" w:hAnsi="Times New Roman" w:cs="Times New Roman"/>
-          <w:bCs/>
-          <w:sz w:val="24"/>
-          <w:szCs w:val="24"/>
-          <w:u w:val="single"/>
-        </w:rPr>
-        <w:t>S. Sadhuka</w:t>
-      </w:r>
-      <w:r>
-        <w:rPr>
-          <w:rFonts w:ascii="Times New Roman" w:hAnsi="Times New Roman" w:cs="Times New Roman"/>
-          <w:bCs/>
-          <w:sz w:val="24"/>
-          <w:szCs w:val="24"/>
-        </w:rPr>
-        <w:t xml:space="preserve">*, </w:t>
-      </w:r>
-      <w:r>
-        <w:rPr>
-          <w:rFonts w:ascii="Times New Roman" w:hAnsi="Times New Roman" w:cs="Times New Roman"/>
-          <w:bCs/>
-          <w:sz w:val="24"/>
-          <w:szCs w:val="24"/>
-        </w:rPr>
-        <w:t>M. Hong*, B. Berger</w:t>
-      </w:r>
-      <w:r>
-        <w:rPr>
-          <w:rFonts w:ascii="Times New Roman" w:hAnsi="Times New Roman" w:cs="Times New Roman"/>
-          <w:bCs/>
-          <w:sz w:val="24"/>
-          <w:szCs w:val="24"/>
-        </w:rPr>
-        <w:t xml:space="preserve">. </w:t>
+        <w:t>2023</w:t>
+      </w:r>
+      <w:r>
+        <w:rPr>
+          <w:rFonts w:ascii="Times New Roman" w:hAnsi="Times New Roman" w:cs="Times New Roman"/>
+          <w:bCs/>
+          <w:sz w:val="24"/>
+          <w:szCs w:val="24"/>
+        </w:rPr>
+        <w:t xml:space="preserve"> and </w:t>
       </w:r>
       <w:r>
         <w:rPr>
@@ -1932,16 +1859,90 @@
           <w:sz w:val="24"/>
           <w:szCs w:val="24"/>
         </w:rPr>
-        <w:t>Privacy-Enhancing Technologies in Biomedical Data Science</w:t>
-      </w:r>
-      <w:r>
-        <w:rPr>
-          <w:rFonts w:ascii="Times New Roman" w:hAnsi="Times New Roman" w:cs="Times New Roman"/>
-          <w:bCs/>
-          <w:sz w:val="24"/>
-          <w:szCs w:val="24"/>
-        </w:rPr>
-        <w:t xml:space="preserve">. </w:t>
+        <w:t>Genome Research</w:t>
+      </w:r>
+      <w:r>
+        <w:rPr>
+          <w:rFonts w:ascii="Times New Roman" w:hAnsi="Times New Roman" w:cs="Times New Roman"/>
+          <w:bCs/>
+          <w:sz w:val="24"/>
+          <w:szCs w:val="24"/>
+        </w:rPr>
+        <w:t xml:space="preserve"> 2023</w:t>
+      </w:r>
+      <w:r>
+        <w:rPr>
+          <w:rFonts w:ascii="Times New Roman" w:hAnsi="Times New Roman" w:cs="Times New Roman"/>
+          <w:bCs/>
+          <w:sz w:val="24"/>
+          <w:szCs w:val="24"/>
+        </w:rPr>
+        <w:t xml:space="preserve"> Vol. 33, Issue 7, pp. 1101-1112</w:t>
+      </w:r>
+    </w:p>
+    <w:p>
+      <w:pPr>
+        <w:autoSpaceDE w:val="0"/>
+        <w:autoSpaceDN w:val="0"/>
+        <w:adjustRightInd w:val="0"/>
+        <w:spacing w:after="0" w:line="240" w:lineRule="auto"/>
+        <w:rPr>
+          <w:rFonts w:ascii="Times New Roman" w:hAnsi="Times New Roman" w:cs="Times New Roman"/>
+          <w:bCs/>
+          <w:sz w:val="24"/>
+          <w:szCs w:val="24"/>
+        </w:rPr>
+      </w:pPr>
+    </w:p>
+    <w:p>
+      <w:pPr>
+        <w:autoSpaceDE w:val="0"/>
+        <w:autoSpaceDN w:val="0"/>
+        <w:adjustRightInd w:val="0"/>
+        <w:spacing w:after="0" w:line="240" w:lineRule="auto"/>
+        <w:rPr>
+          <w:rFonts w:ascii="Times New Roman" w:hAnsi="Times New Roman" w:cs="Times New Roman"/>
+          <w:bCs/>
+          <w:sz w:val="24"/>
+          <w:szCs w:val="24"/>
+        </w:rPr>
+      </w:pPr>
+      <w:r>
+        <w:rPr>
+          <w:rFonts w:ascii="Times New Roman" w:hAnsi="Times New Roman" w:cs="Times New Roman"/>
+          <w:bCs/>
+          <w:sz w:val="24"/>
+          <w:szCs w:val="24"/>
+        </w:rPr>
+        <w:t xml:space="preserve">[p] </w:t>
+      </w:r>
+      <w:r>
+        <w:rPr>
+          <w:rFonts w:ascii="Times New Roman" w:hAnsi="Times New Roman" w:cs="Times New Roman"/>
+          <w:bCs/>
+          <w:sz w:val="24"/>
+          <w:szCs w:val="24"/>
+        </w:rPr>
+        <w:t xml:space="preserve">H. Pirie, </w:t>
+      </w:r>
+      <w:r>
+        <w:rPr>
+          <w:rFonts w:ascii="Times New Roman" w:hAnsi="Times New Roman" w:cs="Times New Roman"/>
+          <w:bCs/>
+          <w:sz w:val="24"/>
+          <w:szCs w:val="24"/>
+          <w:u w:val="single"/>
+        </w:rPr>
+        <w:t>S. Sadhuka</w:t>
+      </w:r>
+      <w:r>
+        <w:rPr>
+          <w:rFonts w:ascii="Times New Roman" w:hAnsi="Times New Roman" w:cs="Times New Roman"/>
+          <w:bCs/>
+          <w:sz w:val="24"/>
+          <w:szCs w:val="24"/>
+        </w:rPr>
+        <w:t xml:space="preserve">, J. Wang, R. Andrei, J. Hoffman. </w:t>
       </w:r>
       <w:r>
         <w:rPr>
@@ -1952,90 +1953,7 @@
           <w:sz w:val="24"/>
           <w:szCs w:val="24"/>
         </w:rPr>
-        <w:t xml:space="preserve">Annual Reviews in Biomedical Data Science </w:t>
-      </w:r>
-      <w:r>
-        <w:rPr>
-          <w:rFonts w:ascii="Times New Roman" w:hAnsi="Times New Roman" w:cs="Times New Roman"/>
-          <w:bCs/>
-          <w:sz w:val="24"/>
-          <w:szCs w:val="24"/>
-        </w:rPr>
-        <w:t>2024</w:t>
-      </w:r>
-    </w:p>
-    <w:p>
-      <w:pPr>
-        <w:autoSpaceDE w:val="0"/>
-        <w:autoSpaceDN w:val="0"/>
-        <w:adjustRightInd w:val="0"/>
-        <w:spacing w:after="0" w:line="240" w:lineRule="auto"/>
-        <w:rPr>
-          <w:rFonts w:ascii="Times New Roman" w:hAnsi="Times New Roman" w:cs="Times New Roman"/>
-          <w:bCs/>
-          <w:sz w:val="24"/>
-          <w:szCs w:val="24"/>
-        </w:rPr>
-      </w:pPr>
-    </w:p>
-    <w:p>
-      <w:pPr>
-        <w:autoSpaceDE w:val="0"/>
-        <w:autoSpaceDN w:val="0"/>
-        <w:adjustRightInd w:val="0"/>
-        <w:spacing w:after="0" w:line="240" w:lineRule="auto"/>
-        <w:rPr>
-          <w:rFonts w:ascii="Times New Roman" w:hAnsi="Times New Roman" w:cs="Times New Roman"/>
-          <w:bCs/>
-          <w:sz w:val="24"/>
-          <w:szCs w:val="24"/>
-        </w:rPr>
-      </w:pPr>
-      <w:r>
-        <w:rPr>
-          <w:rFonts w:ascii="Times New Roman" w:hAnsi="Times New Roman" w:cs="Times New Roman"/>
-          <w:bCs/>
-          <w:sz w:val="24"/>
-          <w:szCs w:val="24"/>
-        </w:rPr>
-        <w:t xml:space="preserve">[p] </w:t>
-      </w:r>
-      <w:r>
-        <w:rPr>
-          <w:rFonts w:ascii="Times New Roman" w:hAnsi="Times New Roman" w:cs="Times New Roman"/>
-          <w:bCs/>
-          <w:sz w:val="24"/>
-          <w:szCs w:val="24"/>
-          <w:u w:val="single"/>
-        </w:rPr>
-        <w:t>S. Sadhuka</w:t>
-      </w:r>
-      <w:r>
-        <w:rPr>
-          <w:rFonts w:ascii="Times New Roman" w:hAnsi="Times New Roman" w:cs="Times New Roman"/>
-          <w:bCs/>
-          <w:sz w:val="24"/>
-          <w:szCs w:val="24"/>
-        </w:rPr>
-        <w:t xml:space="preserve">, D. Fridman, </w:t>
-      </w:r>
-      <w:r>
-        <w:rPr>
-          <w:rFonts w:ascii="Times New Roman" w:hAnsi="Times New Roman" w:cs="Times New Roman"/>
-          <w:bCs/>
-          <w:sz w:val="24"/>
-          <w:szCs w:val="24"/>
-        </w:rPr>
-        <w:t>B. Berger, H. Cho</w:t>
-      </w:r>
-      <w:r>
-        <w:rPr>
-          <w:rFonts w:ascii="Times New Roman" w:hAnsi="Times New Roman" w:cs="Times New Roman"/>
-          <w:bCs/>
-          <w:sz w:val="24"/>
-          <w:szCs w:val="24"/>
-        </w:rPr>
-        <w:t xml:space="preserve">. </w:t>
+        <w:t xml:space="preserve">Topological </w:t>
       </w:r>
       <w:r>
         <w:rPr>
@@ -2046,16 +1964,7 @@
           <w:sz w:val="24"/>
           <w:szCs w:val="24"/>
         </w:rPr>
-        <w:t>Assessing transcriptomic reidentification risks using discriminative sequence models</w:t>
-      </w:r>
-      <w:r>
-        <w:rPr>
-          <w:rFonts w:ascii="Times New Roman" w:hAnsi="Times New Roman" w:cs="Times New Roman"/>
-          <w:bCs/>
-          <w:sz w:val="24"/>
-          <w:szCs w:val="24"/>
-        </w:rPr>
-        <w:t xml:space="preserve">. </w:t>
+        <w:t>p</w:t>
       </w:r>
       <w:r>
         <w:rPr>
@@ -2066,70 +1975,7 @@
           <w:sz w:val="24"/>
           <w:szCs w:val="24"/>
         </w:rPr>
-        <w:t>Genome Research</w:t>
-      </w:r>
-      <w:r>
-        <w:rPr>
-          <w:rFonts w:ascii="Times New Roman" w:hAnsi="Times New Roman" w:cs="Times New Roman"/>
-          <w:bCs/>
-          <w:sz w:val="24"/>
-          <w:szCs w:val="24"/>
-        </w:rPr>
-        <w:t xml:space="preserve"> 2023</w:t>
-      </w:r>
-      <w:r>
-        <w:rPr>
-          <w:rFonts w:ascii="Times New Roman" w:hAnsi="Times New Roman" w:cs="Times New Roman"/>
-          <w:bCs/>
-          <w:sz w:val="24"/>
-          <w:szCs w:val="24"/>
-        </w:rPr>
-        <w:t xml:space="preserve">; </w:t>
-      </w:r>
-      <w:r>
-        <w:rPr>
-          <w:rFonts w:ascii="Times New Roman" w:hAnsi="Times New Roman" w:cs="Times New Roman"/>
-          <w:b/>
-          <w:sz w:val="24"/>
-          <w:szCs w:val="24"/>
-        </w:rPr>
-        <w:t>oral presentation</w:t>
-      </w:r>
-      <w:r>
-        <w:rPr>
-          <w:rFonts w:ascii="Times New Roman" w:hAnsi="Times New Roman" w:cs="Times New Roman"/>
-          <w:bCs/>
-          <w:sz w:val="24"/>
-          <w:szCs w:val="24"/>
-        </w:rPr>
-        <w:t xml:space="preserve"> </w:t>
-      </w:r>
-      <w:r>
-        <w:rPr>
-          <w:rFonts w:ascii="Times New Roman" w:hAnsi="Times New Roman" w:cs="Times New Roman"/>
-          <w:b/>
-          <w:sz w:val="24"/>
-          <w:szCs w:val="24"/>
-        </w:rPr>
-        <w:t>at</w:t>
-      </w:r>
-      <w:r>
-        <w:rPr>
-          <w:rFonts w:ascii="Times New Roman" w:hAnsi="Times New Roman" w:cs="Times New Roman"/>
-          <w:b/>
-          <w:sz w:val="24"/>
-          <w:szCs w:val="24"/>
-        </w:rPr>
-        <w:t xml:space="preserve"> </w:t>
-      </w:r>
-      <w:r>
-        <w:rPr>
-          <w:rFonts w:ascii="Times New Roman" w:hAnsi="Times New Roman" w:cs="Times New Roman"/>
-          <w:bCs/>
-          <w:sz w:val="24"/>
-          <w:szCs w:val="24"/>
-        </w:rPr>
-        <w:t>RECOMB</w:t>
+        <w:t xml:space="preserve">hononic </w:t>
       </w:r>
       <w:r>
         <w:rPr>
@@ -2140,81 +1986,7 @@
           <w:sz w:val="24"/>
           <w:szCs w:val="24"/>
         </w:rPr>
-        <w:t xml:space="preserve"> </w:t>
-      </w:r>
-      <w:r>
-        <w:rPr>
-          <w:rFonts w:ascii="Times New Roman" w:hAnsi="Times New Roman" w:cs="Times New Roman"/>
-          <w:bCs/>
-          <w:sz w:val="24"/>
-          <w:szCs w:val="24"/>
-        </w:rPr>
-        <w:t>2023</w:t>
-      </w:r>
-    </w:p>
-    <w:p>
-      <w:pPr>
-        <w:autoSpaceDE w:val="0"/>
-        <w:autoSpaceDN w:val="0"/>
-        <w:adjustRightInd w:val="0"/>
-        <w:spacing w:after="0" w:line="240" w:lineRule="auto"/>
-        <w:rPr>
-          <w:rFonts w:ascii="Times New Roman" w:hAnsi="Times New Roman" w:cs="Times New Roman"/>
-          <w:bCs/>
-          <w:sz w:val="24"/>
-          <w:szCs w:val="24"/>
-        </w:rPr>
-      </w:pPr>
-    </w:p>
-    <w:p>
-      <w:pPr>
-        <w:autoSpaceDE w:val="0"/>
-        <w:autoSpaceDN w:val="0"/>
-        <w:adjustRightInd w:val="0"/>
-        <w:spacing w:after="0" w:line="240" w:lineRule="auto"/>
-        <w:rPr>
-          <w:rFonts w:ascii="Times New Roman" w:hAnsi="Times New Roman" w:cs="Times New Roman"/>
-          <w:bCs/>
-          <w:sz w:val="24"/>
-          <w:szCs w:val="24"/>
-        </w:rPr>
-      </w:pPr>
-      <w:r>
-        <w:rPr>
-          <w:rFonts w:ascii="Times New Roman" w:hAnsi="Times New Roman" w:cs="Times New Roman"/>
-          <w:bCs/>
-          <w:sz w:val="24"/>
-          <w:szCs w:val="24"/>
-        </w:rPr>
-        <w:t xml:space="preserve">[p] </w:t>
-      </w:r>
-      <w:r>
-        <w:rPr>
-          <w:rFonts w:ascii="Times New Roman" w:hAnsi="Times New Roman" w:cs="Times New Roman"/>
-          <w:bCs/>
-          <w:sz w:val="24"/>
-          <w:szCs w:val="24"/>
-        </w:rPr>
-        <w:t xml:space="preserve">H. Pirie, </w:t>
-      </w:r>
-      <w:r>
-        <w:rPr>
-          <w:rFonts w:ascii="Times New Roman" w:hAnsi="Times New Roman" w:cs="Times New Roman"/>
-          <w:bCs/>
-          <w:sz w:val="24"/>
-          <w:szCs w:val="24"/>
-          <w:u w:val="single"/>
-        </w:rPr>
-        <w:t>S. Sadhuka</w:t>
-      </w:r>
-      <w:r>
-        <w:rPr>
-          <w:rFonts w:ascii="Times New Roman" w:hAnsi="Times New Roman" w:cs="Times New Roman"/>
-          <w:bCs/>
-          <w:sz w:val="24"/>
-          <w:szCs w:val="24"/>
-        </w:rPr>
-        <w:t xml:space="preserve">, J. Wang, R. Andrei, J. Hoffman. </w:t>
+        <w:t>l</w:t>
       </w:r>
       <w:r>
         <w:rPr>
@@ -2225,9 +1997,44 @@
           <w:sz w:val="24"/>
           <w:szCs w:val="24"/>
         </w:rPr>
-        <w:t xml:space="preserve">Topological </w:t>
-      </w:r>
-      <w:proofErr w:type="spellStart"/>
+        <w:t>ogic</w:t>
+      </w:r>
+      <w:r>
+        <w:rPr>
+          <w:rFonts w:ascii="Times New Roman" w:hAnsi="Times New Roman" w:cs="Times New Roman"/>
+          <w:bCs/>
+          <w:sz w:val="24"/>
+          <w:szCs w:val="24"/>
+        </w:rPr>
+        <w:t>.</w:t>
+      </w:r>
+      <w:r>
+        <w:rPr>
+          <w:rFonts w:ascii="Times New Roman" w:hAnsi="Times New Roman" w:cs="Times New Roman"/>
+          <w:bCs/>
+          <w:sz w:val="24"/>
+          <w:szCs w:val="24"/>
+        </w:rPr>
+        <w:t xml:space="preserve"> </w:t>
+      </w:r>
+      <w:r>
+        <w:rPr>
+          <w:rFonts w:ascii="Times New Roman" w:hAnsi="Times New Roman" w:cs="Times New Roman"/>
+          <w:b/>
+          <w:sz w:val="24"/>
+          <w:szCs w:val="24"/>
+        </w:rPr>
+        <w:t>Cover article in</w:t>
+      </w:r>
+      <w:r>
+        <w:rPr>
+          <w:rFonts w:ascii="Times New Roman" w:hAnsi="Times New Roman" w:cs="Times New Roman"/>
+          <w:bCs/>
+          <w:sz w:val="24"/>
+          <w:szCs w:val="24"/>
+        </w:rPr>
+        <w:t xml:space="preserve"> </w:t>
+      </w:r>
       <w:r>
         <w:rPr>
           <w:rFonts w:ascii="Times New Roman" w:hAnsi="Times New Roman" w:cs="Times New Roman"/>
@@ -2237,98 +2044,6 @@
           <w:sz w:val="24"/>
           <w:szCs w:val="24"/>
         </w:rPr>
-        <w:t>p</w:t>
-      </w:r>
-      <w:r>
-        <w:rPr>
-          <w:rFonts w:ascii="Times New Roman" w:hAnsi="Times New Roman" w:cs="Times New Roman"/>
-          <w:bCs/>
-          <w:i/>
-          <w:iCs/>
-          <w:sz w:val="24"/>
-          <w:szCs w:val="24"/>
-        </w:rPr>
-        <w:t>hononic</w:t>
-      </w:r>
-      <w:proofErr w:type="spellEnd"/>
-      <w:r>
-        <w:rPr>
-          <w:rFonts w:ascii="Times New Roman" w:hAnsi="Times New Roman" w:cs="Times New Roman"/>
-          <w:bCs/>
-          <w:i/>
-          <w:iCs/>
-          <w:sz w:val="24"/>
-          <w:szCs w:val="24"/>
-        </w:rPr>
-        <w:t xml:space="preserve"> </w:t>
-      </w:r>
-      <w:r>
-        <w:rPr>
-          <w:rFonts w:ascii="Times New Roman" w:hAnsi="Times New Roman" w:cs="Times New Roman"/>
-          <w:bCs/>
-          <w:i/>
-          <w:iCs/>
-          <w:sz w:val="24"/>
-          <w:szCs w:val="24"/>
-        </w:rPr>
-        <w:t>l</w:t>
-      </w:r>
-      <w:r>
-        <w:rPr>
-          <w:rFonts w:ascii="Times New Roman" w:hAnsi="Times New Roman" w:cs="Times New Roman"/>
-          <w:bCs/>
-          <w:i/>
-          <w:iCs/>
-          <w:sz w:val="24"/>
-          <w:szCs w:val="24"/>
-        </w:rPr>
-        <w:t>ogic</w:t>
-      </w:r>
-      <w:r>
-        <w:rPr>
-          <w:rFonts w:ascii="Times New Roman" w:hAnsi="Times New Roman" w:cs="Times New Roman"/>
-          <w:bCs/>
-          <w:sz w:val="24"/>
-          <w:szCs w:val="24"/>
-        </w:rPr>
-        <w:t>.</w:t>
-      </w:r>
-      <w:r>
-        <w:rPr>
-          <w:rFonts w:ascii="Times New Roman" w:hAnsi="Times New Roman" w:cs="Times New Roman"/>
-          <w:bCs/>
-          <w:sz w:val="24"/>
-          <w:szCs w:val="24"/>
-        </w:rPr>
-        <w:t xml:space="preserve"> </w:t>
-      </w:r>
-      <w:r>
-        <w:rPr>
-          <w:rFonts w:ascii="Times New Roman" w:hAnsi="Times New Roman" w:cs="Times New Roman"/>
-          <w:b/>
-          <w:sz w:val="24"/>
-          <w:szCs w:val="24"/>
-        </w:rPr>
-        <w:t>Cover article in</w:t>
-      </w:r>
-      <w:r>
-        <w:rPr>
-          <w:rFonts w:ascii="Times New Roman" w:hAnsi="Times New Roman" w:cs="Times New Roman"/>
-          <w:bCs/>
-          <w:sz w:val="24"/>
-          <w:szCs w:val="24"/>
-        </w:rPr>
-        <w:t xml:space="preserve"> </w:t>
-      </w:r>
-      <w:r>
-        <w:rPr>
-          <w:rFonts w:ascii="Times New Roman" w:hAnsi="Times New Roman" w:cs="Times New Roman"/>
-          <w:bCs/>
-          <w:i/>
-          <w:iCs/>
-          <w:sz w:val="24"/>
-          <w:szCs w:val="24"/>
-        </w:rPr>
         <w:t xml:space="preserve">Physical Review Letters </w:t>
       </w:r>
       <w:r>
@@ -2339,6 +2054,15 @@
           <w:szCs w:val="24"/>
         </w:rPr>
         <w:t>2022</w:t>
+      </w:r>
+      <w:r>
+        <w:rPr>
+          <w:rFonts w:ascii="Times New Roman" w:hAnsi="Times New Roman" w:cs="Times New Roman"/>
+          <w:bCs/>
+          <w:sz w:val="24"/>
+          <w:szCs w:val="24"/>
+        </w:rPr>
+        <w:t xml:space="preserve"> Vol. 128, Issue 1, pp. 015501</w:t>
       </w:r>
     </w:p>
     <w:p>
@@ -2370,7 +2094,7 @@
         </w:rPr>
         <w:t xml:space="preserve">Press: </w:t>
       </w:r>
-      <w:hyperlink r:id="rId9" w:history="1">
+      <w:hyperlink r:id="rId10" w:history="1">
         <w:r>
           <w:rPr>
             <w:rStyle w:val="Hyperlink"/>
@@ -2395,7 +2119,7 @@
         </w:rPr>
         <w:t xml:space="preserve">, </w:t>
       </w:r>
-      <w:hyperlink r:id="rId10" w:history="1">
+      <w:hyperlink r:id="rId11" w:history="1">
         <w:r>
           <w:rPr>
             <w:rStyle w:val="Hyperlink"/>
@@ -2420,7 +2144,7 @@
         </w:rPr>
         <w:t xml:space="preserve">, </w:t>
       </w:r>
-      <w:hyperlink r:id="rId11" w:history="1">
+      <w:hyperlink r:id="rId12" w:history="1">
         <w:r>
           <w:rPr>
             <w:rStyle w:val="Hyperlink"/>
@@ -2445,8 +2169,7 @@
         </w:rPr>
         <w:t xml:space="preserve">, </w:t>
       </w:r>
-      <w:hyperlink r:id="rId12" w:history="1">
-        <w:proofErr w:type="spellStart"/>
+      <w:hyperlink r:id="rId13" w:history="1">
         <w:r>
           <w:rPr>
             <w:rStyle w:val="Hyperlink"/>
@@ -2459,7 +2182,6 @@
           </w:rPr>
           <w:t>Hackaday</w:t>
         </w:r>
-        <w:proofErr w:type="spellEnd"/>
       </w:hyperlink>
     </w:p>
     <w:p>
@@ -2524,27 +2246,7 @@
           <w:sz w:val="24"/>
           <w:szCs w:val="24"/>
         </w:rPr>
-        <w:t xml:space="preserve">, R. Cui, C. </w:t>
-      </w:r>
-      <w:proofErr w:type="spellStart"/>
-      <w:r>
-        <w:rPr>
-          <w:rFonts w:ascii="Times New Roman" w:hAnsi="Times New Roman" w:cs="Times New Roman"/>
-          <w:bCs/>
-          <w:sz w:val="24"/>
-          <w:szCs w:val="24"/>
-        </w:rPr>
-        <w:t>Albors</w:t>
-      </w:r>
-      <w:proofErr w:type="spellEnd"/>
-      <w:r>
-        <w:rPr>
-          <w:rFonts w:ascii="Times New Roman" w:hAnsi="Times New Roman" w:cs="Times New Roman"/>
-          <w:bCs/>
-          <w:sz w:val="24"/>
-          <w:szCs w:val="24"/>
-        </w:rPr>
-        <w:t xml:space="preserve">, N. Cheng, Y. Okada, Biobank Japan Project, F. Aguet, K. Ardlie, D. MacArthur, H. Finucane. </w:t>
+        <w:t xml:space="preserve">, R. Cui, C. Albors, N. Cheng, Y. Okada, Biobank Japan Project, F. Aguet, K. Ardlie, D. MacArthur, H. Finucane. </w:t>
       </w:r>
       <w:r>
         <w:rPr>
@@ -2555,55 +2257,7 @@
           <w:sz w:val="24"/>
           <w:szCs w:val="24"/>
         </w:rPr>
-        <w:t>Leveraging supervised learning for functionally informed fine-mapping of cis-</w:t>
-      </w:r>
-      <w:proofErr w:type="spellStart"/>
-      <w:r>
-        <w:rPr>
-          <w:rFonts w:ascii="Times New Roman" w:hAnsi="Times New Roman" w:cs="Times New Roman"/>
-          <w:bCs/>
-          <w:i/>
-          <w:iCs/>
-          <w:sz w:val="24"/>
-          <w:szCs w:val="24"/>
-        </w:rPr>
-        <w:t>eQTLs</w:t>
-      </w:r>
-      <w:proofErr w:type="spellEnd"/>
-      <w:r>
-        <w:rPr>
-          <w:rFonts w:ascii="Times New Roman" w:hAnsi="Times New Roman" w:cs="Times New Roman"/>
-          <w:bCs/>
-          <w:i/>
-          <w:iCs/>
-          <w:sz w:val="24"/>
-          <w:szCs w:val="24"/>
-        </w:rPr>
-        <w:t xml:space="preserve"> identifies an additional 20,913 putative causal </w:t>
-      </w:r>
-      <w:proofErr w:type="spellStart"/>
-      <w:r>
-        <w:rPr>
-          <w:rFonts w:ascii="Times New Roman" w:hAnsi="Times New Roman" w:cs="Times New Roman"/>
-          <w:bCs/>
-          <w:i/>
-          <w:iCs/>
-          <w:sz w:val="24"/>
-          <w:szCs w:val="24"/>
-        </w:rPr>
-        <w:t>eQTLs</w:t>
-      </w:r>
-      <w:proofErr w:type="spellEnd"/>
-      <w:r>
-        <w:rPr>
-          <w:rFonts w:ascii="Times New Roman" w:hAnsi="Times New Roman" w:cs="Times New Roman"/>
-          <w:bCs/>
-          <w:i/>
-          <w:iCs/>
-          <w:sz w:val="24"/>
-          <w:szCs w:val="24"/>
-        </w:rPr>
-        <w:t>. Nature Communications</w:t>
+        <w:t>Leveraging supervised learning for functionally informed fine-mapping of cis-eQTLs identifies an additional 20,913 putative causal eQTLs. Nature Communications</w:t>
       </w:r>
       <w:r>
         <w:rPr>
@@ -2613,6 +2267,15 @@
           <w:szCs w:val="24"/>
         </w:rPr>
         <w:t xml:space="preserve"> 2021</w:t>
+      </w:r>
+      <w:r>
+        <w:rPr>
+          <w:rFonts w:ascii="Times New Roman" w:hAnsi="Times New Roman" w:cs="Times New Roman"/>
+          <w:bCs/>
+          <w:sz w:val="24"/>
+          <w:szCs w:val="24"/>
+        </w:rPr>
+        <w:t xml:space="preserve"> Vol. 12 Issue 1, pp. 3394</w:t>
       </w:r>
     </w:p>
     <w:p>
@@ -2711,243 +2374,6 @@
           <w:szCs w:val="24"/>
         </w:rPr>
         <w:t>Rational Intelligence Seminar Series</w:t>
-      </w:r>
-      <w:r>
-        <w:rPr>
-          <w:rFonts w:ascii="Times New Roman" w:hAnsi="Times New Roman" w:cs="Times New Roman"/>
-          <w:sz w:val="24"/>
-          <w:szCs w:val="24"/>
-        </w:rPr>
-        <w:t xml:space="preserve"> [</w:t>
-      </w:r>
-      <w:hyperlink r:id="rId13" w:history="1">
-        <w:r>
-          <w:rPr>
-            <w:rStyle w:val="Hyperlink"/>
-            <w:rFonts w:ascii="Times New Roman" w:hAnsi="Times New Roman" w:cs="Times New Roman"/>
-            <w:sz w:val="24"/>
-            <w:szCs w:val="24"/>
-          </w:rPr>
-          <w:t>YouTube</w:t>
-        </w:r>
-      </w:hyperlink>
-      <w:r>
-        <w:rPr>
-          <w:rFonts w:ascii="Times New Roman" w:hAnsi="Times New Roman" w:cs="Times New Roman"/>
-          <w:sz w:val="24"/>
-          <w:szCs w:val="24"/>
-        </w:rPr>
-        <w:t>]</w:t>
-      </w:r>
-      <w:r>
-        <w:rPr>
-          <w:rFonts w:ascii="Times New Roman" w:hAnsi="Times New Roman" w:cs="Times New Roman"/>
-          <w:sz w:val="24"/>
-          <w:szCs w:val="24"/>
-        </w:rPr>
-        <w:tab/>
-      </w:r>
-      <w:r>
-        <w:rPr>
-          <w:rFonts w:ascii="Times New Roman" w:hAnsi="Times New Roman" w:cs="Times New Roman"/>
-          <w:sz w:val="24"/>
-          <w:szCs w:val="24"/>
-        </w:rPr>
-        <w:t>2026</w:t>
-      </w:r>
-    </w:p>
-    <w:p>
-      <w:pPr>
-        <w:tabs>
-          <w:tab w:val="right" w:pos="9360"/>
-        </w:tabs>
-        <w:autoSpaceDE w:val="0"/>
-        <w:autoSpaceDN w:val="0"/>
-        <w:adjustRightInd w:val="0"/>
-        <w:spacing w:after="0" w:line="240" w:lineRule="auto"/>
-        <w:rPr>
-          <w:rFonts w:ascii="Times New Roman" w:hAnsi="Times New Roman" w:cs="Times New Roman"/>
-          <w:sz w:val="24"/>
-          <w:szCs w:val="24"/>
-        </w:rPr>
-      </w:pPr>
-      <w:r>
-        <w:rPr>
-          <w:rFonts w:ascii="Times New Roman" w:hAnsi="Times New Roman" w:cs="Times New Roman"/>
-          <w:sz w:val="24"/>
-          <w:szCs w:val="24"/>
-        </w:rPr>
-        <w:t xml:space="preserve">MIT, Algorithms Coffee                                                                                                           </w:t>
-      </w:r>
-      <w:r>
-        <w:rPr>
-          <w:rFonts w:ascii="Times New Roman" w:hAnsi="Times New Roman" w:cs="Times New Roman"/>
-          <w:sz w:val="24"/>
-          <w:szCs w:val="24"/>
-        </w:rPr>
-        <w:tab/>
-        <w:t>2026</w:t>
-      </w:r>
-    </w:p>
-    <w:p>
-      <w:pPr>
-        <w:tabs>
-          <w:tab w:val="right" w:pos="9360"/>
-        </w:tabs>
-        <w:autoSpaceDE w:val="0"/>
-        <w:autoSpaceDN w:val="0"/>
-        <w:adjustRightInd w:val="0"/>
-        <w:spacing w:after="0" w:line="240" w:lineRule="auto"/>
-        <w:rPr>
-          <w:rFonts w:ascii="Times New Roman" w:hAnsi="Times New Roman" w:cs="Times New Roman"/>
-          <w:sz w:val="24"/>
-          <w:szCs w:val="24"/>
-        </w:rPr>
-      </w:pPr>
-    </w:p>
-    <w:p>
-      <w:pPr>
-        <w:tabs>
-          <w:tab w:val="right" w:pos="9360"/>
-        </w:tabs>
-        <w:autoSpaceDE w:val="0"/>
-        <w:autoSpaceDN w:val="0"/>
-        <w:adjustRightInd w:val="0"/>
-        <w:spacing w:after="0" w:line="240" w:lineRule="auto"/>
-        <w:rPr>
-          <w:rFonts w:ascii="Times New Roman" w:hAnsi="Times New Roman" w:cs="Times New Roman"/>
-          <w:b/>
-          <w:bCs/>
-          <w:sz w:val="24"/>
-          <w:szCs w:val="24"/>
-        </w:rPr>
-      </w:pPr>
-      <w:r>
-        <w:rPr>
-          <w:rFonts w:ascii="Times New Roman" w:hAnsi="Times New Roman" w:cs="Times New Roman"/>
-          <w:b/>
-          <w:bCs/>
-          <w:sz w:val="24"/>
-          <w:szCs w:val="24"/>
-        </w:rPr>
-        <w:t>Evaluating multiple models using labeled and unlabeled data</w:t>
-      </w:r>
-    </w:p>
-    <w:p>
-      <w:pPr>
-        <w:tabs>
-          <w:tab w:val="right" w:pos="9360"/>
-        </w:tabs>
-        <w:autoSpaceDE w:val="0"/>
-        <w:autoSpaceDN w:val="0"/>
-        <w:adjustRightInd w:val="0"/>
-        <w:spacing w:after="0" w:line="240" w:lineRule="auto"/>
-        <w:rPr>
-          <w:rFonts w:ascii="Times New Roman" w:hAnsi="Times New Roman" w:cs="Times New Roman"/>
-          <w:sz w:val="24"/>
-          <w:szCs w:val="24"/>
-        </w:rPr>
-      </w:pPr>
-      <w:r>
-        <w:rPr>
-          <w:rFonts w:ascii="Times New Roman" w:hAnsi="Times New Roman" w:cs="Times New Roman"/>
-          <w:sz w:val="24"/>
-          <w:szCs w:val="24"/>
-        </w:rPr>
-        <w:t>MIT, Machine Learning Tea</w:t>
-      </w:r>
-      <w:r>
-        <w:rPr>
-          <w:rFonts w:ascii="Times New Roman" w:hAnsi="Times New Roman" w:cs="Times New Roman"/>
-          <w:sz w:val="24"/>
-          <w:szCs w:val="24"/>
-        </w:rPr>
-        <w:tab/>
-        <w:t>2025</w:t>
-      </w:r>
-    </w:p>
-    <w:p>
-      <w:pPr>
-        <w:tabs>
-          <w:tab w:val="right" w:pos="9360"/>
-        </w:tabs>
-        <w:autoSpaceDE w:val="0"/>
-        <w:autoSpaceDN w:val="0"/>
-        <w:adjustRightInd w:val="0"/>
-        <w:spacing w:after="0" w:line="240" w:lineRule="auto"/>
-        <w:rPr>
-          <w:rFonts w:ascii="Times New Roman" w:hAnsi="Times New Roman" w:cs="Times New Roman"/>
-          <w:sz w:val="24"/>
-          <w:szCs w:val="24"/>
-        </w:rPr>
-      </w:pPr>
-    </w:p>
-    <w:p>
-      <w:pPr>
-        <w:tabs>
-          <w:tab w:val="right" w:pos="9360"/>
-        </w:tabs>
-        <w:autoSpaceDE w:val="0"/>
-        <w:autoSpaceDN w:val="0"/>
-        <w:adjustRightInd w:val="0"/>
-        <w:spacing w:after="0" w:line="240" w:lineRule="auto"/>
-        <w:rPr>
-          <w:rFonts w:ascii="Times New Roman" w:hAnsi="Times New Roman" w:cs="Times New Roman"/>
-          <w:sz w:val="24"/>
-          <w:szCs w:val="24"/>
-        </w:rPr>
-      </w:pPr>
-      <w:r>
-        <w:rPr>
-          <w:rFonts w:ascii="Times New Roman" w:hAnsi="Times New Roman" w:cs="Times New Roman"/>
-          <w:b/>
-          <w:bCs/>
-          <w:sz w:val="24"/>
-          <w:szCs w:val="24"/>
-        </w:rPr>
-        <w:t>Assessing transcriptomic reidentification risks</w:t>
-      </w:r>
-      <w:r>
-        <w:rPr>
-          <w:rFonts w:ascii="Times New Roman" w:hAnsi="Times New Roman" w:cs="Times New Roman"/>
-          <w:b/>
-          <w:bCs/>
-          <w:sz w:val="24"/>
-          <w:szCs w:val="24"/>
-        </w:rPr>
-        <w:tab/>
-      </w:r>
-    </w:p>
-    <w:p>
-      <w:pPr>
-        <w:tabs>
-          <w:tab w:val="right" w:pos="9360"/>
-        </w:tabs>
-        <w:autoSpaceDE w:val="0"/>
-        <w:autoSpaceDN w:val="0"/>
-        <w:adjustRightInd w:val="0"/>
-        <w:spacing w:after="0" w:line="240" w:lineRule="auto"/>
-        <w:rPr>
-          <w:rFonts w:ascii="Times New Roman" w:hAnsi="Times New Roman" w:cs="Times New Roman"/>
-          <w:sz w:val="24"/>
-          <w:szCs w:val="24"/>
-        </w:rPr>
-      </w:pPr>
-      <w:r>
-        <w:rPr>
-          <w:rFonts w:ascii="Times New Roman" w:hAnsi="Times New Roman" w:cs="Times New Roman"/>
-          <w:sz w:val="24"/>
-          <w:szCs w:val="24"/>
-        </w:rPr>
-        <w:t>RECOMB</w:t>
-      </w:r>
-      <w:r>
-        <w:rPr>
-          <w:rFonts w:ascii="Times New Roman" w:hAnsi="Times New Roman" w:cs="Times New Roman"/>
-          <w:sz w:val="24"/>
-          <w:szCs w:val="24"/>
-        </w:rPr>
-        <w:t>, Oral Presentation</w:t>
       </w:r>
       <w:r>
         <w:rPr>
@@ -2983,6 +2409,243 @@
           <w:szCs w:val="24"/>
         </w:rPr>
         <w:tab/>
+      </w:r>
+      <w:r>
+        <w:rPr>
+          <w:rFonts w:ascii="Times New Roman" w:hAnsi="Times New Roman" w:cs="Times New Roman"/>
+          <w:sz w:val="24"/>
+          <w:szCs w:val="24"/>
+        </w:rPr>
+        <w:t>2026</w:t>
+      </w:r>
+    </w:p>
+    <w:p>
+      <w:pPr>
+        <w:tabs>
+          <w:tab w:val="right" w:pos="9360"/>
+        </w:tabs>
+        <w:autoSpaceDE w:val="0"/>
+        <w:autoSpaceDN w:val="0"/>
+        <w:adjustRightInd w:val="0"/>
+        <w:spacing w:after="0" w:line="240" w:lineRule="auto"/>
+        <w:rPr>
+          <w:rFonts w:ascii="Times New Roman" w:hAnsi="Times New Roman" w:cs="Times New Roman"/>
+          <w:sz w:val="24"/>
+          <w:szCs w:val="24"/>
+        </w:rPr>
+      </w:pPr>
+      <w:r>
+        <w:rPr>
+          <w:rFonts w:ascii="Times New Roman" w:hAnsi="Times New Roman" w:cs="Times New Roman"/>
+          <w:sz w:val="24"/>
+          <w:szCs w:val="24"/>
+        </w:rPr>
+        <w:t xml:space="preserve">MIT, Algorithms Coffee                                                                                                           </w:t>
+      </w:r>
+      <w:r>
+        <w:rPr>
+          <w:rFonts w:ascii="Times New Roman" w:hAnsi="Times New Roman" w:cs="Times New Roman"/>
+          <w:sz w:val="24"/>
+          <w:szCs w:val="24"/>
+        </w:rPr>
+        <w:tab/>
+        <w:t>2026</w:t>
+      </w:r>
+    </w:p>
+    <w:p>
+      <w:pPr>
+        <w:tabs>
+          <w:tab w:val="right" w:pos="9360"/>
+        </w:tabs>
+        <w:autoSpaceDE w:val="0"/>
+        <w:autoSpaceDN w:val="0"/>
+        <w:adjustRightInd w:val="0"/>
+        <w:spacing w:after="0" w:line="240" w:lineRule="auto"/>
+        <w:rPr>
+          <w:rFonts w:ascii="Times New Roman" w:hAnsi="Times New Roman" w:cs="Times New Roman"/>
+          <w:sz w:val="24"/>
+          <w:szCs w:val="24"/>
+        </w:rPr>
+      </w:pPr>
+    </w:p>
+    <w:p>
+      <w:pPr>
+        <w:tabs>
+          <w:tab w:val="right" w:pos="9360"/>
+        </w:tabs>
+        <w:autoSpaceDE w:val="0"/>
+        <w:autoSpaceDN w:val="0"/>
+        <w:adjustRightInd w:val="0"/>
+        <w:spacing w:after="0" w:line="240" w:lineRule="auto"/>
+        <w:rPr>
+          <w:rFonts w:ascii="Times New Roman" w:hAnsi="Times New Roman" w:cs="Times New Roman"/>
+          <w:b/>
+          <w:bCs/>
+          <w:sz w:val="24"/>
+          <w:szCs w:val="24"/>
+        </w:rPr>
+      </w:pPr>
+      <w:r>
+        <w:rPr>
+          <w:rFonts w:ascii="Times New Roman" w:hAnsi="Times New Roman" w:cs="Times New Roman"/>
+          <w:b/>
+          <w:bCs/>
+          <w:sz w:val="24"/>
+          <w:szCs w:val="24"/>
+        </w:rPr>
+        <w:t>Evaluating multiple models using labeled and unlabeled data</w:t>
+      </w:r>
+    </w:p>
+    <w:p>
+      <w:pPr>
+        <w:tabs>
+          <w:tab w:val="right" w:pos="9360"/>
+        </w:tabs>
+        <w:autoSpaceDE w:val="0"/>
+        <w:autoSpaceDN w:val="0"/>
+        <w:adjustRightInd w:val="0"/>
+        <w:spacing w:after="0" w:line="240" w:lineRule="auto"/>
+        <w:rPr>
+          <w:rFonts w:ascii="Times New Roman" w:hAnsi="Times New Roman" w:cs="Times New Roman"/>
+          <w:sz w:val="24"/>
+          <w:szCs w:val="24"/>
+        </w:rPr>
+      </w:pPr>
+      <w:r>
+        <w:rPr>
+          <w:rFonts w:ascii="Times New Roman" w:hAnsi="Times New Roman" w:cs="Times New Roman"/>
+          <w:sz w:val="24"/>
+          <w:szCs w:val="24"/>
+        </w:rPr>
+        <w:t>MIT, Machine Learning Tea</w:t>
+      </w:r>
+      <w:r>
+        <w:rPr>
+          <w:rFonts w:ascii="Times New Roman" w:hAnsi="Times New Roman" w:cs="Times New Roman"/>
+          <w:sz w:val="24"/>
+          <w:szCs w:val="24"/>
+        </w:rPr>
+        <w:tab/>
+        <w:t>2025</w:t>
+      </w:r>
+    </w:p>
+    <w:p>
+      <w:pPr>
+        <w:tabs>
+          <w:tab w:val="right" w:pos="9360"/>
+        </w:tabs>
+        <w:autoSpaceDE w:val="0"/>
+        <w:autoSpaceDN w:val="0"/>
+        <w:adjustRightInd w:val="0"/>
+        <w:spacing w:after="0" w:line="240" w:lineRule="auto"/>
+        <w:rPr>
+          <w:rFonts w:ascii="Times New Roman" w:hAnsi="Times New Roman" w:cs="Times New Roman"/>
+          <w:sz w:val="24"/>
+          <w:szCs w:val="24"/>
+        </w:rPr>
+      </w:pPr>
+    </w:p>
+    <w:p>
+      <w:pPr>
+        <w:tabs>
+          <w:tab w:val="right" w:pos="9360"/>
+        </w:tabs>
+        <w:autoSpaceDE w:val="0"/>
+        <w:autoSpaceDN w:val="0"/>
+        <w:adjustRightInd w:val="0"/>
+        <w:spacing w:after="0" w:line="240" w:lineRule="auto"/>
+        <w:rPr>
+          <w:rFonts w:ascii="Times New Roman" w:hAnsi="Times New Roman" w:cs="Times New Roman"/>
+          <w:sz w:val="24"/>
+          <w:szCs w:val="24"/>
+        </w:rPr>
+      </w:pPr>
+      <w:r>
+        <w:rPr>
+          <w:rFonts w:ascii="Times New Roman" w:hAnsi="Times New Roman" w:cs="Times New Roman"/>
+          <w:b/>
+          <w:bCs/>
+          <w:sz w:val="24"/>
+          <w:szCs w:val="24"/>
+        </w:rPr>
+        <w:t>Assessing transcriptomic reidentification risks</w:t>
+      </w:r>
+      <w:r>
+        <w:rPr>
+          <w:rFonts w:ascii="Times New Roman" w:hAnsi="Times New Roman" w:cs="Times New Roman"/>
+          <w:b/>
+          <w:bCs/>
+          <w:sz w:val="24"/>
+          <w:szCs w:val="24"/>
+        </w:rPr>
+        <w:tab/>
+      </w:r>
+    </w:p>
+    <w:p>
+      <w:pPr>
+        <w:tabs>
+          <w:tab w:val="right" w:pos="9360"/>
+        </w:tabs>
+        <w:autoSpaceDE w:val="0"/>
+        <w:autoSpaceDN w:val="0"/>
+        <w:adjustRightInd w:val="0"/>
+        <w:spacing w:after="0" w:line="240" w:lineRule="auto"/>
+        <w:rPr>
+          <w:rFonts w:ascii="Times New Roman" w:hAnsi="Times New Roman" w:cs="Times New Roman"/>
+          <w:sz w:val="24"/>
+          <w:szCs w:val="24"/>
+        </w:rPr>
+      </w:pPr>
+      <w:r>
+        <w:rPr>
+          <w:rFonts w:ascii="Times New Roman" w:hAnsi="Times New Roman" w:cs="Times New Roman"/>
+          <w:sz w:val="24"/>
+          <w:szCs w:val="24"/>
+        </w:rPr>
+        <w:t>RECOMB</w:t>
+      </w:r>
+      <w:r>
+        <w:rPr>
+          <w:rFonts w:ascii="Times New Roman" w:hAnsi="Times New Roman" w:cs="Times New Roman"/>
+          <w:sz w:val="24"/>
+          <w:szCs w:val="24"/>
+        </w:rPr>
+        <w:t>, Oral Presentation</w:t>
+      </w:r>
+      <w:r>
+        <w:rPr>
+          <w:rFonts w:ascii="Times New Roman" w:hAnsi="Times New Roman" w:cs="Times New Roman"/>
+          <w:sz w:val="24"/>
+          <w:szCs w:val="24"/>
+        </w:rPr>
+        <w:t xml:space="preserve"> [</w:t>
+      </w:r>
+      <w:hyperlink r:id="rId15" w:history="1">
+        <w:r>
+          <w:rPr>
+            <w:rStyle w:val="Hyperlink"/>
+            <w:rFonts w:ascii="Times New Roman" w:hAnsi="Times New Roman" w:cs="Times New Roman"/>
+            <w:sz w:val="24"/>
+            <w:szCs w:val="24"/>
+          </w:rPr>
+          <w:t>YouTube</w:t>
+        </w:r>
+      </w:hyperlink>
+      <w:r>
+        <w:rPr>
+          <w:rFonts w:ascii="Times New Roman" w:hAnsi="Times New Roman" w:cs="Times New Roman"/>
+          <w:sz w:val="24"/>
+          <w:szCs w:val="24"/>
+        </w:rPr>
+        <w:t>]</w:t>
+      </w:r>
+      <w:r>
+        <w:rPr>
+          <w:rFonts w:ascii="Times New Roman" w:hAnsi="Times New Roman" w:cs="Times New Roman"/>
+          <w:sz w:val="24"/>
+          <w:szCs w:val="24"/>
+        </w:rPr>
+        <w:tab/>
         <w:t>202</w:t>
       </w:r>
       <w:r>
@@ -3555,6 +3218,122 @@
           <w:szCs w:val="24"/>
         </w:rPr>
       </w:pPr>
+      <w:r>
+        <w:rPr>
+          <w:rFonts w:ascii="Times New Roman" w:hAnsi="Times New Roman" w:cs="Times New Roman"/>
+          <w:b/>
+          <w:sz w:val="24"/>
+          <w:szCs w:val="24"/>
+        </w:rPr>
+        <w:t>REVIEWING AND SERVICE</w:t>
+      </w:r>
+      <w:r>
+        <w:rPr>
+          <w:rFonts w:ascii="Times New Roman" w:hAnsi="Times New Roman" w:cs="Times New Roman"/>
+          <w:b/>
+          <w:sz w:val="24"/>
+          <w:szCs w:val="24"/>
+        </w:rPr>
+        <w:tab/>
+      </w:r>
+    </w:p>
+    <w:p>
+      <w:pPr>
+        <w:tabs>
+          <w:tab w:val="right" w:pos="9360"/>
+        </w:tabs>
+        <w:autoSpaceDE w:val="0"/>
+        <w:autoSpaceDN w:val="0"/>
+        <w:adjustRightInd w:val="0"/>
+        <w:spacing w:after="0" w:line="240" w:lineRule="auto"/>
+        <w:rPr>
+          <w:rFonts w:ascii="Times New Roman" w:hAnsi="Times New Roman" w:cs="Times New Roman"/>
+          <w:sz w:val="24"/>
+          <w:szCs w:val="24"/>
+        </w:rPr>
+      </w:pPr>
+      <w:r>
+        <w:rPr>
+          <w:rFonts w:ascii="Times New Roman" w:hAnsi="Times New Roman" w:cs="Times New Roman"/>
+          <w:sz w:val="24"/>
+          <w:szCs w:val="24"/>
+        </w:rPr>
+        <w:t>Roundtable Chair, ML4H 2024</w:t>
+      </w:r>
+      <w:r>
+        <w:rPr>
+          <w:rFonts w:ascii="Times New Roman" w:hAnsi="Times New Roman" w:cs="Times New Roman"/>
+          <w:sz w:val="24"/>
+          <w:szCs w:val="24"/>
+        </w:rPr>
+        <w:t>, 2025</w:t>
+      </w:r>
+      <w:r>
+        <w:rPr>
+          <w:rFonts w:ascii="Times New Roman" w:hAnsi="Times New Roman" w:cs="Times New Roman"/>
+          <w:sz w:val="24"/>
+          <w:szCs w:val="24"/>
+        </w:rPr>
+        <w:tab/>
+        <w:t>2024</w:t>
+      </w:r>
+      <w:r>
+        <w:rPr>
+          <w:rFonts w:ascii="Times New Roman" w:hAnsi="Times New Roman" w:cs="Times New Roman"/>
+          <w:sz w:val="24"/>
+          <w:szCs w:val="24"/>
+        </w:rPr>
+        <w:t>, 2025</w:t>
+      </w:r>
+    </w:p>
+    <w:p>
+      <w:pPr>
+        <w:tabs>
+          <w:tab w:val="right" w:pos="9360"/>
+        </w:tabs>
+        <w:autoSpaceDE w:val="0"/>
+        <w:autoSpaceDN w:val="0"/>
+        <w:adjustRightInd w:val="0"/>
+        <w:spacing w:after="0" w:line="240" w:lineRule="auto"/>
+        <w:rPr>
+          <w:rFonts w:ascii="Times New Roman" w:hAnsi="Times New Roman" w:cs="Times New Roman"/>
+          <w:sz w:val="24"/>
+          <w:szCs w:val="24"/>
+        </w:rPr>
+      </w:pPr>
+      <w:r>
+        <w:rPr>
+          <w:rFonts w:ascii="Times New Roman" w:hAnsi="Times New Roman" w:cs="Times New Roman"/>
+          <w:sz w:val="24"/>
+          <w:szCs w:val="24"/>
+        </w:rPr>
+        <w:t>Member, NIST AI Safety Institute Task Force on Red Teaming                                              2024</w:t>
+      </w:r>
+    </w:p>
+    <w:p>
+      <w:pPr>
+        <w:tabs>
+          <w:tab w:val="right" w:pos="9360"/>
+        </w:tabs>
+        <w:autoSpaceDE w:val="0"/>
+        <w:autoSpaceDN w:val="0"/>
+        <w:adjustRightInd w:val="0"/>
+        <w:spacing w:after="0" w:line="240" w:lineRule="auto"/>
+        <w:jc w:val="center"/>
+        <w:rPr>
+          <w:rFonts w:ascii="Times New Roman" w:hAnsi="Times New Roman" w:cs="Times New Roman"/>
+          <w:sz w:val="24"/>
+          <w:szCs w:val="24"/>
+        </w:rPr>
+      </w:pPr>
+      <w:r>
+        <w:rPr>
+          <w:rFonts w:ascii="Times New Roman" w:hAnsi="Times New Roman" w:cs="Times New Roman"/>
+          <w:sz w:val="24"/>
+          <w:szCs w:val="24"/>
+        </w:rPr>
+        <w:t>Planning Committee, Hertz Foundation Summer Workshop                                                    2023</w:t>
+      </w:r>
     </w:p>
     <w:p>
       <w:pPr>
@@ -3564,11 +3343,44 @@
         <w:spacing w:after="60"/>
         <w:rPr>
           <w:rFonts w:ascii="Times New Roman" w:hAnsi="Times New Roman" w:cs="Times New Roman"/>
-          <w:b/>
-          <w:sz w:val="24"/>
-          <w:szCs w:val="24"/>
-        </w:rPr>
-      </w:pPr>
+          <w:sz w:val="24"/>
+          <w:szCs w:val="24"/>
+        </w:rPr>
+      </w:pPr>
+      <w:r>
+        <w:rPr>
+          <w:rFonts w:ascii="Times New Roman" w:hAnsi="Times New Roman" w:cs="Times New Roman"/>
+          <w:sz w:val="24"/>
+          <w:szCs w:val="24"/>
+        </w:rPr>
+        <w:t xml:space="preserve">Reviewing: NeurIPS, </w:t>
+      </w:r>
+      <w:r>
+        <w:rPr>
+          <w:rFonts w:ascii="Times New Roman" w:hAnsi="Times New Roman" w:cs="Times New Roman"/>
+          <w:sz w:val="24"/>
+          <w:szCs w:val="24"/>
+        </w:rPr>
+        <w:t xml:space="preserve">ICML, </w:t>
+      </w:r>
+      <w:r>
+        <w:rPr>
+          <w:rFonts w:ascii="Times New Roman" w:hAnsi="Times New Roman" w:cs="Times New Roman"/>
+          <w:sz w:val="24"/>
+          <w:szCs w:val="24"/>
+        </w:rPr>
+        <w:t xml:space="preserve">ICLR, Journal of Computational Biology, </w:t>
+      </w:r>
+      <w:r>
+        <w:rPr>
+          <w:rFonts w:ascii="Times New Roman" w:hAnsi="Times New Roman" w:cs="Times New Roman"/>
+          <w:i/>
+          <w:iCs/>
+          <w:sz w:val="24"/>
+          <w:szCs w:val="24"/>
+        </w:rPr>
+        <w:t>PNAS</w:t>
+      </w:r>
     </w:p>
     <w:p>
       <w:pPr>
@@ -3591,215 +3403,6 @@
           <w:szCs w:val="24"/>
         </w:rPr>
         <w:lastRenderedPageBreak/>
-        <w:t>REVIEWING AND SERVICE</w:t>
-      </w:r>
-      <w:r>
-        <w:rPr>
-          <w:rFonts w:ascii="Times New Roman" w:hAnsi="Times New Roman" w:cs="Times New Roman"/>
-          <w:b/>
-          <w:sz w:val="24"/>
-          <w:szCs w:val="24"/>
-        </w:rPr>
-        <w:tab/>
-      </w:r>
-    </w:p>
-    <w:p>
-      <w:pPr>
-        <w:tabs>
-          <w:tab w:val="right" w:pos="9360"/>
-        </w:tabs>
-        <w:autoSpaceDE w:val="0"/>
-        <w:autoSpaceDN w:val="0"/>
-        <w:adjustRightInd w:val="0"/>
-        <w:spacing w:after="0" w:line="240" w:lineRule="auto"/>
-        <w:rPr>
-          <w:rFonts w:ascii="Times New Roman" w:hAnsi="Times New Roman" w:cs="Times New Roman"/>
-          <w:sz w:val="24"/>
-          <w:szCs w:val="24"/>
-        </w:rPr>
-      </w:pPr>
-      <w:r>
-        <w:rPr>
-          <w:rFonts w:ascii="Times New Roman" w:hAnsi="Times New Roman" w:cs="Times New Roman"/>
-          <w:sz w:val="24"/>
-          <w:szCs w:val="24"/>
-        </w:rPr>
-        <w:t>Roundtable Chair, ML4H 2024</w:t>
-      </w:r>
-      <w:r>
-        <w:rPr>
-          <w:rFonts w:ascii="Times New Roman" w:hAnsi="Times New Roman" w:cs="Times New Roman"/>
-          <w:sz w:val="24"/>
-          <w:szCs w:val="24"/>
-        </w:rPr>
-        <w:t>, 2025</w:t>
-      </w:r>
-      <w:r>
-        <w:rPr>
-          <w:rFonts w:ascii="Times New Roman" w:hAnsi="Times New Roman" w:cs="Times New Roman"/>
-          <w:sz w:val="24"/>
-          <w:szCs w:val="24"/>
-        </w:rPr>
-        <w:tab/>
-        <w:t>2024</w:t>
-      </w:r>
-      <w:r>
-        <w:rPr>
-          <w:rFonts w:ascii="Times New Roman" w:hAnsi="Times New Roman" w:cs="Times New Roman"/>
-          <w:sz w:val="24"/>
-          <w:szCs w:val="24"/>
-        </w:rPr>
-        <w:t>, 2025</w:t>
-      </w:r>
-    </w:p>
-    <w:p>
-      <w:pPr>
-        <w:tabs>
-          <w:tab w:val="right" w:pos="9360"/>
-        </w:tabs>
-        <w:autoSpaceDE w:val="0"/>
-        <w:autoSpaceDN w:val="0"/>
-        <w:adjustRightInd w:val="0"/>
-        <w:spacing w:after="0" w:line="240" w:lineRule="auto"/>
-        <w:rPr>
-          <w:rFonts w:ascii="Times New Roman" w:hAnsi="Times New Roman" w:cs="Times New Roman"/>
-          <w:sz w:val="24"/>
-          <w:szCs w:val="24"/>
-        </w:rPr>
-      </w:pPr>
-      <w:r>
-        <w:rPr>
-          <w:rFonts w:ascii="Times New Roman" w:hAnsi="Times New Roman" w:cs="Times New Roman"/>
-          <w:sz w:val="24"/>
-          <w:szCs w:val="24"/>
-        </w:rPr>
-        <w:t>Member, NIST AI Safety Institute Task Force on Red Teaming                                              2024</w:t>
-      </w:r>
-    </w:p>
-    <w:p>
-      <w:pPr>
-        <w:tabs>
-          <w:tab w:val="right" w:pos="9360"/>
-        </w:tabs>
-        <w:autoSpaceDE w:val="0"/>
-        <w:autoSpaceDN w:val="0"/>
-        <w:adjustRightInd w:val="0"/>
-        <w:spacing w:after="0" w:line="240" w:lineRule="auto"/>
-        <w:jc w:val="center"/>
-        <w:rPr>
-          <w:rFonts w:ascii="Times New Roman" w:hAnsi="Times New Roman" w:cs="Times New Roman"/>
-          <w:sz w:val="24"/>
-          <w:szCs w:val="24"/>
-        </w:rPr>
-      </w:pPr>
-      <w:r>
-        <w:rPr>
-          <w:rFonts w:ascii="Times New Roman" w:hAnsi="Times New Roman" w:cs="Times New Roman"/>
-          <w:sz w:val="24"/>
-          <w:szCs w:val="24"/>
-        </w:rPr>
-        <w:t>Planning Committee, Hertz Foundation Summer Workshop                                                    2023</w:t>
-      </w:r>
-    </w:p>
-    <w:p>
-      <w:pPr>
-        <w:pBdr>
-          <w:bottom w:val="single" w:sz="4" w:space="1" w:color="auto"/>
-        </w:pBdr>
-        <w:spacing w:after="60"/>
-        <w:rPr>
-          <w:rFonts w:ascii="Times New Roman" w:hAnsi="Times New Roman" w:cs="Times New Roman"/>
-          <w:sz w:val="24"/>
-          <w:szCs w:val="24"/>
-        </w:rPr>
-      </w:pPr>
-      <w:r>
-        <w:rPr>
-          <w:rFonts w:ascii="Times New Roman" w:hAnsi="Times New Roman" w:cs="Times New Roman"/>
-          <w:sz w:val="24"/>
-          <w:szCs w:val="24"/>
-        </w:rPr>
-        <w:t xml:space="preserve">Reviewing: </w:t>
-      </w:r>
-      <w:proofErr w:type="spellStart"/>
-      <w:r>
-        <w:rPr>
-          <w:rFonts w:ascii="Times New Roman" w:hAnsi="Times New Roman" w:cs="Times New Roman"/>
-          <w:sz w:val="24"/>
-          <w:szCs w:val="24"/>
-        </w:rPr>
-        <w:t>NeurIPS</w:t>
-      </w:r>
-      <w:proofErr w:type="spellEnd"/>
-      <w:r>
-        <w:rPr>
-          <w:rFonts w:ascii="Times New Roman" w:hAnsi="Times New Roman" w:cs="Times New Roman"/>
-          <w:sz w:val="24"/>
-          <w:szCs w:val="24"/>
-        </w:rPr>
-        <w:t xml:space="preserve">, </w:t>
-      </w:r>
-      <w:r>
-        <w:rPr>
-          <w:rFonts w:ascii="Times New Roman" w:hAnsi="Times New Roman" w:cs="Times New Roman"/>
-          <w:sz w:val="24"/>
-          <w:szCs w:val="24"/>
-        </w:rPr>
-        <w:t xml:space="preserve">ICML, </w:t>
-      </w:r>
-      <w:r>
-        <w:rPr>
-          <w:rFonts w:ascii="Times New Roman" w:hAnsi="Times New Roman" w:cs="Times New Roman"/>
-          <w:sz w:val="24"/>
-          <w:szCs w:val="24"/>
-        </w:rPr>
-        <w:t xml:space="preserve">ICLR, Journal of Computational Biology, </w:t>
-      </w:r>
-      <w:r>
-        <w:rPr>
-          <w:rFonts w:ascii="Times New Roman" w:hAnsi="Times New Roman" w:cs="Times New Roman"/>
-          <w:i/>
-          <w:iCs/>
-          <w:sz w:val="24"/>
-          <w:szCs w:val="24"/>
-        </w:rPr>
-        <w:t>PNAS</w:t>
-      </w:r>
-    </w:p>
-    <w:p>
-      <w:pPr>
-        <w:pBdr>
-          <w:bottom w:val="single" w:sz="4" w:space="1" w:color="auto"/>
-        </w:pBdr>
-        <w:spacing w:after="60"/>
-        <w:rPr>
-          <w:rFonts w:ascii="Times New Roman" w:hAnsi="Times New Roman" w:cs="Times New Roman"/>
-          <w:b/>
-          <w:sz w:val="24"/>
-          <w:szCs w:val="24"/>
-        </w:rPr>
-      </w:pPr>
-    </w:p>
-    <w:p>
-      <w:pPr>
-        <w:pBdr>
-          <w:bottom w:val="single" w:sz="4" w:space="1" w:color="auto"/>
-        </w:pBdr>
-        <w:spacing w:after="60"/>
-        <w:rPr>
-          <w:rFonts w:ascii="Times New Roman" w:hAnsi="Times New Roman" w:cs="Times New Roman"/>
-          <w:b/>
-          <w:sz w:val="24"/>
-          <w:szCs w:val="24"/>
-        </w:rPr>
-      </w:pPr>
-      <w:r>
-        <w:rPr>
-          <w:rFonts w:ascii="Times New Roman" w:hAnsi="Times New Roman" w:cs="Times New Roman"/>
-          <w:b/>
-          <w:sz w:val="24"/>
-          <w:szCs w:val="24"/>
-        </w:rPr>
         <w:t>LEADERSHIP &amp; OUTREACH</w:t>
       </w:r>
       <w:r>
@@ -4472,27 +4075,7 @@
           <w:sz w:val="24"/>
           <w:szCs w:val="24"/>
         </w:rPr>
-        <w:t xml:space="preserve">Mentors: </w:t>
-      </w:r>
-      <w:proofErr w:type="spellStart"/>
-      <w:r>
-        <w:rPr>
-          <w:rFonts w:ascii="Times New Roman" w:hAnsi="Times New Roman" w:cs="Times New Roman"/>
-          <w:bCs/>
-          <w:sz w:val="24"/>
-          <w:szCs w:val="24"/>
-        </w:rPr>
-        <w:t>Hanchen</w:t>
-      </w:r>
-      <w:proofErr w:type="spellEnd"/>
-      <w:r>
-        <w:rPr>
-          <w:rFonts w:ascii="Times New Roman" w:hAnsi="Times New Roman" w:cs="Times New Roman"/>
-          <w:bCs/>
-          <w:sz w:val="24"/>
-          <w:szCs w:val="24"/>
-        </w:rPr>
-        <w:t xml:space="preserve"> Wang, Aviv Regev</w:t>
+        <w:t>Mentors: Hanchen Wang, Aviv Regev</w:t>
       </w:r>
     </w:p>
     <w:p>
@@ -4737,7 +4320,7 @@
           <w:szCs w:val="24"/>
         </w:rPr>
       </w:pPr>
-      <w:hyperlink r:id="rId15" w:history="1">
+      <w:hyperlink r:id="rId16" w:history="1">
         <w:r>
           <w:rPr>
             <w:rStyle w:val="Hyperlink"/>
@@ -4774,23 +4357,13 @@
           <w:szCs w:val="24"/>
         </w:rPr>
       </w:pPr>
-      <w:proofErr w:type="spellStart"/>
-      <w:r>
-        <w:rPr>
-          <w:rFonts w:ascii="Times New Roman" w:hAnsi="Times New Roman" w:cs="Times New Roman"/>
-          <w:sz w:val="24"/>
-          <w:szCs w:val="24"/>
-        </w:rPr>
-        <w:t>Hanchen</w:t>
-      </w:r>
-      <w:proofErr w:type="spellEnd"/>
-      <w:r>
-        <w:rPr>
-          <w:rFonts w:ascii="Times New Roman" w:hAnsi="Times New Roman" w:cs="Times New Roman"/>
-          <w:sz w:val="24"/>
-          <w:szCs w:val="24"/>
-        </w:rPr>
-        <w:t xml:space="preserve"> Wang</w:t>
+      <w:r>
+        <w:rPr>
+          <w:rFonts w:ascii="Times New Roman" w:hAnsi="Times New Roman" w:cs="Times New Roman"/>
+          <w:sz w:val="24"/>
+          <w:szCs w:val="24"/>
+        </w:rPr>
+        <w:t>Hanchen Wang</w:t>
       </w:r>
     </w:p>
     <w:p>
@@ -4847,7 +4420,7 @@
           <w:szCs w:val="24"/>
         </w:rPr>
       </w:pPr>
-      <w:hyperlink r:id="rId16" w:history="1">
+      <w:hyperlink r:id="rId17" w:history="1">
         <w:r>
           <w:rPr>
             <w:rStyle w:val="Hyperlink"/>
@@ -4919,7 +4492,6 @@
           <w:sz w:val="24"/>
           <w:szCs w:val="24"/>
         </w:rPr>
-        <w:lastRenderedPageBreak/>
         <w:t>University of California, Berkeley</w:t>
       </w:r>
     </w:p>
@@ -4956,7 +4528,7 @@
           <w:szCs w:val="24"/>
         </w:rPr>
       </w:pPr>
-      <w:hyperlink r:id="rId17" w:history="1">
+      <w:hyperlink r:id="rId18" w:history="1">
         <w:r>
           <w:rPr>
             <w:rStyle w:val="Hyperlink"/>
@@ -5029,12 +4601,12 @@
       </w:pPr>
     </w:p>
     <w:sectPr>
-      <w:headerReference w:type="even" r:id="rId18"/>
-      <w:headerReference w:type="default" r:id="rId19"/>
-      <w:footerReference w:type="even" r:id="rId20"/>
-      <w:footerReference w:type="default" r:id="rId21"/>
-      <w:headerReference w:type="first" r:id="rId22"/>
-      <w:footerReference w:type="first" r:id="rId23"/>
+      <w:headerReference w:type="even" r:id="rId19"/>
+      <w:headerReference w:type="default" r:id="rId20"/>
+      <w:footerReference w:type="even" r:id="rId21"/>
+      <w:footerReference w:type="default" r:id="rId22"/>
+      <w:headerReference w:type="first" r:id="rId23"/>
+      <w:footerReference w:type="first" r:id="rId24"/>
       <w:pgSz w:w="12240" w:h="15840"/>
       <w:pgMar w:top="1440" w:right="1440" w:bottom="1440" w:left="1440" w:header="720" w:footer="720" w:gutter="0"/>
       <w:cols w:space="720"/>
@@ -5045,7 +4617,7 @@
 </file>
 
 <file path=word/endnotes.xml><?xml version="1.0" encoding="utf-8"?>
-<w:endnotes xmlns:wpc="http://schemas.microsoft.com/office/word/2010/wordprocessingCanvas" xmlns:cx="http://schemas.microsoft.com/office/drawing/2014/chartex" xmlns:cx1="http://schemas.microsoft.com/office/drawing/2015/9/8/chartex" xmlns:cx2="http://schemas.microsoft.com/office/drawing/2015/10/21/chartex" xmlns:cx3="http://schemas.microsoft.com/office/drawing/2016/5/9/chartex" xmlns:cx4="http://schemas.microsoft.com/office/drawing/2016/5/10/chartex" xmlns:cx5="http://schemas.microsoft.com/office/drawing/2016/5/11/chartex" xmlns:cx6="http://schemas.microsoft.com/office/drawing/2016/5/12/chartex" xmlns:cx7="http://schemas.microsoft.com/office/drawing/2016/5/13/chartex" xmlns:cx8="http://schemas.microsoft.com/office/drawing/2016/5/14/chartex" xmlns:mc="http://schemas.openxmlformats.org/markup-compatibility/2006" xmlns:m="http://schemas.openxmlformats.org/officeDocument/2006/math" xmlns:aink="http://schemas.microsoft.com/office/drawing/2016/ink" xmlns:am3d="http://schemas.microsoft.com/office/drawing/2017/model3d" xmlns:oel="http://schemas.microsoft.com/office/2019/extlst" xmlns:r="http://schemas.openxmlformats.org/officeDocument/2006/relationships" xmlns:wp14="http://schemas.microsoft.com/office/word/2010/wordprocessingDrawing" xmlns:wp="http://schemas.openxmlformats.org/drawingml/2006/wordprocessingDrawing" xmlns:wpg="http://schemas.microsoft.com/office/word/2010/wordprocessingGroup" xmlns:wpi="http://schemas.microsoft.com/office/word/2010/wordprocessingInk" xmlns:wps="http://schemas.microsoft.com/office/word/2010/wordprocessingShape" xmlns:o="urn:schemas-microsoft-com:office:office" xmlns:v="urn:schemas-microsoft-com:vml" xmlns:w10="urn:schemas-microsoft-com:office:word" xmlns:w="http://schemas.openxmlformats.org/wordprocessingml/2006/main" xmlns:w14="http://schemas.microsoft.com/office/word/2010/wordml" xmlns:w15="http://schemas.microsoft.com/office/word/2012/wordml" xmlns:w16cei="http://schemas.microsoft.com/office/word/2026/wordml/cei" xmlns:w16cex="http://schemas.microsoft.com/office/word/2018/wordml/cex" xmlns:w16cid="http://schemas.microsoft.com/office/word/2016/wordml/cid" xmlns:w16="http://schemas.microsoft.com/office/word/2018/wordml" xmlns:w16sdtdh="http://schemas.microsoft.com/office/word/2020/wordml/sdtdatahash" xmlns:w16sdtfl="http://schemas.microsoft.com/office/word/2024/wordml/sdtformatlock" xmlns:w16se="http://schemas.microsoft.com/office/word/2015/wordml/symex" xmlns:w16du="http://schemas.microsoft.com/office/word/2023/wordml/word16du" xmlns:wne="http://schemas.microsoft.com/office/word/2006/wordml" mc:Ignorable="w14 w15 w16se w16cid w16 w16cex w16sdtdh w16sdtfl w16du wp14">
+<w:endnotes xmlns:wpc="http://schemas.microsoft.com/office/word/2010/wordprocessingCanvas" xmlns:cx="http://schemas.microsoft.com/office/drawing/2014/chartex" xmlns:cx1="http://schemas.microsoft.com/office/drawing/2015/9/8/chartex" xmlns:cx2="http://schemas.microsoft.com/office/drawing/2015/10/21/chartex" xmlns:cx3="http://schemas.microsoft.com/office/drawing/2016/5/9/chartex" xmlns:cx4="http://schemas.microsoft.com/office/drawing/2016/5/10/chartex" xmlns:cx5="http://schemas.microsoft.com/office/drawing/2016/5/11/chartex" xmlns:cx6="http://schemas.microsoft.com/office/drawing/2016/5/12/chartex" xmlns:cx7="http://schemas.microsoft.com/office/drawing/2016/5/13/chartex" xmlns:cx8="http://schemas.microsoft.com/office/drawing/2016/5/14/chartex" xmlns:mc="http://schemas.openxmlformats.org/markup-compatibility/2006" xmlns:m="http://schemas.openxmlformats.org/officeDocument/2006/math" xmlns:aink="http://schemas.microsoft.com/office/drawing/2016/ink" xmlns:am3d="http://schemas.microsoft.com/office/drawing/2017/model3d" xmlns:oel="http://schemas.microsoft.com/office/2019/extlst" xmlns:r="http://schemas.openxmlformats.org/officeDocument/2006/relationships" xmlns:wp14="http://schemas.microsoft.com/office/word/2010/wordprocessingDrawing" xmlns:wp="http://schemas.openxmlformats.org/drawingml/2006/wordprocessingDrawing" xmlns:wpg="http://schemas.microsoft.com/office/word/2010/wordprocessingGroup" xmlns:wpi="http://schemas.microsoft.com/office/word/2010/wordprocessingInk" xmlns:wps="http://schemas.microsoft.com/office/word/2010/wordprocessingShape" xmlns:o="urn:schemas-microsoft-com:office:office" xmlns:v="urn:schemas-microsoft-com:vml" xmlns:w10="urn:schemas-microsoft-com:office:word" xmlns:w="http://schemas.openxmlformats.org/wordprocessingml/2006/main" xmlns:w14="http://schemas.microsoft.com/office/word/2010/wordml" xmlns:w15="http://schemas.microsoft.com/office/word/2012/wordml" xmlns:w16cex="http://schemas.microsoft.com/office/word/2018/wordml/cex" xmlns:w16cid="http://schemas.microsoft.com/office/word/2016/wordml/cid" xmlns:w16="http://schemas.microsoft.com/office/word/2018/wordml" xmlns:w16sdtdh="http://schemas.microsoft.com/office/word/2020/wordml/sdtdatahash" xmlns:w16sdtfl="http://schemas.microsoft.com/office/word/2024/wordml/sdtformatlock" xmlns:w16se="http://schemas.microsoft.com/office/word/2015/wordml/symex" xmlns:w16du="http://schemas.microsoft.com/office/word/2023/wordml/word16du" xmlns:wne="http://schemas.microsoft.com/office/word/2006/wordml" mc:Ignorable="w14 w15 w16se w16cid w16 w16cex w16sdtdh w16sdtfl w16du wp14">
   <w:endnote w:type="separator" w:id="-1">
     <w:p>
       <w:pPr>
@@ -5070,7 +4642,7 @@
 </file>
 
 <file path=word/footer1.xml><?xml version="1.0" encoding="utf-8"?>
-<w:ftr xmlns:wpc="http://schemas.microsoft.com/office/word/2010/wordprocessingCanvas" xmlns:cx="http://schemas.microsoft.com/office/drawing/2014/chartex" xmlns:cx1="http://schemas.microsoft.com/office/drawing/2015/9/8/chartex" xmlns:cx2="http://schemas.microsoft.com/office/drawing/2015/10/21/chartex" xmlns:cx3="http://schemas.microsoft.com/office/drawing/2016/5/9/chartex" xmlns:cx4="http://schemas.microsoft.com/office/drawing/2016/5/10/chartex" xmlns:cx5="http://schemas.microsoft.com/office/drawing/2016/5/11/chartex" xmlns:cx6="http://schemas.microsoft.com/office/drawing/2016/5/12/chartex" xmlns:cx7="http://schemas.microsoft.com/office/drawing/2016/5/13/chartex" xmlns:cx8="http://schemas.microsoft.com/office/drawing/2016/5/14/chartex" xmlns:mc="http://schemas.openxmlformats.org/markup-compatibility/2006" xmlns:m="http://schemas.openxmlformats.org/officeDocument/2006/math" xmlns:aink="http://schemas.microsoft.com/office/drawing/2016/ink" xmlns:am3d="http://schemas.microsoft.com/office/drawing/2017/model3d" xmlns:oel="http://schemas.microsoft.com/office/2019/extlst" xmlns:r="http://schemas.openxmlformats.org/officeDocument/2006/relationships" xmlns:wp14="http://schemas.microsoft.com/office/word/2010/wordprocessingDrawing" xmlns:wp="http://schemas.openxmlformats.org/drawingml/2006/wordprocessingDrawing" xmlns:wpg="http://schemas.microsoft.com/office/word/2010/wordprocessingGroup" xmlns:wpi="http://schemas.microsoft.com/office/word/2010/wordprocessingInk" xmlns:wps="http://schemas.microsoft.com/office/word/2010/wordprocessingShape" xmlns:o="urn:schemas-microsoft-com:office:office" xmlns:v="urn:schemas-microsoft-com:vml" xmlns:w10="urn:schemas-microsoft-com:office:word" xmlns:w="http://schemas.openxmlformats.org/wordprocessingml/2006/main" xmlns:w14="http://schemas.microsoft.com/office/word/2010/wordml" xmlns:w15="http://schemas.microsoft.com/office/word/2012/wordml" xmlns:w16cei="http://schemas.microsoft.com/office/word/2026/wordml/cei" xmlns:w16cex="http://schemas.microsoft.com/office/word/2018/wordml/cex" xmlns:w16cid="http://schemas.microsoft.com/office/word/2016/wordml/cid" xmlns:w16="http://schemas.microsoft.com/office/word/2018/wordml" xmlns:w16sdtdh="http://schemas.microsoft.com/office/word/2020/wordml/sdtdatahash" xmlns:w16sdtfl="http://schemas.microsoft.com/office/word/2024/wordml/sdtformatlock" xmlns:w16se="http://schemas.microsoft.com/office/word/2015/wordml/symex" xmlns:w16du="http://schemas.microsoft.com/office/word/2023/wordml/word16du" xmlns:wne="http://schemas.microsoft.com/office/word/2006/wordml" mc:Ignorable="w14 w15 w16se w16cid w16 w16cex w16sdtdh w16sdtfl w16du wp14">
+<w:ftr xmlns:wpc="http://schemas.microsoft.com/office/word/2010/wordprocessingCanvas" xmlns:cx="http://schemas.microsoft.com/office/drawing/2014/chartex" xmlns:cx1="http://schemas.microsoft.com/office/drawing/2015/9/8/chartex" xmlns:cx2="http://schemas.microsoft.com/office/drawing/2015/10/21/chartex" xmlns:cx3="http://schemas.microsoft.com/office/drawing/2016/5/9/chartex" xmlns:cx4="http://schemas.microsoft.com/office/drawing/2016/5/10/chartex" xmlns:cx5="http://schemas.microsoft.com/office/drawing/2016/5/11/chartex" xmlns:cx6="http://schemas.microsoft.com/office/drawing/2016/5/12/chartex" xmlns:cx7="http://schemas.microsoft.com/office/drawing/2016/5/13/chartex" xmlns:cx8="http://schemas.microsoft.com/office/drawing/2016/5/14/chartex" xmlns:mc="http://schemas.openxmlformats.org/markup-compatibility/2006" xmlns:m="http://schemas.openxmlformats.org/officeDocument/2006/math" xmlns:aink="http://schemas.microsoft.com/office/drawing/2016/ink" xmlns:am3d="http://schemas.microsoft.com/office/drawing/2017/model3d" xmlns:oel="http://schemas.microsoft.com/office/2019/extlst" xmlns:r="http://schemas.openxmlformats.org/officeDocument/2006/relationships" xmlns:wp14="http://schemas.microsoft.com/office/word/2010/wordprocessingDrawing" xmlns:wp="http://schemas.openxmlformats.org/drawingml/2006/wordprocessingDrawing" xmlns:wpg="http://schemas.microsoft.com/office/word/2010/wordprocessingGroup" xmlns:wpi="http://schemas.microsoft.com/office/word/2010/wordprocessingInk" xmlns:wps="http://schemas.microsoft.com/office/word/2010/wordprocessingShape" xmlns:o="urn:schemas-microsoft-com:office:office" xmlns:v="urn:schemas-microsoft-com:vml" xmlns:w10="urn:schemas-microsoft-com:office:word" xmlns:w="http://schemas.openxmlformats.org/wordprocessingml/2006/main" xmlns:w14="http://schemas.microsoft.com/office/word/2010/wordml" xmlns:w15="http://schemas.microsoft.com/office/word/2012/wordml" xmlns:w16cex="http://schemas.microsoft.com/office/word/2018/wordml/cex" xmlns:w16cid="http://schemas.microsoft.com/office/word/2016/wordml/cid" xmlns:w16="http://schemas.microsoft.com/office/word/2018/wordml" xmlns:w16sdtdh="http://schemas.microsoft.com/office/word/2020/wordml/sdtdatahash" xmlns:w16sdtfl="http://schemas.microsoft.com/office/word/2024/wordml/sdtformatlock" xmlns:w16se="http://schemas.microsoft.com/office/word/2015/wordml/symex" xmlns:w16du="http://schemas.microsoft.com/office/word/2023/wordml/word16du" xmlns:wne="http://schemas.microsoft.com/office/word/2006/wordml" mc:Ignorable="w14 w15 w16se w16cid w16 w16cex w16sdtdh w16sdtfl w16du wp14">
   <w:p>
     <w:pPr>
       <w:pStyle w:val="Footer"/>
@@ -5080,7 +4652,7 @@
 </file>
 
 <file path=word/footer2.xml><?xml version="1.0" encoding="utf-8"?>
-<w:ftr xmlns:wpc="http://schemas.microsoft.com/office/word/2010/wordprocessingCanvas" xmlns:cx="http://schemas.microsoft.com/office/drawing/2014/chartex" xmlns:cx1="http://schemas.microsoft.com/office/drawing/2015/9/8/chartex" xmlns:cx2="http://schemas.microsoft.com/office/drawing/2015/10/21/chartex" xmlns:cx3="http://schemas.microsoft.com/office/drawing/2016/5/9/chartex" xmlns:cx4="http://schemas.microsoft.com/office/drawing/2016/5/10/chartex" xmlns:cx5="http://schemas.microsoft.com/office/drawing/2016/5/11/chartex" xmlns:cx6="http://schemas.microsoft.com/office/drawing/2016/5/12/chartex" xmlns:cx7="http://schemas.microsoft.com/office/drawing/2016/5/13/chartex" xmlns:cx8="http://schemas.microsoft.com/office/drawing/2016/5/14/chartex" xmlns:mc="http://schemas.openxmlformats.org/markup-compatibility/2006" xmlns:m="http://schemas.openxmlformats.org/officeDocument/2006/math" xmlns:aink="http://schemas.microsoft.com/office/drawing/2016/ink" xmlns:am3d="http://schemas.microsoft.com/office/drawing/2017/model3d" xmlns:oel="http://schemas.microsoft.com/office/2019/extlst" xmlns:r="http://schemas.openxmlformats.org/officeDocument/2006/relationships" xmlns:wp14="http://schemas.microsoft.com/office/word/2010/wordprocessingDrawing" xmlns:wp="http://schemas.openxmlformats.org/drawingml/2006/wordprocessingDrawing" xmlns:wpg="http://schemas.microsoft.com/office/word/2010/wordprocessingGroup" xmlns:wpi="http://schemas.microsoft.com/office/word/2010/wordprocessingInk" xmlns:wps="http://schemas.microsoft.com/office/word/2010/wordprocessingShape" xmlns:o="urn:schemas-microsoft-com:office:office" xmlns:v="urn:schemas-microsoft-com:vml" xmlns:w10="urn:schemas-microsoft-com:office:word" xmlns:w="http://schemas.openxmlformats.org/wordprocessingml/2006/main" xmlns:w14="http://schemas.microsoft.com/office/word/2010/wordml" xmlns:w15="http://schemas.microsoft.com/office/word/2012/wordml" xmlns:w16cei="http://schemas.microsoft.com/office/word/2026/wordml/cei" xmlns:w16cex="http://schemas.microsoft.com/office/word/2018/wordml/cex" xmlns:w16cid="http://schemas.microsoft.com/office/word/2016/wordml/cid" xmlns:w16="http://schemas.microsoft.com/office/word/2018/wordml" xmlns:w16sdtdh="http://schemas.microsoft.com/office/word/2020/wordml/sdtdatahash" xmlns:w16sdtfl="http://schemas.microsoft.com/office/word/2024/wordml/sdtformatlock" xmlns:w16se="http://schemas.microsoft.com/office/word/2015/wordml/symex" xmlns:w16du="http://schemas.microsoft.com/office/word/2023/wordml/word16du" xmlns:wne="http://schemas.microsoft.com/office/word/2006/wordml" mc:Ignorable="w14 w15 w16se w16cid w16 w16cex w16sdtdh w16sdtfl w16du wp14">
+<w:ftr xmlns:wpc="http://schemas.microsoft.com/office/word/2010/wordprocessingCanvas" xmlns:cx="http://schemas.microsoft.com/office/drawing/2014/chartex" xmlns:cx1="http://schemas.microsoft.com/office/drawing/2015/9/8/chartex" xmlns:cx2="http://schemas.microsoft.com/office/drawing/2015/10/21/chartex" xmlns:cx3="http://schemas.microsoft.com/office/drawing/2016/5/9/chartex" xmlns:cx4="http://schemas.microsoft.com/office/drawing/2016/5/10/chartex" xmlns:cx5="http://schemas.microsoft.com/office/drawing/2016/5/11/chartex" xmlns:cx6="http://schemas.microsoft.com/office/drawing/2016/5/12/chartex" xmlns:cx7="http://schemas.microsoft.com/office/drawing/2016/5/13/chartex" xmlns:cx8="http://schemas.microsoft.com/office/drawing/2016/5/14/chartex" xmlns:mc="http://schemas.openxmlformats.org/markup-compatibility/2006" xmlns:m="http://schemas.openxmlformats.org/officeDocument/2006/math" xmlns:aink="http://schemas.microsoft.com/office/drawing/2016/ink" xmlns:am3d="http://schemas.microsoft.com/office/drawing/2017/model3d" xmlns:oel="http://schemas.microsoft.com/office/2019/extlst" xmlns:r="http://schemas.openxmlformats.org/officeDocument/2006/relationships" xmlns:wp14="http://schemas.microsoft.com/office/word/2010/wordprocessingDrawing" xmlns:wp="http://schemas.openxmlformats.org/drawingml/2006/wordprocessingDrawing" xmlns:wpg="http://schemas.microsoft.com/office/word/2010/wordprocessingGroup" xmlns:wpi="http://schemas.microsoft.com/office/word/2010/wordprocessingInk" xmlns:wps="http://schemas.microsoft.com/office/word/2010/wordprocessingShape" xmlns:o="urn:schemas-microsoft-com:office:office" xmlns:v="urn:schemas-microsoft-com:vml" xmlns:w10="urn:schemas-microsoft-com:office:word" xmlns:w="http://schemas.openxmlformats.org/wordprocessingml/2006/main" xmlns:w14="http://schemas.microsoft.com/office/word/2010/wordml" xmlns:w15="http://schemas.microsoft.com/office/word/2012/wordml" xmlns:w16cex="http://schemas.microsoft.com/office/word/2018/wordml/cex" xmlns:w16cid="http://schemas.microsoft.com/office/word/2016/wordml/cid" xmlns:w16="http://schemas.microsoft.com/office/word/2018/wordml" xmlns:w16sdtdh="http://schemas.microsoft.com/office/word/2020/wordml/sdtdatahash" xmlns:w16sdtfl="http://schemas.microsoft.com/office/word/2024/wordml/sdtformatlock" xmlns:w16se="http://schemas.microsoft.com/office/word/2015/wordml/symex" xmlns:w16du="http://schemas.microsoft.com/office/word/2023/wordml/word16du" xmlns:wne="http://schemas.microsoft.com/office/word/2006/wordml" mc:Ignorable="w14 w15 w16se w16cid w16 w16cex w16sdtdh w16sdtfl w16du wp14">
   <w:p>
     <w:pPr>
       <w:pStyle w:val="Footer"/>
@@ -5136,7 +4708,7 @@
 </file>
 
 <file path=word/footer3.xml><?xml version="1.0" encoding="utf-8"?>
-<w:ftr xmlns:wpc="http://schemas.microsoft.com/office/word/2010/wordprocessingCanvas" xmlns:cx="http://schemas.microsoft.com/office/drawing/2014/chartex" xmlns:cx1="http://schemas.microsoft.com/office/drawing/2015/9/8/chartex" xmlns:cx2="http://schemas.microsoft.com/office/drawing/2015/10/21/chartex" xmlns:cx3="http://schemas.microsoft.com/office/drawing/2016/5/9/chartex" xmlns:cx4="http://schemas.microsoft.com/office/drawing/2016/5/10/chartex" xmlns:cx5="http://schemas.microsoft.com/office/drawing/2016/5/11/chartex" xmlns:cx6="http://schemas.microsoft.com/office/drawing/2016/5/12/chartex" xmlns:cx7="http://schemas.microsoft.com/office/drawing/2016/5/13/chartex" xmlns:cx8="http://schemas.microsoft.com/office/drawing/2016/5/14/chartex" xmlns:mc="http://schemas.openxmlformats.org/markup-compatibility/2006" xmlns:m="http://schemas.openxmlformats.org/officeDocument/2006/math" xmlns:aink="http://schemas.microsoft.com/office/drawing/2016/ink" xmlns:am3d="http://schemas.microsoft.com/office/drawing/2017/model3d" xmlns:oel="http://schemas.microsoft.com/office/2019/extlst" xmlns:r="http://schemas.openxmlformats.org/officeDocument/2006/relationships" xmlns:wp14="http://schemas.microsoft.com/office/word/2010/wordprocessingDrawing" xmlns:wp="http://schemas.openxmlformats.org/drawingml/2006/wordprocessingDrawing" xmlns:wpg="http://schemas.microsoft.com/office/word/2010/wordprocessingGroup" xmlns:wpi="http://schemas.microsoft.com/office/word/2010/wordprocessingInk" xmlns:wps="http://schemas.microsoft.com/office/word/2010/wordprocessingShape" xmlns:o="urn:schemas-microsoft-com:office:office" xmlns:v="urn:schemas-microsoft-com:vml" xmlns:w10="urn:schemas-microsoft-com:office:word" xmlns:w="http://schemas.openxmlformats.org/wordprocessingml/2006/main" xmlns:w14="http://schemas.microsoft.com/office/word/2010/wordml" xmlns:w15="http://schemas.microsoft.com/office/word/2012/wordml" xmlns:w16cei="http://schemas.microsoft.com/office/word/2026/wordml/cei" xmlns:w16cex="http://schemas.microsoft.com/office/word/2018/wordml/cex" xmlns:w16cid="http://schemas.microsoft.com/office/word/2016/wordml/cid" xmlns:w16="http://schemas.microsoft.com/office/word/2018/wordml" xmlns:w16sdtdh="http://schemas.microsoft.com/office/word/2020/wordml/sdtdatahash" xmlns:w16sdtfl="http://schemas.microsoft.com/office/word/2024/wordml/sdtformatlock" xmlns:w16se="http://schemas.microsoft.com/office/word/2015/wordml/symex" xmlns:w16du="http://schemas.microsoft.com/office/word/2023/wordml/word16du" xmlns:wne="http://schemas.microsoft.com/office/word/2006/wordml" mc:Ignorable="w14 w15 w16se w16cid w16 w16cex w16sdtdh w16sdtfl w16du wp14">
+<w:ftr xmlns:wpc="http://schemas.microsoft.com/office/word/2010/wordprocessingCanvas" xmlns:cx="http://schemas.microsoft.com/office/drawing/2014/chartex" xmlns:cx1="http://schemas.microsoft.com/office/drawing/2015/9/8/chartex" xmlns:cx2="http://schemas.microsoft.com/office/drawing/2015/10/21/chartex" xmlns:cx3="http://schemas.microsoft.com/office/drawing/2016/5/9/chartex" xmlns:cx4="http://schemas.microsoft.com/office/drawing/2016/5/10/chartex" xmlns:cx5="http://schemas.microsoft.com/office/drawing/2016/5/11/chartex" xmlns:cx6="http://schemas.microsoft.com/office/drawing/2016/5/12/chartex" xmlns:cx7="http://schemas.microsoft.com/office/drawing/2016/5/13/chartex" xmlns:cx8="http://schemas.microsoft.com/office/drawing/2016/5/14/chartex" xmlns:mc="http://schemas.openxmlformats.org/markup-compatibility/2006" xmlns:m="http://schemas.openxmlformats.org/officeDocument/2006/math" xmlns:aink="http://schemas.microsoft.com/office/drawing/2016/ink" xmlns:am3d="http://schemas.microsoft.com/office/drawing/2017/model3d" xmlns:oel="http://schemas.microsoft.com/office/2019/extlst" xmlns:r="http://schemas.openxmlformats.org/officeDocument/2006/relationships" xmlns:wp14="http://schemas.microsoft.com/office/word/2010/wordprocessingDrawing" xmlns:wp="http://schemas.openxmlformats.org/drawingml/2006/wordprocessingDrawing" xmlns:wpg="http://schemas.microsoft.com/office/word/2010/wordprocessingGroup" xmlns:wpi="http://schemas.microsoft.com/office/word/2010/wordprocessingInk" xmlns:wps="http://schemas.microsoft.com/office/word/2010/wordprocessingShape" xmlns:o="urn:schemas-microsoft-com:office:office" xmlns:v="urn:schemas-microsoft-com:vml" xmlns:w10="urn:schemas-microsoft-com:office:word" xmlns:w="http://schemas.openxmlformats.org/wordprocessingml/2006/main" xmlns:w14="http://schemas.microsoft.com/office/word/2010/wordml" xmlns:w15="http://schemas.microsoft.com/office/word/2012/wordml" xmlns:w16cex="http://schemas.microsoft.com/office/word/2018/wordml/cex" xmlns:w16cid="http://schemas.microsoft.com/office/word/2016/wordml/cid" xmlns:w16="http://schemas.microsoft.com/office/word/2018/wordml" xmlns:w16sdtdh="http://schemas.microsoft.com/office/word/2020/wordml/sdtdatahash" xmlns:w16sdtfl="http://schemas.microsoft.com/office/word/2024/wordml/sdtformatlock" xmlns:w16se="http://schemas.microsoft.com/office/word/2015/wordml/symex" xmlns:w16du="http://schemas.microsoft.com/office/word/2023/wordml/word16du" xmlns:wne="http://schemas.microsoft.com/office/word/2006/wordml" mc:Ignorable="w14 w15 w16se w16cid w16 w16cex w16sdtdh w16sdtfl w16du wp14">
   <w:p>
     <w:pPr>
       <w:pStyle w:val="Footer"/>
@@ -5146,7 +4718,7 @@
 </file>
 
 <file path=word/footnotes.xml><?xml version="1.0" encoding="utf-8"?>
-<w:footnotes xmlns:wpc="http://schemas.microsoft.com/office/word/2010/wordprocessingCanvas" xmlns:cx="http://schemas.microsoft.com/office/drawing/2014/chartex" xmlns:cx1="http://schemas.microsoft.com/office/drawing/2015/9/8/chartex" xmlns:cx2="http://schemas.microsoft.com/office/drawing/2015/10/21/chartex" xmlns:cx3="http://schemas.microsoft.com/office/drawing/2016/5/9/chartex" xmlns:cx4="http://schemas.microsoft.com/office/drawing/2016/5/10/chartex" xmlns:cx5="http://schemas.microsoft.com/office/drawing/2016/5/11/chartex" xmlns:cx6="http://schemas.microsoft.com/office/drawing/2016/5/12/chartex" xmlns:cx7="http://schemas.microsoft.com/office/drawing/2016/5/13/chartex" xmlns:cx8="http://schemas.microsoft.com/office/drawing/2016/5/14/chartex" xmlns:mc="http://schemas.openxmlformats.org/markup-compatibility/2006" xmlns:m="http://schemas.openxmlformats.org/officeDocument/2006/math" xmlns:aink="http://schemas.microsoft.com/office/drawing/2016/ink" xmlns:am3d="http://schemas.microsoft.com/office/drawing/2017/model3d" xmlns:oel="http://schemas.microsoft.com/office/2019/extlst" xmlns:r="http://schemas.openxmlformats.org/officeDocument/2006/relationships" xmlns:wp14="http://schemas.microsoft.com/office/word/2010/wordprocessingDrawing" xmlns:wp="http://schemas.openxmlformats.org/drawingml/2006/wordprocessingDrawing" xmlns:wpg="http://schemas.microsoft.com/office/word/2010/wordprocessingGroup" xmlns:wpi="http://schemas.microsoft.com/office/word/2010/wordprocessingInk" xmlns:wps="http://schemas.microsoft.com/office/word/2010/wordprocessingShape" xmlns:o="urn:schemas-microsoft-com:office:office" xmlns:v="urn:schemas-microsoft-com:vml" xmlns:w10="urn:schemas-microsoft-com:office:word" xmlns:w="http://schemas.openxmlformats.org/wordprocessingml/2006/main" xmlns:w14="http://schemas.microsoft.com/office/word/2010/wordml" xmlns:w15="http://schemas.microsoft.com/office/word/2012/wordml" xmlns:w16cei="http://schemas.microsoft.com/office/word/2026/wordml/cei" xmlns:w16cex="http://schemas.microsoft.com/office/word/2018/wordml/cex" xmlns:w16cid="http://schemas.microsoft.com/office/word/2016/wordml/cid" xmlns:w16="http://schemas.microsoft.com/office/word/2018/wordml" xmlns:w16sdtdh="http://schemas.microsoft.com/office/word/2020/wordml/sdtdatahash" xmlns:w16sdtfl="http://schemas.microsoft.com/office/word/2024/wordml/sdtformatlock" xmlns:w16se="http://schemas.microsoft.com/office/word/2015/wordml/symex" xmlns:w16du="http://schemas.microsoft.com/office/word/2023/wordml/word16du" xmlns:wne="http://schemas.microsoft.com/office/word/2006/wordml" mc:Ignorable="w14 w15 w16se w16cid w16 w16cex w16sdtdh w16sdtfl w16du wp14">
+<w:footnotes xmlns:wpc="http://schemas.microsoft.com/office/word/2010/wordprocessingCanvas" xmlns:cx="http://schemas.microsoft.com/office/drawing/2014/chartex" xmlns:cx1="http://schemas.microsoft.com/office/drawing/2015/9/8/chartex" xmlns:cx2="http://schemas.microsoft.com/office/drawing/2015/10/21/chartex" xmlns:cx3="http://schemas.microsoft.com/office/drawing/2016/5/9/chartex" xmlns:cx4="http://schemas.microsoft.com/office/drawing/2016/5/10/chartex" xmlns:cx5="http://schemas.microsoft.com/office/drawing/2016/5/11/chartex" xmlns:cx6="http://schemas.microsoft.com/office/drawing/2016/5/12/chartex" xmlns:cx7="http://schemas.microsoft.com/office/drawing/2016/5/13/chartex" xmlns:cx8="http://schemas.microsoft.com/office/drawing/2016/5/14/chartex" xmlns:mc="http://schemas.openxmlformats.org/markup-compatibility/2006" xmlns:m="http://schemas.openxmlformats.org/officeDocument/2006/math" xmlns:aink="http://schemas.microsoft.com/office/drawing/2016/ink" xmlns:am3d="http://schemas.microsoft.com/office/drawing/2017/model3d" xmlns:oel="http://schemas.microsoft.com/office/2019/extlst" xmlns:r="http://schemas.openxmlformats.org/officeDocument/2006/relationships" xmlns:wp14="http://schemas.microsoft.com/office/word/2010/wordprocessingDrawing" xmlns:wp="http://schemas.openxmlformats.org/drawingml/2006/wordprocessingDrawing" xmlns:wpg="http://schemas.microsoft.com/office/word/2010/wordprocessingGroup" xmlns:wpi="http://schemas.microsoft.com/office/word/2010/wordprocessingInk" xmlns:wps="http://schemas.microsoft.com/office/word/2010/wordprocessingShape" xmlns:o="urn:schemas-microsoft-com:office:office" xmlns:v="urn:schemas-microsoft-com:vml" xmlns:w10="urn:schemas-microsoft-com:office:word" xmlns:w="http://schemas.openxmlformats.org/wordprocessingml/2006/main" xmlns:w14="http://schemas.microsoft.com/office/word/2010/wordml" xmlns:w15="http://schemas.microsoft.com/office/word/2012/wordml" xmlns:w16cex="http://schemas.microsoft.com/office/word/2018/wordml/cex" xmlns:w16cid="http://schemas.microsoft.com/office/word/2016/wordml/cid" xmlns:w16="http://schemas.microsoft.com/office/word/2018/wordml" xmlns:w16sdtdh="http://schemas.microsoft.com/office/word/2020/wordml/sdtdatahash" xmlns:w16sdtfl="http://schemas.microsoft.com/office/word/2024/wordml/sdtformatlock" xmlns:w16se="http://schemas.microsoft.com/office/word/2015/wordml/symex" xmlns:w16du="http://schemas.microsoft.com/office/word/2023/wordml/word16du" xmlns:wne="http://schemas.microsoft.com/office/word/2006/wordml" mc:Ignorable="w14 w15 w16se w16cid w16 w16cex w16sdtdh w16sdtfl w16du wp14">
   <w:footnote w:type="separator" w:id="-1">
     <w:p>
       <w:pPr>
@@ -5171,7 +4743,7 @@
 </file>
 
 <file path=word/header1.xml><?xml version="1.0" encoding="utf-8"?>
-<w:hdr xmlns:wpc="http://schemas.microsoft.com/office/word/2010/wordprocessingCanvas" xmlns:cx="http://schemas.microsoft.com/office/drawing/2014/chartex" xmlns:cx1="http://schemas.microsoft.com/office/drawing/2015/9/8/chartex" xmlns:cx2="http://schemas.microsoft.com/office/drawing/2015/10/21/chartex" xmlns:cx3="http://schemas.microsoft.com/office/drawing/2016/5/9/chartex" xmlns:cx4="http://schemas.microsoft.com/office/drawing/2016/5/10/chartex" xmlns:cx5="http://schemas.microsoft.com/office/drawing/2016/5/11/chartex" xmlns:cx6="http://schemas.microsoft.com/office/drawing/2016/5/12/chartex" xmlns:cx7="http://schemas.microsoft.com/office/drawing/2016/5/13/chartex" xmlns:cx8="http://schemas.microsoft.com/office/drawing/2016/5/14/chartex" xmlns:mc="http://schemas.openxmlformats.org/markup-compatibility/2006" xmlns:m="http://schemas.openxmlformats.org/officeDocument/2006/math" xmlns:aink="http://schemas.microsoft.com/office/drawing/2016/ink" xmlns:am3d="http://schemas.microsoft.com/office/drawing/2017/model3d" xmlns:oel="http://schemas.microsoft.com/office/2019/extlst" xmlns:r="http://schemas.openxmlformats.org/officeDocument/2006/relationships" xmlns:wp14="http://schemas.microsoft.com/office/word/2010/wordprocessingDrawing" xmlns:wp="http://schemas.openxmlformats.org/drawingml/2006/wordprocessingDrawing" xmlns:wpg="http://schemas.microsoft.com/office/word/2010/wordprocessingGroup" xmlns:wpi="http://schemas.microsoft.com/office/word/2010/wordprocessingInk" xmlns:wps="http://schemas.microsoft.com/office/word/2010/wordprocessingShape" xmlns:o="urn:schemas-microsoft-com:office:office" xmlns:v="urn:schemas-microsoft-com:vml" xmlns:w10="urn:schemas-microsoft-com:office:word" xmlns:w="http://schemas.openxmlformats.org/wordprocessingml/2006/main" xmlns:w14="http://schemas.microsoft.com/office/word/2010/wordml" xmlns:w15="http://schemas.microsoft.com/office/word/2012/wordml" xmlns:w16cei="http://schemas.microsoft.com/office/word/2026/wordml/cei" xmlns:w16cex="http://schemas.microsoft.com/office/word/2018/wordml/cex" xmlns:w16cid="http://schemas.microsoft.com/office/word/2016/wordml/cid" xmlns:w16="http://schemas.microsoft.com/office/word/2018/wordml" xmlns:w16sdtdh="http://schemas.microsoft.com/office/word/2020/wordml/sdtdatahash" xmlns:w16sdtfl="http://schemas.microsoft.com/office/word/2024/wordml/sdtformatlock" xmlns:w16se="http://schemas.microsoft.com/office/word/2015/wordml/symex" xmlns:w16du="http://schemas.microsoft.com/office/word/2023/wordml/word16du" xmlns:wne="http://schemas.microsoft.com/office/word/2006/wordml" mc:Ignorable="w14 w15 w16se w16cid w16 w16cex w16sdtdh w16sdtfl w16du wp14">
+<w:hdr xmlns:wpc="http://schemas.microsoft.com/office/word/2010/wordprocessingCanvas" xmlns:cx="http://schemas.microsoft.com/office/drawing/2014/chartex" xmlns:cx1="http://schemas.microsoft.com/office/drawing/2015/9/8/chartex" xmlns:cx2="http://schemas.microsoft.com/office/drawing/2015/10/21/chartex" xmlns:cx3="http://schemas.microsoft.com/office/drawing/2016/5/9/chartex" xmlns:cx4="http://schemas.microsoft.com/office/drawing/2016/5/10/chartex" xmlns:cx5="http://schemas.microsoft.com/office/drawing/2016/5/11/chartex" xmlns:cx6="http://schemas.microsoft.com/office/drawing/2016/5/12/chartex" xmlns:cx7="http://schemas.microsoft.com/office/drawing/2016/5/13/chartex" xmlns:cx8="http://schemas.microsoft.com/office/drawing/2016/5/14/chartex" xmlns:mc="http://schemas.openxmlformats.org/markup-compatibility/2006" xmlns:m="http://schemas.openxmlformats.org/officeDocument/2006/math" xmlns:aink="http://schemas.microsoft.com/office/drawing/2016/ink" xmlns:am3d="http://schemas.microsoft.com/office/drawing/2017/model3d" xmlns:oel="http://schemas.microsoft.com/office/2019/extlst" xmlns:r="http://schemas.openxmlformats.org/officeDocument/2006/relationships" xmlns:wp14="http://schemas.microsoft.com/office/word/2010/wordprocessingDrawing" xmlns:wp="http://schemas.openxmlformats.org/drawingml/2006/wordprocessingDrawing" xmlns:wpg="http://schemas.microsoft.com/office/word/2010/wordprocessingGroup" xmlns:wpi="http://schemas.microsoft.com/office/word/2010/wordprocessingInk" xmlns:wps="http://schemas.microsoft.com/office/word/2010/wordprocessingShape" xmlns:o="urn:schemas-microsoft-com:office:office" xmlns:v="urn:schemas-microsoft-com:vml" xmlns:w10="urn:schemas-microsoft-com:office:word" xmlns:w="http://schemas.openxmlformats.org/wordprocessingml/2006/main" xmlns:w14="http://schemas.microsoft.com/office/word/2010/wordml" xmlns:w15="http://schemas.microsoft.com/office/word/2012/wordml" xmlns:w16cex="http://schemas.microsoft.com/office/word/2018/wordml/cex" xmlns:w16cid="http://schemas.microsoft.com/office/word/2016/wordml/cid" xmlns:w16="http://schemas.microsoft.com/office/word/2018/wordml" xmlns:w16sdtdh="http://schemas.microsoft.com/office/word/2020/wordml/sdtdatahash" xmlns:w16sdtfl="http://schemas.microsoft.com/office/word/2024/wordml/sdtformatlock" xmlns:w16se="http://schemas.microsoft.com/office/word/2015/wordml/symex" xmlns:w16du="http://schemas.microsoft.com/office/word/2023/wordml/word16du" xmlns:wne="http://schemas.microsoft.com/office/word/2006/wordml" mc:Ignorable="w14 w15 w16se w16cid w16 w16cex w16sdtdh w16sdtfl w16du wp14">
   <w:p>
     <w:pPr>
       <w:pStyle w:val="Header"/>
@@ -5181,7 +4753,7 @@
 </file>
 
 <file path=word/header2.xml><?xml version="1.0" encoding="utf-8"?>
-<w:hdr xmlns:wpc="http://schemas.microsoft.com/office/word/2010/wordprocessingCanvas" xmlns:cx="http://schemas.microsoft.com/office/drawing/2014/chartex" xmlns:cx1="http://schemas.microsoft.com/office/drawing/2015/9/8/chartex" xmlns:cx2="http://schemas.microsoft.com/office/drawing/2015/10/21/chartex" xmlns:cx3="http://schemas.microsoft.com/office/drawing/2016/5/9/chartex" xmlns:cx4="http://schemas.microsoft.com/office/drawing/2016/5/10/chartex" xmlns:cx5="http://schemas.microsoft.com/office/drawing/2016/5/11/chartex" xmlns:cx6="http://schemas.microsoft.com/office/drawing/2016/5/12/chartex" xmlns:cx7="http://schemas.microsoft.com/office/drawing/2016/5/13/chartex" xmlns:cx8="http://schemas.microsoft.com/office/drawing/2016/5/14/chartex" xmlns:mc="http://schemas.openxmlformats.org/markup-compatibility/2006" xmlns:m="http://schemas.openxmlformats.org/officeDocument/2006/math" xmlns:aink="http://schemas.microsoft.com/office/drawing/2016/ink" xmlns:am3d="http://schemas.microsoft.com/office/drawing/2017/model3d" xmlns:oel="http://schemas.microsoft.com/office/2019/extlst" xmlns:r="http://schemas.openxmlformats.org/officeDocument/2006/relationships" xmlns:wp14="http://schemas.microsoft.com/office/word/2010/wordprocessingDrawing" xmlns:wp="http://schemas.openxmlformats.org/drawingml/2006/wordprocessingDrawing" xmlns:wpg="http://schemas.microsoft.com/office/word/2010/wordprocessingGroup" xmlns:wpi="http://schemas.microsoft.com/office/word/2010/wordprocessingInk" xmlns:wps="http://schemas.microsoft.com/office/word/2010/wordprocessingShape" xmlns:o="urn:schemas-microsoft-com:office:office" xmlns:v="urn:schemas-microsoft-com:vml" xmlns:w10="urn:schemas-microsoft-com:office:word" xmlns:w="http://schemas.openxmlformats.org/wordprocessingml/2006/main" xmlns:w14="http://schemas.microsoft.com/office/word/2010/wordml" xmlns:w15="http://schemas.microsoft.com/office/word/2012/wordml" xmlns:w16cei="http://schemas.microsoft.com/office/word/2026/wordml/cei" xmlns:w16cex="http://schemas.microsoft.com/office/word/2018/wordml/cex" xmlns:w16cid="http://schemas.microsoft.com/office/word/2016/wordml/cid" xmlns:w16="http://schemas.microsoft.com/office/word/2018/wordml" xmlns:w16sdtdh="http://schemas.microsoft.com/office/word/2020/wordml/sdtdatahash" xmlns:w16sdtfl="http://schemas.microsoft.com/office/word/2024/wordml/sdtformatlock" xmlns:w16se="http://schemas.microsoft.com/office/word/2015/wordml/symex" xmlns:w16du="http://schemas.microsoft.com/office/word/2023/wordml/word16du" xmlns:wne="http://schemas.microsoft.com/office/word/2006/wordml" mc:Ignorable="w14 w15 w16se w16cid w16 w16cex w16sdtdh w16sdtfl w16du wp14">
+<w:hdr xmlns:wpc="http://schemas.microsoft.com/office/word/2010/wordprocessingCanvas" xmlns:cx="http://schemas.microsoft.com/office/drawing/2014/chartex" xmlns:cx1="http://schemas.microsoft.com/office/drawing/2015/9/8/chartex" xmlns:cx2="http://schemas.microsoft.com/office/drawing/2015/10/21/chartex" xmlns:cx3="http://schemas.microsoft.com/office/drawing/2016/5/9/chartex" xmlns:cx4="http://schemas.microsoft.com/office/drawing/2016/5/10/chartex" xmlns:cx5="http://schemas.microsoft.com/office/drawing/2016/5/11/chartex" xmlns:cx6="http://schemas.microsoft.com/office/drawing/2016/5/12/chartex" xmlns:cx7="http://schemas.microsoft.com/office/drawing/2016/5/13/chartex" xmlns:cx8="http://schemas.microsoft.com/office/drawing/2016/5/14/chartex" xmlns:mc="http://schemas.openxmlformats.org/markup-compatibility/2006" xmlns:m="http://schemas.openxmlformats.org/officeDocument/2006/math" xmlns:aink="http://schemas.microsoft.com/office/drawing/2016/ink" xmlns:am3d="http://schemas.microsoft.com/office/drawing/2017/model3d" xmlns:oel="http://schemas.microsoft.com/office/2019/extlst" xmlns:r="http://schemas.openxmlformats.org/officeDocument/2006/relationships" xmlns:wp14="http://schemas.microsoft.com/office/word/2010/wordprocessingDrawing" xmlns:wp="http://schemas.openxmlformats.org/drawingml/2006/wordprocessingDrawing" xmlns:wpg="http://schemas.microsoft.com/office/word/2010/wordprocessingGroup" xmlns:wpi="http://schemas.microsoft.com/office/word/2010/wordprocessingInk" xmlns:wps="http://schemas.microsoft.com/office/word/2010/wordprocessingShape" xmlns:o="urn:schemas-microsoft-com:office:office" xmlns:v="urn:schemas-microsoft-com:vml" xmlns:w10="urn:schemas-microsoft-com:office:word" xmlns:w="http://schemas.openxmlformats.org/wordprocessingml/2006/main" xmlns:w14="http://schemas.microsoft.com/office/word/2010/wordml" xmlns:w15="http://schemas.microsoft.com/office/word/2012/wordml" xmlns:w16cex="http://schemas.microsoft.com/office/word/2018/wordml/cex" xmlns:w16cid="http://schemas.microsoft.com/office/word/2016/wordml/cid" xmlns:w16="http://schemas.microsoft.com/office/word/2018/wordml" xmlns:w16sdtdh="http://schemas.microsoft.com/office/word/2020/wordml/sdtdatahash" xmlns:w16sdtfl="http://schemas.microsoft.com/office/word/2024/wordml/sdtformatlock" xmlns:w16se="http://schemas.microsoft.com/office/word/2015/wordml/symex" xmlns:w16du="http://schemas.microsoft.com/office/word/2023/wordml/word16du" xmlns:wne="http://schemas.microsoft.com/office/word/2006/wordml" mc:Ignorable="w14 w15 w16se w16cid w16 w16cex w16sdtdh w16sdtfl w16du wp14">
   <w:p>
     <w:pPr>
       <w:pStyle w:val="Header"/>
@@ -5191,7 +4763,7 @@
 </file>
 
 <file path=word/header3.xml><?xml version="1.0" encoding="utf-8"?>
-<w:hdr xmlns:wpc="http://schemas.microsoft.com/office/word/2010/wordprocessingCanvas" xmlns:cx="http://schemas.microsoft.com/office/drawing/2014/chartex" xmlns:cx1="http://schemas.microsoft.com/office/drawing/2015/9/8/chartex" xmlns:cx2="http://schemas.microsoft.com/office/drawing/2015/10/21/chartex" xmlns:cx3="http://schemas.microsoft.com/office/drawing/2016/5/9/chartex" xmlns:cx4="http://schemas.microsoft.com/office/drawing/2016/5/10/chartex" xmlns:cx5="http://schemas.microsoft.com/office/drawing/2016/5/11/chartex" xmlns:cx6="http://schemas.microsoft.com/office/drawing/2016/5/12/chartex" xmlns:cx7="http://schemas.microsoft.com/office/drawing/2016/5/13/chartex" xmlns:cx8="http://schemas.microsoft.com/office/drawing/2016/5/14/chartex" xmlns:mc="http://schemas.openxmlformats.org/markup-compatibility/2006" xmlns:m="http://schemas.openxmlformats.org/officeDocument/2006/math" xmlns:aink="http://schemas.microsoft.com/office/drawing/2016/ink" xmlns:am3d="http://schemas.microsoft.com/office/drawing/2017/model3d" xmlns:oel="http://schemas.microsoft.com/office/2019/extlst" xmlns:r="http://schemas.openxmlformats.org/officeDocument/2006/relationships" xmlns:wp14="http://schemas.microsoft.com/office/word/2010/wordprocessingDrawing" xmlns:wp="http://schemas.openxmlformats.org/drawingml/2006/wordprocessingDrawing" xmlns:wpg="http://schemas.microsoft.com/office/word/2010/wordprocessingGroup" xmlns:wpi="http://schemas.microsoft.com/office/word/2010/wordprocessingInk" xmlns:wps="http://schemas.microsoft.com/office/word/2010/wordprocessingShape" xmlns:o="urn:schemas-microsoft-com:office:office" xmlns:v="urn:schemas-microsoft-com:vml" xmlns:w10="urn:schemas-microsoft-com:office:word" xmlns:w="http://schemas.openxmlformats.org/wordprocessingml/2006/main" xmlns:w14="http://schemas.microsoft.com/office/word/2010/wordml" xmlns:w15="http://schemas.microsoft.com/office/word/2012/wordml" xmlns:w16cei="http://schemas.microsoft.com/office/word/2026/wordml/cei" xmlns:w16cex="http://schemas.microsoft.com/office/word/2018/wordml/cex" xmlns:w16cid="http://schemas.microsoft.com/office/word/2016/wordml/cid" xmlns:w16="http://schemas.microsoft.com/office/word/2018/wordml" xmlns:w16sdtdh="http://schemas.microsoft.com/office/word/2020/wordml/sdtdatahash" xmlns:w16sdtfl="http://schemas.microsoft.com/office/word/2024/wordml/sdtformatlock" xmlns:w16se="http://schemas.microsoft.com/office/word/2015/wordml/symex" xmlns:w16du="http://schemas.microsoft.com/office/word/2023/wordml/word16du" xmlns:wne="http://schemas.microsoft.com/office/word/2006/wordml" mc:Ignorable="w14 w15 w16se w16cid w16 w16cex w16sdtdh w16sdtfl w16du wp14">
+<w:hdr xmlns:wpc="http://schemas.microsoft.com/office/word/2010/wordprocessingCanvas" xmlns:cx="http://schemas.microsoft.com/office/drawing/2014/chartex" xmlns:cx1="http://schemas.microsoft.com/office/drawing/2015/9/8/chartex" xmlns:cx2="http://schemas.microsoft.com/office/drawing/2015/10/21/chartex" xmlns:cx3="http://schemas.microsoft.com/office/drawing/2016/5/9/chartex" xmlns:cx4="http://schemas.microsoft.com/office/drawing/2016/5/10/chartex" xmlns:cx5="http://schemas.microsoft.com/office/drawing/2016/5/11/chartex" xmlns:cx6="http://schemas.microsoft.com/office/drawing/2016/5/12/chartex" xmlns:cx7="http://schemas.microsoft.com/office/drawing/2016/5/13/chartex" xmlns:cx8="http://schemas.microsoft.com/office/drawing/2016/5/14/chartex" xmlns:mc="http://schemas.openxmlformats.org/markup-compatibility/2006" xmlns:m="http://schemas.openxmlformats.org/officeDocument/2006/math" xmlns:aink="http://schemas.microsoft.com/office/drawing/2016/ink" xmlns:am3d="http://schemas.microsoft.com/office/drawing/2017/model3d" xmlns:oel="http://schemas.microsoft.com/office/2019/extlst" xmlns:r="http://schemas.openxmlformats.org/officeDocument/2006/relationships" xmlns:wp14="http://schemas.microsoft.com/office/word/2010/wordprocessingDrawing" xmlns:wp="http://schemas.openxmlformats.org/drawingml/2006/wordprocessingDrawing" xmlns:wpg="http://schemas.microsoft.com/office/word/2010/wordprocessingGroup" xmlns:wpi="http://schemas.microsoft.com/office/word/2010/wordprocessingInk" xmlns:wps="http://schemas.microsoft.com/office/word/2010/wordprocessingShape" xmlns:o="urn:schemas-microsoft-com:office:office" xmlns:v="urn:schemas-microsoft-com:vml" xmlns:w10="urn:schemas-microsoft-com:office:word" xmlns:w="http://schemas.openxmlformats.org/wordprocessingml/2006/main" xmlns:w14="http://schemas.microsoft.com/office/word/2010/wordml" xmlns:w15="http://schemas.microsoft.com/office/word/2012/wordml" xmlns:w16cex="http://schemas.microsoft.com/office/word/2018/wordml/cex" xmlns:w16cid="http://schemas.microsoft.com/office/word/2016/wordml/cid" xmlns:w16="http://schemas.microsoft.com/office/word/2018/wordml" xmlns:w16sdtdh="http://schemas.microsoft.com/office/word/2020/wordml/sdtdatahash" xmlns:w16sdtfl="http://schemas.microsoft.com/office/word/2024/wordml/sdtformatlock" xmlns:w16se="http://schemas.microsoft.com/office/word/2015/wordml/symex" xmlns:w16du="http://schemas.microsoft.com/office/word/2023/wordml/word16du" xmlns:wne="http://schemas.microsoft.com/office/word/2006/wordml" mc:Ignorable="w14 w15 w16se w16cid w16 w16cex w16sdtdh w16sdtfl w16du wp14">
   <w:p>
     <w:pPr>
       <w:pStyle w:val="Header"/>
@@ -5201,7 +4773,7 @@
 </file>
 
 <file path=word/numbering.xml><?xml version="1.0" encoding="utf-8"?>
-<w:numbering xmlns:wpc="http://schemas.microsoft.com/office/word/2010/wordprocessingCanvas" xmlns:cx="http://schemas.microsoft.com/office/drawing/2014/chartex" xmlns:cx1="http://schemas.microsoft.com/office/drawing/2015/9/8/chartex" xmlns:cx2="http://schemas.microsoft.com/office/drawing/2015/10/21/chartex" xmlns:cx3="http://schemas.microsoft.com/office/drawing/2016/5/9/chartex" xmlns:cx4="http://schemas.microsoft.com/office/drawing/2016/5/10/chartex" xmlns:cx5="http://schemas.microsoft.com/office/drawing/2016/5/11/chartex" xmlns:cx6="http://schemas.microsoft.com/office/drawing/2016/5/12/chartex" xmlns:cx7="http://schemas.microsoft.com/office/drawing/2016/5/13/chartex" xmlns:cx8="http://schemas.microsoft.com/office/drawing/2016/5/14/chartex" xmlns:mc="http://schemas.openxmlformats.org/markup-compatibility/2006" xmlns:m="http://schemas.openxmlformats.org/officeDocument/2006/math" xmlns:aink="http://schemas.microsoft.com/office/drawing/2016/ink" xmlns:am3d="http://schemas.microsoft.com/office/drawing/2017/model3d" xmlns:oel="http://schemas.microsoft.com/office/2019/extlst" xmlns:r="http://schemas.openxmlformats.org/officeDocument/2006/relationships" xmlns:wp14="http://schemas.microsoft.com/office/word/2010/wordprocessingDrawing" xmlns:wp="http://schemas.openxmlformats.org/drawingml/2006/wordprocessingDrawing" xmlns:wpg="http://schemas.microsoft.com/office/word/2010/wordprocessingGroup" xmlns:wpi="http://schemas.microsoft.com/office/word/2010/wordprocessingInk" xmlns:wps="http://schemas.microsoft.com/office/word/2010/wordprocessingShape" xmlns:o="urn:schemas-microsoft-com:office:office" xmlns:v="urn:schemas-microsoft-com:vml" xmlns:w10="urn:schemas-microsoft-com:office:word" xmlns:w="http://schemas.openxmlformats.org/wordprocessingml/2006/main" xmlns:w14="http://schemas.microsoft.com/office/word/2010/wordml" xmlns:w15="http://schemas.microsoft.com/office/word/2012/wordml" xmlns:w16cei="http://schemas.microsoft.com/office/word/2026/wordml/cei" xmlns:w16cex="http://schemas.microsoft.com/office/word/2018/wordml/cex" xmlns:w16cid="http://schemas.microsoft.com/office/word/2016/wordml/cid" xmlns:w16="http://schemas.microsoft.com/office/word/2018/wordml" xmlns:w16sdtdh="http://schemas.microsoft.com/office/word/2020/wordml/sdtdatahash" xmlns:w16sdtfl="http://schemas.microsoft.com/office/word/2024/wordml/sdtformatlock" xmlns:w16se="http://schemas.microsoft.com/office/word/2015/wordml/symex" xmlns:w16du="http://schemas.microsoft.com/office/word/2023/wordml/word16du" xmlns:wne="http://schemas.microsoft.com/office/word/2006/wordml" mc:Ignorable="w14 w15 w16se w16cid w16 w16cex w16sdtdh w16sdtfl w16du wp14">
+<w:numbering xmlns:wpc="http://schemas.microsoft.com/office/word/2010/wordprocessingCanvas" xmlns:cx="http://schemas.microsoft.com/office/drawing/2014/chartex" xmlns:cx1="http://schemas.microsoft.com/office/drawing/2015/9/8/chartex" xmlns:cx2="http://schemas.microsoft.com/office/drawing/2015/10/21/chartex" xmlns:cx3="http://schemas.microsoft.com/office/drawing/2016/5/9/chartex" xmlns:cx4="http://schemas.microsoft.com/office/drawing/2016/5/10/chartex" xmlns:cx5="http://schemas.microsoft.com/office/drawing/2016/5/11/chartex" xmlns:cx6="http://schemas.microsoft.com/office/drawing/2016/5/12/chartex" xmlns:cx7="http://schemas.microsoft.com/office/drawing/2016/5/13/chartex" xmlns:cx8="http://schemas.microsoft.com/office/drawing/2016/5/14/chartex" xmlns:mc="http://schemas.openxmlformats.org/markup-compatibility/2006" xmlns:m="http://schemas.openxmlformats.org/officeDocument/2006/math" xmlns:aink="http://schemas.microsoft.com/office/drawing/2016/ink" xmlns:am3d="http://schemas.microsoft.com/office/drawing/2017/model3d" xmlns:oel="http://schemas.microsoft.com/office/2019/extlst" xmlns:r="http://schemas.openxmlformats.org/officeDocument/2006/relationships" xmlns:wp14="http://schemas.microsoft.com/office/word/2010/wordprocessingDrawing" xmlns:wp="http://schemas.openxmlformats.org/drawingml/2006/wordprocessingDrawing" xmlns:wpg="http://schemas.microsoft.com/office/word/2010/wordprocessingGroup" xmlns:wpi="http://schemas.microsoft.com/office/word/2010/wordprocessingInk" xmlns:wps="http://schemas.microsoft.com/office/word/2010/wordprocessingShape" xmlns:o="urn:schemas-microsoft-com:office:office" xmlns:v="urn:schemas-microsoft-com:vml" xmlns:w10="urn:schemas-microsoft-com:office:word" xmlns:w="http://schemas.openxmlformats.org/wordprocessingml/2006/main" xmlns:w14="http://schemas.microsoft.com/office/word/2010/wordml" xmlns:w15="http://schemas.microsoft.com/office/word/2012/wordml" xmlns:w16cex="http://schemas.microsoft.com/office/word/2018/wordml/cex" xmlns:w16cid="http://schemas.microsoft.com/office/word/2016/wordml/cid" xmlns:w16="http://schemas.microsoft.com/office/word/2018/wordml" xmlns:w16sdtdh="http://schemas.microsoft.com/office/word/2020/wordml/sdtdatahash" xmlns:w16sdtfl="http://schemas.microsoft.com/office/word/2024/wordml/sdtformatlock" xmlns:w16se="http://schemas.microsoft.com/office/word/2015/wordml/symex" xmlns:w16du="http://schemas.microsoft.com/office/word/2023/wordml/word16du" xmlns:wne="http://schemas.microsoft.com/office/word/2006/wordml" mc:Ignorable="w14 w15 w16se w16cid w16 w16cex w16sdtdh w16sdtfl w16du wp14">
   <w:abstractNum w:abstractNumId="0" w15:restartNumberingAfterBreak="0">
     <w:nsid w:val="108E54CC"/>
     <w:multiLevelType w:val="hybridMultilevel"/>

</xml_diff>